<commit_message>
Punto 2.3 selección de caracteristicas completo
</commit_message>
<xml_diff>
--- a/SistemaAnalisisMercadoAutomocion.docx
+++ b/SistemaAnalisisMercadoAutomocion.docx
@@ -4778,7 +4778,6 @@
         </w:rPr>
         <w:t xml:space="preserve">El primer paso ha sido la detección de outliers en los precios de los vehículos, donde hemos comprobado que existen valores que se van más allá del valor máximo no atípico, como se puede observar en el siguiente </w:t>
       </w:r>
-      <w:bookmarkStart w:id="0" w:name="_GoBack"/>
       <w:r>
         <w:rPr>
           <w:rFonts w:ascii="Arial" w:hAnsi="Arial" w:cs="Arial"/>
@@ -4787,7 +4786,6 @@
         </w:rPr>
         <w:t>boxplot</w:t>
       </w:r>
-      <w:bookmarkEnd w:id="0"/>
       <w:r>
         <w:rPr>
           <w:rFonts w:ascii="Arial" w:hAnsi="Arial" w:cs="Arial"/>
@@ -4808,7 +4806,9 @@
       <w:r>
         <w:rPr>
           <w:rFonts w:ascii="Arial" w:hAnsi="Arial" w:cs="Arial"/>
-          <w:sz w:val="24"/>
+          <w:noProof/>
+          <w:sz w:val="24"/>
+          <w:lang w:eastAsia="es-ES"/>
         </w:rPr>
         <w:lastRenderedPageBreak/>
         <w:drawing>
@@ -5057,6 +5057,922 @@
     </w:p>
     <w:p>
       <w:pPr>
+        <w:pStyle w:val="Ttulo2"/>
+        <w:numPr>
+          <w:ilvl w:val="1"/>
+          <w:numId w:val="1"/>
+        </w:numPr>
+        <w:spacing w:line="276" w:lineRule="auto"/>
+        <w:jc w:val="both"/>
+        <w:rPr>
+          <w:rFonts w:ascii="Arial" w:hAnsi="Arial" w:cs="Arial"/>
+          <w:b/>
+          <w:color w:val="auto"/>
+          <w:sz w:val="28"/>
+        </w:rPr>
+      </w:pPr>
+      <w:r>
+        <w:rPr>
+          <w:rFonts w:ascii="Arial" w:hAnsi="Arial" w:cs="Arial"/>
+          <w:b/>
+          <w:color w:val="auto"/>
+          <w:sz w:val="28"/>
+        </w:rPr>
+        <w:lastRenderedPageBreak/>
+        <w:t>Ingeniería de características</w:t>
+      </w:r>
+    </w:p>
+    <w:p>
+      <w:pPr>
+        <w:pStyle w:val="Ttulo3"/>
+        <w:numPr>
+          <w:ilvl w:val="0"/>
+          <w:numId w:val="3"/>
+        </w:numPr>
+        <w:spacing w:line="276" w:lineRule="auto"/>
+        <w:jc w:val="both"/>
+        <w:rPr>
+          <w:rFonts w:ascii="Arial" w:hAnsi="Arial" w:cs="Arial"/>
+          <w:b/>
+          <w:color w:val="auto"/>
+        </w:rPr>
+      </w:pPr>
+      <w:r>
+        <w:rPr>
+          <w:rFonts w:ascii="Arial" w:hAnsi="Arial" w:cs="Arial"/>
+          <w:b/>
+          <w:color w:val="auto"/>
+        </w:rPr>
+        <w:t>Creación de características</w:t>
+      </w:r>
+    </w:p>
+    <w:p>
+      <w:pPr>
+        <w:spacing w:line="276" w:lineRule="auto"/>
+        <w:jc w:val="both"/>
+        <w:rPr>
+          <w:rFonts w:ascii="Arial" w:hAnsi="Arial" w:cs="Arial"/>
+          <w:sz w:val="24"/>
+        </w:rPr>
+      </w:pPr>
+      <w:r>
+        <w:rPr>
+          <w:rFonts w:ascii="Arial" w:hAnsi="Arial" w:cs="Arial"/>
+          <w:sz w:val="24"/>
+        </w:rPr>
+        <w:t>Hemos creado variables a partir de las existen</w:t>
+      </w:r>
+      <w:r>
+        <w:rPr>
+          <w:rFonts w:ascii="Arial" w:hAnsi="Arial" w:cs="Arial"/>
+          <w:sz w:val="24"/>
+        </w:rPr>
+        <w:t>tes para poder extraer nuevo conocimiento de los datos. Estas variables han sido:</w:t>
+      </w:r>
+    </w:p>
+    <w:p>
+      <w:pPr>
+        <w:pStyle w:val="Prrafodelista"/>
+        <w:numPr>
+          <w:ilvl w:val="0"/>
+          <w:numId w:val="2"/>
+        </w:numPr>
+        <w:spacing w:line="276" w:lineRule="auto"/>
+        <w:jc w:val="both"/>
+        <w:rPr>
+          <w:rFonts w:ascii="Arial" w:hAnsi="Arial" w:cs="Arial"/>
+          <w:sz w:val="24"/>
+        </w:rPr>
+      </w:pPr>
+      <w:r>
+        <w:rPr>
+          <w:rFonts w:ascii="Arial" w:hAnsi="Arial" w:cs="Arial"/>
+          <w:sz w:val="24"/>
+          <w:u w:val="single"/>
+        </w:rPr>
+        <w:t>Antigüedad</w:t>
+      </w:r>
+      <w:r>
+        <w:rPr>
+          <w:rFonts w:ascii="Arial" w:hAnsi="Arial" w:cs="Arial"/>
+          <w:sz w:val="24"/>
+        </w:rPr>
+        <w:t>: Representa la edad del vehículo, teniendo en cuenta que el año actual es 2026.</w:t>
+      </w:r>
+    </w:p>
+    <w:p>
+      <w:pPr>
+        <w:pStyle w:val="Prrafodelista"/>
+        <w:numPr>
+          <w:ilvl w:val="0"/>
+          <w:numId w:val="2"/>
+        </w:numPr>
+        <w:spacing w:line="276" w:lineRule="auto"/>
+        <w:jc w:val="both"/>
+        <w:rPr>
+          <w:rFonts w:ascii="Arial" w:hAnsi="Arial" w:cs="Arial"/>
+          <w:sz w:val="24"/>
+        </w:rPr>
+      </w:pPr>
+      <w:r>
+        <w:rPr>
+          <w:rFonts w:ascii="Arial" w:hAnsi="Arial" w:cs="Arial"/>
+          <w:sz w:val="24"/>
+          <w:u w:val="single"/>
+        </w:rPr>
+        <w:t>Eficiencia</w:t>
+      </w:r>
+      <w:r>
+        <w:rPr>
+          <w:rFonts w:ascii="Arial" w:hAnsi="Arial" w:cs="Arial"/>
+          <w:sz w:val="24"/>
+        </w:rPr>
+        <w:t xml:space="preserve"> </w:t>
+      </w:r>
+      <w:r>
+        <w:rPr>
+          <w:rFonts w:ascii="Arial" w:hAnsi="Arial" w:cs="Arial"/>
+          <w:sz w:val="24"/>
+          <w:u w:val="single"/>
+        </w:rPr>
+        <w:t>global</w:t>
+      </w:r>
+      <w:r>
+        <w:rPr>
+          <w:rFonts w:ascii="Arial" w:hAnsi="Arial" w:cs="Arial"/>
+          <w:sz w:val="24"/>
+        </w:rPr>
+        <w:t>: Es la media del consumo urbano y el extraurbano, proporcionando una métrica unificada del gasto de combustible.</w:t>
+      </w:r>
+    </w:p>
+    <w:p>
+      <w:pPr>
+        <w:pStyle w:val="Prrafodelista"/>
+        <w:numPr>
+          <w:ilvl w:val="0"/>
+          <w:numId w:val="2"/>
+        </w:numPr>
+        <w:spacing w:line="276" w:lineRule="auto"/>
+        <w:jc w:val="both"/>
+        <w:rPr>
+          <w:rFonts w:ascii="Arial" w:hAnsi="Arial" w:cs="Arial"/>
+          <w:sz w:val="24"/>
+        </w:rPr>
+      </w:pPr>
+      <w:r>
+        <w:rPr>
+          <w:rFonts w:ascii="Arial" w:hAnsi="Arial" w:cs="Arial"/>
+          <w:sz w:val="24"/>
+          <w:u w:val="single"/>
+        </w:rPr>
+        <w:t>Ratio</w:t>
+      </w:r>
+      <w:r>
+        <w:rPr>
+          <w:rFonts w:ascii="Arial" w:hAnsi="Arial" w:cs="Arial"/>
+          <w:sz w:val="24"/>
+        </w:rPr>
+        <w:t xml:space="preserve"> </w:t>
+      </w:r>
+      <w:r>
+        <w:rPr>
+          <w:rFonts w:ascii="Arial" w:hAnsi="Arial" w:cs="Arial"/>
+          <w:sz w:val="24"/>
+          <w:u w:val="single"/>
+        </w:rPr>
+        <w:t>precio</w:t>
+      </w:r>
+      <w:r>
+        <w:rPr>
+          <w:rFonts w:ascii="Arial" w:hAnsi="Arial" w:cs="Arial"/>
+          <w:sz w:val="24"/>
+        </w:rPr>
+        <w:t xml:space="preserve"> </w:t>
+      </w:r>
+      <w:r>
+        <w:rPr>
+          <w:rFonts w:ascii="Arial" w:hAnsi="Arial" w:cs="Arial"/>
+          <w:sz w:val="24"/>
+          <w:u w:val="single"/>
+        </w:rPr>
+        <w:t>potencia</w:t>
+      </w:r>
+      <w:r>
+        <w:rPr>
+          <w:rFonts w:ascii="Arial" w:hAnsi="Arial" w:cs="Arial"/>
+          <w:sz w:val="24"/>
+        </w:rPr>
+        <w:t>: Es el resultado de la división entre el precio base del coche y la potencia. Indica cuánto cuesta cada caballo de potencia, siendo útil para identificar coches sobrevalorados o “gangas”.</w:t>
+      </w:r>
+    </w:p>
+    <w:p>
+      <w:pPr>
+        <w:pStyle w:val="Prrafodelista"/>
+        <w:numPr>
+          <w:ilvl w:val="0"/>
+          <w:numId w:val="2"/>
+        </w:numPr>
+        <w:spacing w:line="276" w:lineRule="auto"/>
+        <w:jc w:val="both"/>
+        <w:rPr>
+          <w:rFonts w:ascii="Arial" w:hAnsi="Arial" w:cs="Arial"/>
+          <w:sz w:val="24"/>
+        </w:rPr>
+      </w:pPr>
+      <w:r>
+        <w:rPr>
+          <w:rFonts w:ascii="Arial" w:hAnsi="Arial" w:cs="Arial"/>
+          <w:sz w:val="24"/>
+          <w:u w:val="single"/>
+        </w:rPr>
+        <w:t>Categoría</w:t>
+      </w:r>
+      <w:r>
+        <w:rPr>
+          <w:rFonts w:ascii="Arial" w:hAnsi="Arial" w:cs="Arial"/>
+          <w:sz w:val="24"/>
+        </w:rPr>
+        <w:t xml:space="preserve"> </w:t>
+      </w:r>
+      <w:r>
+        <w:rPr>
+          <w:rFonts w:ascii="Arial" w:hAnsi="Arial" w:cs="Arial"/>
+          <w:sz w:val="24"/>
+          <w:u w:val="single"/>
+        </w:rPr>
+        <w:t>de</w:t>
+      </w:r>
+      <w:r>
+        <w:rPr>
+          <w:rFonts w:ascii="Arial" w:hAnsi="Arial" w:cs="Arial"/>
+          <w:sz w:val="24"/>
+        </w:rPr>
+        <w:t xml:space="preserve"> </w:t>
+      </w:r>
+      <w:r>
+        <w:rPr>
+          <w:rFonts w:ascii="Arial" w:hAnsi="Arial" w:cs="Arial"/>
+          <w:sz w:val="24"/>
+          <w:u w:val="single"/>
+        </w:rPr>
+        <w:t>emisiones</w:t>
+      </w:r>
+      <w:r>
+        <w:rPr>
+          <w:rFonts w:ascii="Arial" w:hAnsi="Arial" w:cs="Arial"/>
+          <w:sz w:val="24"/>
+        </w:rPr>
+        <w:t xml:space="preserve">: Variable categórica basada en las emisiones del CO2, teniendo en cuenta que: </w:t>
+      </w:r>
+      <w:r>
+        <w:rPr>
+          <w:rFonts w:ascii="Arial" w:hAnsi="Arial" w:cs="Arial"/>
+          <w:i/>
+          <w:sz w:val="24"/>
+        </w:rPr>
+        <w:t>Eco</w:t>
+      </w:r>
+      <w:r>
+        <w:rPr>
+          <w:rFonts w:ascii="Arial" w:hAnsi="Arial" w:cs="Arial"/>
+          <w:sz w:val="24"/>
+        </w:rPr>
+        <w:t xml:space="preserve"> si emisiones menores a 110 g/km, </w:t>
+      </w:r>
+      <w:r>
+        <w:rPr>
+          <w:rFonts w:ascii="Arial" w:hAnsi="Arial" w:cs="Arial"/>
+          <w:i/>
+          <w:sz w:val="24"/>
+        </w:rPr>
+        <w:t>media</w:t>
+      </w:r>
+      <w:r>
+        <w:rPr>
+          <w:rFonts w:ascii="Arial" w:hAnsi="Arial" w:cs="Arial"/>
+          <w:sz w:val="24"/>
+        </w:rPr>
+        <w:t xml:space="preserve"> si emisiones entre 110 – 150 g/km y </w:t>
+      </w:r>
+      <w:r>
+        <w:rPr>
+          <w:rFonts w:ascii="Arial" w:hAnsi="Arial" w:cs="Arial"/>
+          <w:i/>
+          <w:sz w:val="24"/>
+        </w:rPr>
+        <w:t>contaminante</w:t>
+      </w:r>
+      <w:r>
+        <w:rPr>
+          <w:rFonts w:ascii="Arial" w:hAnsi="Arial" w:cs="Arial"/>
+          <w:sz w:val="24"/>
+        </w:rPr>
+        <w:t xml:space="preserve"> si emisiones mayores a 150 g/km.</w:t>
+      </w:r>
+    </w:p>
+    <w:p>
+      <w:pPr>
+        <w:pStyle w:val="Prrafodelista"/>
+        <w:numPr>
+          <w:ilvl w:val="0"/>
+          <w:numId w:val="2"/>
+        </w:numPr>
+        <w:spacing w:line="276" w:lineRule="auto"/>
+        <w:jc w:val="both"/>
+        <w:rPr>
+          <w:rFonts w:ascii="Arial" w:hAnsi="Arial" w:cs="Arial"/>
+          <w:sz w:val="24"/>
+        </w:rPr>
+      </w:pPr>
+      <w:r>
+        <w:rPr>
+          <w:rFonts w:ascii="Arial" w:hAnsi="Arial" w:cs="Arial"/>
+          <w:sz w:val="24"/>
+          <w:u w:val="single"/>
+        </w:rPr>
+        <w:t>Depreciación</w:t>
+      </w:r>
+      <w:r>
+        <w:rPr>
+          <w:rFonts w:ascii="Arial" w:hAnsi="Arial" w:cs="Arial"/>
+          <w:sz w:val="24"/>
+        </w:rPr>
+        <w:t xml:space="preserve"> </w:t>
+      </w:r>
+      <w:r>
+        <w:rPr>
+          <w:rFonts w:ascii="Arial" w:hAnsi="Arial" w:cs="Arial"/>
+          <w:sz w:val="24"/>
+          <w:u w:val="single"/>
+        </w:rPr>
+        <w:t>anual</w:t>
+      </w:r>
+      <w:r>
+        <w:rPr>
+          <w:rFonts w:ascii="Arial" w:hAnsi="Arial" w:cs="Arial"/>
+          <w:sz w:val="24"/>
+        </w:rPr>
+        <w:t>: Medida para determinar la pérdida de valor del coche por año usado.</w:t>
+      </w:r>
+    </w:p>
+    <w:p>
+      <w:pPr>
+        <w:pStyle w:val="Prrafodelista"/>
+        <w:numPr>
+          <w:ilvl w:val="0"/>
+          <w:numId w:val="2"/>
+        </w:numPr>
+        <w:spacing w:line="276" w:lineRule="auto"/>
+        <w:jc w:val="both"/>
+        <w:rPr>
+          <w:rFonts w:ascii="Arial" w:hAnsi="Arial" w:cs="Arial"/>
+          <w:sz w:val="24"/>
+        </w:rPr>
+      </w:pPr>
+      <w:r>
+        <w:rPr>
+          <w:rFonts w:ascii="Arial" w:hAnsi="Arial" w:cs="Arial"/>
+          <w:sz w:val="24"/>
+          <w:u w:val="single"/>
+        </w:rPr>
+        <w:t>Índice</w:t>
+      </w:r>
+      <w:r>
+        <w:rPr>
+          <w:rFonts w:ascii="Arial" w:hAnsi="Arial" w:cs="Arial"/>
+          <w:sz w:val="24"/>
+        </w:rPr>
+        <w:t xml:space="preserve"> </w:t>
+      </w:r>
+      <w:r>
+        <w:rPr>
+          <w:rFonts w:ascii="Arial" w:hAnsi="Arial" w:cs="Arial"/>
+          <w:sz w:val="24"/>
+          <w:u w:val="single"/>
+        </w:rPr>
+        <w:t>de</w:t>
+      </w:r>
+      <w:r>
+        <w:rPr>
+          <w:rFonts w:ascii="Arial" w:hAnsi="Arial" w:cs="Arial"/>
+          <w:sz w:val="24"/>
+        </w:rPr>
+        <w:t xml:space="preserve"> </w:t>
+      </w:r>
+      <w:r>
+        <w:rPr>
+          <w:rFonts w:ascii="Arial" w:hAnsi="Arial" w:cs="Arial"/>
+          <w:sz w:val="24"/>
+          <w:u w:val="single"/>
+        </w:rPr>
+        <w:t>fiabilidad</w:t>
+      </w:r>
+      <w:r>
+        <w:rPr>
+          <w:rFonts w:ascii="Arial" w:hAnsi="Arial" w:cs="Arial"/>
+          <w:sz w:val="24"/>
+        </w:rPr>
+        <w:t>: Variable que combina datos objetivos (incidencias) y datos subjetivos (opiniones de la fiabilidad). Hemos creado un promedio entre la fiabilidad y las incidencias que si tiene un valor alto indica que el coche es robusto. Se trata de un valor entre 0 y 1, cuanto más cerca de 1 este el índice de fiabilidad más robusto será el coche.</w:t>
+      </w:r>
+    </w:p>
+    <w:p>
+      <w:pPr>
+        <w:spacing w:line="276" w:lineRule="auto"/>
+        <w:ind w:left="360"/>
+        <w:jc w:val="both"/>
+        <w:rPr>
+          <w:rFonts w:ascii="Arial" w:hAnsi="Arial" w:cs="Arial"/>
+          <w:sz w:val="24"/>
+        </w:rPr>
+      </w:pPr>
+      <w:r>
+        <w:rPr>
+          <w:rFonts w:ascii="Arial" w:hAnsi="Arial" w:cs="Arial"/>
+          <w:sz w:val="24"/>
+        </w:rPr>
+        <w:t>Una vez creadas las nuevas variables, para poder hacer un correcto análisis de correlación, hemos realizado un tratamiento a ciertas variables categóricas y temporales. Los tratamientos han sido:</w:t>
+      </w:r>
+    </w:p>
+    <w:p>
+      <w:pPr>
+        <w:pStyle w:val="Prrafodelista"/>
+        <w:numPr>
+          <w:ilvl w:val="0"/>
+          <w:numId w:val="2"/>
+        </w:numPr>
+        <w:spacing w:line="276" w:lineRule="auto"/>
+        <w:jc w:val="both"/>
+        <w:rPr>
+          <w:rFonts w:ascii="Arial" w:hAnsi="Arial" w:cs="Arial"/>
+          <w:sz w:val="24"/>
+        </w:rPr>
+      </w:pPr>
+      <w:r>
+        <w:rPr>
+          <w:rFonts w:ascii="Arial" w:hAnsi="Arial" w:cs="Arial"/>
+          <w:sz w:val="24"/>
+          <w:u w:val="single"/>
+        </w:rPr>
+        <w:t>Tratamiento geográfico (región del vendedor)</w:t>
+      </w:r>
+      <w:r>
+        <w:rPr>
+          <w:rFonts w:ascii="Arial" w:hAnsi="Arial" w:cs="Arial"/>
+          <w:sz w:val="24"/>
+        </w:rPr>
+        <w:t xml:space="preserve">: Analizada la variable detectamos una baja cardinalidad (tan solo hay 5 comunidades), de modo que hemos podido aplicar la creación de variables dummy por medio de </w:t>
+      </w:r>
+      <w:r>
+        <w:rPr>
+          <w:rFonts w:ascii="Arial" w:hAnsi="Arial" w:cs="Arial"/>
+          <w:i/>
+          <w:sz w:val="24"/>
+        </w:rPr>
+        <w:t>One</w:t>
+      </w:r>
+      <w:r>
+        <w:rPr>
+          <w:rFonts w:ascii="Arial" w:hAnsi="Arial" w:cs="Arial"/>
+          <w:i/>
+          <w:sz w:val="24"/>
+        </w:rPr>
+        <w:t>-Hot Encoding</w:t>
+      </w:r>
+      <w:r>
+        <w:rPr>
+          <w:rFonts w:ascii="Arial" w:hAnsi="Arial" w:cs="Arial"/>
+          <w:i/>
+          <w:sz w:val="24"/>
+        </w:rPr>
+        <w:t xml:space="preserve"> </w:t>
+      </w:r>
+      <w:r>
+        <w:rPr>
+          <w:rFonts w:ascii="Arial" w:hAnsi="Arial" w:cs="Arial"/>
+          <w:sz w:val="24"/>
+        </w:rPr>
+        <w:t xml:space="preserve">lo que permitirá visualizar el mapa de calor del impacto de cada región sobre el precio. </w:t>
+      </w:r>
+      <w:r>
+        <w:rPr>
+          <w:rFonts w:ascii="Arial" w:hAnsi="Arial" w:cs="Arial"/>
+          <w:sz w:val="24"/>
+        </w:rPr>
+        <w:t>Para la visualización de la matriz de correlación se han mantenido las 5 variables dummy con el fin de observar todas las relaciones. No obstante, en la fase de modelado (Fase 4) se eliminará una de ellas para evitar la colinealidad perfecta</w:t>
+      </w:r>
+      <w:r>
+        <w:rPr>
+          <w:rFonts w:ascii="Arial" w:hAnsi="Arial" w:cs="Arial"/>
+          <w:sz w:val="24"/>
+        </w:rPr>
+        <w:t>.</w:t>
+      </w:r>
+    </w:p>
+    <w:p>
+      <w:pPr>
+        <w:pStyle w:val="Prrafodelista"/>
+        <w:numPr>
+          <w:ilvl w:val="0"/>
+          <w:numId w:val="2"/>
+        </w:numPr>
+        <w:spacing w:line="276" w:lineRule="auto"/>
+        <w:jc w:val="both"/>
+        <w:rPr>
+          <w:rFonts w:ascii="Arial" w:hAnsi="Arial" w:cs="Arial"/>
+          <w:sz w:val="24"/>
+        </w:rPr>
+      </w:pPr>
+      <w:r>
+        <w:rPr>
+          <w:rFonts w:ascii="Arial" w:hAnsi="Arial" w:cs="Arial"/>
+          <w:sz w:val="24"/>
+          <w:u w:val="single"/>
+        </w:rPr>
+        <w:t>Descomposición temporal</w:t>
+      </w:r>
+      <w:r>
+        <w:rPr>
+          <w:rFonts w:ascii="Arial" w:hAnsi="Arial" w:cs="Arial"/>
+          <w:sz w:val="24"/>
+        </w:rPr>
+        <w:t>:</w:t>
+      </w:r>
+      <w:r>
+        <w:rPr>
+          <w:rFonts w:ascii="Arial" w:hAnsi="Arial" w:cs="Arial"/>
+          <w:sz w:val="24"/>
+        </w:rPr>
+        <w:t xml:space="preserve"> Hemos desglosado la fecha de venta en mes y año, lo que puede permitir detectar patrones estacionales y tendencias anuales.</w:t>
+      </w:r>
+    </w:p>
+    <w:p>
+      <w:pPr>
+        <w:pStyle w:val="Prrafodelista"/>
+        <w:numPr>
+          <w:ilvl w:val="0"/>
+          <w:numId w:val="2"/>
+        </w:numPr>
+        <w:spacing w:line="276" w:lineRule="auto"/>
+        <w:jc w:val="both"/>
+        <w:rPr>
+          <w:rFonts w:ascii="Arial" w:hAnsi="Arial" w:cs="Arial"/>
+          <w:sz w:val="24"/>
+        </w:rPr>
+      </w:pPr>
+      <w:r>
+        <w:rPr>
+          <w:rFonts w:ascii="Arial" w:hAnsi="Arial" w:cs="Arial"/>
+          <w:sz w:val="24"/>
+          <w:u w:val="single"/>
+        </w:rPr>
+        <w:t>Tipo de combustible</w:t>
+      </w:r>
+      <w:r>
+        <w:rPr>
+          <w:rFonts w:ascii="Arial" w:hAnsi="Arial" w:cs="Arial"/>
+          <w:sz w:val="24"/>
+        </w:rPr>
+        <w:t xml:space="preserve">: Al tener 4 categorías aplicamos el </w:t>
+      </w:r>
+      <w:r>
+        <w:rPr>
+          <w:rFonts w:ascii="Arial" w:hAnsi="Arial" w:cs="Arial"/>
+          <w:i/>
+          <w:sz w:val="24"/>
+        </w:rPr>
+        <w:t>One-Hot Encoding</w:t>
+      </w:r>
+      <w:r>
+        <w:rPr>
+          <w:rFonts w:ascii="Arial" w:hAnsi="Arial" w:cs="Arial"/>
+          <w:sz w:val="24"/>
+        </w:rPr>
+        <w:t xml:space="preserve"> porque si le damos valores numéricos como (1</w:t>
+      </w:r>
+      <w:r>
+        <w:rPr>
+          <w:rFonts w:ascii="Arial" w:hAnsi="Arial" w:cs="Arial"/>
+          <w:sz w:val="24"/>
+        </w:rPr>
+        <w:t>, 2, 3, 4</w:t>
+      </w:r>
+      <w:r>
+        <w:rPr>
+          <w:rFonts w:ascii="Arial" w:hAnsi="Arial" w:cs="Arial"/>
+          <w:sz w:val="24"/>
+        </w:rPr>
+        <w:t xml:space="preserve">), los modelos pueden llegar a pensar que el 4 es el doble que el 2 y eso no es real, sino que queremos ver si el tipo de combustible dispara el precio. Del mismo modo que en las regiones vamos a mantener las 4 variables dummies </w:t>
+      </w:r>
+      <w:r>
+        <w:rPr>
+          <w:rFonts w:ascii="Arial" w:hAnsi="Arial" w:cs="Arial"/>
+          <w:sz w:val="24"/>
+        </w:rPr>
+        <w:lastRenderedPageBreak/>
+        <w:t>creadas para ver todas las relaciones. Pero en la fase de modelado tendremos que quitar una de ellas para evitar la colinealidad perfecta.</w:t>
+      </w:r>
+    </w:p>
+    <w:p>
+      <w:pPr>
+        <w:pStyle w:val="Prrafodelista"/>
+        <w:numPr>
+          <w:ilvl w:val="0"/>
+          <w:numId w:val="2"/>
+        </w:numPr>
+        <w:spacing w:line="276" w:lineRule="auto"/>
+        <w:jc w:val="both"/>
+        <w:rPr>
+          <w:rFonts w:ascii="Arial" w:hAnsi="Arial" w:cs="Arial"/>
+          <w:sz w:val="24"/>
+        </w:rPr>
+      </w:pPr>
+      <w:r>
+        <w:rPr>
+          <w:rFonts w:ascii="Arial" w:hAnsi="Arial" w:cs="Arial"/>
+          <w:sz w:val="24"/>
+          <w:u w:val="single"/>
+        </w:rPr>
+        <w:t>Codificación de variables categóricas</w:t>
+      </w:r>
+      <w:r>
+        <w:rPr>
+          <w:rFonts w:ascii="Arial" w:hAnsi="Arial" w:cs="Arial"/>
+          <w:sz w:val="24"/>
+        </w:rPr>
+        <w:t>:</w:t>
+      </w:r>
+      <w:r>
+        <w:rPr>
+          <w:rFonts w:ascii="Arial" w:hAnsi="Arial" w:cs="Arial"/>
+          <w:sz w:val="24"/>
+        </w:rPr>
+        <w:t xml:space="preserve"> Codificam</w:t>
+      </w:r>
+      <w:r>
+        <w:rPr>
+          <w:rFonts w:ascii="Arial" w:hAnsi="Arial" w:cs="Arial"/>
+          <w:sz w:val="24"/>
+        </w:rPr>
+        <w:t xml:space="preserve">os variables como el segmento, </w:t>
+      </w:r>
+      <w:r>
+        <w:rPr>
+          <w:rFonts w:ascii="Arial" w:hAnsi="Arial" w:cs="Arial"/>
+          <w:sz w:val="24"/>
+        </w:rPr>
+        <w:t>la categoría de emisiones</w:t>
+      </w:r>
+      <w:r>
+        <w:rPr>
+          <w:rFonts w:ascii="Arial" w:hAnsi="Arial" w:cs="Arial"/>
+          <w:sz w:val="24"/>
+        </w:rPr>
+        <w:t xml:space="preserve"> y la transmisión</w:t>
+      </w:r>
+      <w:r>
+        <w:rPr>
+          <w:rFonts w:ascii="Arial" w:hAnsi="Arial" w:cs="Arial"/>
+          <w:sz w:val="24"/>
+        </w:rPr>
+        <w:t xml:space="preserve"> a escalas numéricas para poder medir la correlación lineal.</w:t>
+      </w:r>
+    </w:p>
+    <w:p>
+      <w:pPr>
+        <w:pStyle w:val="Ttulo3"/>
+        <w:numPr>
+          <w:ilvl w:val="0"/>
+          <w:numId w:val="3"/>
+        </w:numPr>
+        <w:spacing w:line="276" w:lineRule="auto"/>
+        <w:jc w:val="both"/>
+        <w:rPr>
+          <w:rFonts w:ascii="Arial" w:hAnsi="Arial" w:cs="Arial"/>
+          <w:b/>
+          <w:color w:val="auto"/>
+        </w:rPr>
+      </w:pPr>
+      <w:r>
+        <w:rPr>
+          <w:rFonts w:ascii="Arial" w:hAnsi="Arial" w:cs="Arial"/>
+          <w:b/>
+          <w:color w:val="auto"/>
+        </w:rPr>
+        <w:t>Análisis de correlación y eliminación de características</w:t>
+      </w:r>
+    </w:p>
+    <w:p>
+      <w:r>
+        <w:drawing>
+          <wp:inline distT="0" distB="0" distL="0" distR="0" wp14:anchorId="0C449E4C" wp14:editId="560EA78A">
+            <wp:extent cx="5400040" cy="4577080"/>
+            <wp:effectExtent l="0" t="0" r="0" b="0"/>
+            <wp:docPr id="4" name="Imagen 4"/>
+            <wp:cNvGraphicFramePr>
+              <a:graphicFrameLocks xmlns:a="http://schemas.openxmlformats.org/drawingml/2006/main" noChangeAspect="1"/>
+            </wp:cNvGraphicFramePr>
+            <a:graphic xmlns:a="http://schemas.openxmlformats.org/drawingml/2006/main">
+              <a:graphicData uri="http://schemas.openxmlformats.org/drawingml/2006/picture">
+                <pic:pic xmlns:pic="http://schemas.openxmlformats.org/drawingml/2006/picture">
+                  <pic:nvPicPr>
+                    <pic:cNvPr id="1" name=""/>
+                    <pic:cNvPicPr/>
+                  </pic:nvPicPr>
+                  <pic:blipFill>
+                    <a:blip r:embed="rId11"/>
+                    <a:stretch>
+                      <a:fillRect/>
+                    </a:stretch>
+                  </pic:blipFill>
+                  <pic:spPr>
+                    <a:xfrm>
+                      <a:off x="0" y="0"/>
+                      <a:ext cx="5400040" cy="4577080"/>
+                    </a:xfrm>
+                    <a:prstGeom prst="rect">
+                      <a:avLst/>
+                    </a:prstGeom>
+                  </pic:spPr>
+                </pic:pic>
+              </a:graphicData>
+            </a:graphic>
+          </wp:inline>
+        </w:drawing>
+      </w:r>
+    </w:p>
+    <w:p>
+      <w:pPr>
+        <w:spacing w:line="276" w:lineRule="auto"/>
+        <w:jc w:val="both"/>
+        <w:rPr>
+          <w:rFonts w:ascii="Arial" w:hAnsi="Arial" w:cs="Arial"/>
+          <w:sz w:val="24"/>
+        </w:rPr>
+      </w:pPr>
+      <w:r>
+        <w:rPr>
+          <w:rFonts w:ascii="Arial" w:hAnsi="Arial" w:cs="Arial"/>
+          <w:sz w:val="24"/>
+        </w:rPr>
+        <w:t>Basándonos en la matriz de correlación resultante, para reducir la dimensionalidad y evitar la redundancia vamos a eliminar las siguientes características:</w:t>
+      </w:r>
+    </w:p>
+    <w:p>
+      <w:pPr>
+        <w:pStyle w:val="Prrafodelista"/>
+        <w:numPr>
+          <w:ilvl w:val="0"/>
+          <w:numId w:val="2"/>
+        </w:numPr>
+        <w:spacing w:line="276" w:lineRule="auto"/>
+        <w:jc w:val="both"/>
+        <w:rPr>
+          <w:rFonts w:ascii="Arial" w:hAnsi="Arial" w:cs="Arial"/>
+          <w:sz w:val="24"/>
+        </w:rPr>
+      </w:pPr>
+      <w:r>
+        <w:rPr>
+          <w:rFonts w:ascii="Arial" w:hAnsi="Arial" w:cs="Arial"/>
+          <w:sz w:val="24"/>
+          <w:u w:val="single"/>
+        </w:rPr>
+        <w:t>Consumo urbano y consumo extraurbano</w:t>
+      </w:r>
+      <w:r>
+        <w:rPr>
+          <w:rFonts w:ascii="Arial" w:hAnsi="Arial" w:cs="Arial"/>
+          <w:sz w:val="24"/>
+        </w:rPr>
+        <w:t>: Tienen un coeficiente de Pearson muy alto con la eficiencia global, puesto que estos datos ya están capturados en la nueva variable.</w:t>
+      </w:r>
+      <w:r>
+        <w:rPr>
+          <w:rFonts w:ascii="Arial" w:hAnsi="Arial" w:cs="Arial"/>
+          <w:sz w:val="24"/>
+        </w:rPr>
+        <w:t xml:space="preserve"> De modo que mantener estas dos características haría al modelo equivocarse al contar la misma información 3 veces.</w:t>
+      </w:r>
+    </w:p>
+    <w:p>
+      <w:pPr>
+        <w:pStyle w:val="Prrafodelista"/>
+        <w:numPr>
+          <w:ilvl w:val="0"/>
+          <w:numId w:val="2"/>
+        </w:numPr>
+        <w:spacing w:line="276" w:lineRule="auto"/>
+        <w:jc w:val="both"/>
+        <w:rPr>
+          <w:rFonts w:ascii="Arial" w:hAnsi="Arial" w:cs="Arial"/>
+          <w:sz w:val="24"/>
+        </w:rPr>
+      </w:pPr>
+      <w:r>
+        <w:rPr>
+          <w:rFonts w:ascii="Arial" w:hAnsi="Arial" w:cs="Arial"/>
+          <w:sz w:val="24"/>
+          <w:u w:val="single"/>
+        </w:rPr>
+        <w:t>Año de fabricación</w:t>
+      </w:r>
+      <w:r>
+        <w:rPr>
+          <w:rFonts w:ascii="Arial" w:hAnsi="Arial" w:cs="Arial"/>
+          <w:sz w:val="24"/>
+        </w:rPr>
+        <w:t>: Tiene una correlación inversa perfecta con la antigüedad. Por lo que nos quedamos con esta última ya que es una magnitud más directa y lógica para un modelo predictivo.</w:t>
+      </w:r>
+    </w:p>
+    <w:p>
+      <w:pPr>
+        <w:pStyle w:val="Prrafodelista"/>
+        <w:numPr>
+          <w:ilvl w:val="0"/>
+          <w:numId w:val="2"/>
+        </w:numPr>
+        <w:spacing w:line="276" w:lineRule="auto"/>
+        <w:jc w:val="both"/>
+        <w:rPr>
+          <w:rFonts w:ascii="Arial" w:hAnsi="Arial" w:cs="Arial"/>
+          <w:sz w:val="24"/>
+        </w:rPr>
+      </w:pPr>
+      <w:r>
+        <w:rPr>
+          <w:rFonts w:ascii="Arial" w:hAnsi="Arial" w:cs="Arial"/>
+          <w:sz w:val="24"/>
+          <w:u w:val="single"/>
+        </w:rPr>
+        <w:lastRenderedPageBreak/>
+        <w:t>Fecha de venta</w:t>
+      </w:r>
+      <w:r>
+        <w:rPr>
+          <w:rFonts w:ascii="Arial" w:hAnsi="Arial" w:cs="Arial"/>
+          <w:sz w:val="24"/>
+        </w:rPr>
+        <w:t>: Tiene un formato que no se puede procesar y al haber extraído ya el valor informativo del mes y año de venta la fecha original se vuelve innecesaria.</w:t>
+      </w:r>
+    </w:p>
+    <w:p>
+      <w:pPr>
+        <w:pStyle w:val="Prrafodelista"/>
+        <w:numPr>
+          <w:ilvl w:val="0"/>
+          <w:numId w:val="2"/>
+        </w:numPr>
+        <w:spacing w:line="276" w:lineRule="auto"/>
+        <w:jc w:val="both"/>
+        <w:rPr>
+          <w:rFonts w:ascii="Arial" w:hAnsi="Arial" w:cs="Arial"/>
+          <w:sz w:val="24"/>
+        </w:rPr>
+      </w:pPr>
+      <w:r>
+        <w:rPr>
+          <w:rFonts w:ascii="Arial" w:hAnsi="Arial" w:cs="Arial"/>
+          <w:sz w:val="24"/>
+          <w:u w:val="single"/>
+        </w:rPr>
+        <w:t>Fiabilidad media</w:t>
+      </w:r>
+      <w:r>
+        <w:rPr>
+          <w:rFonts w:ascii="Arial" w:hAnsi="Arial" w:cs="Arial"/>
+          <w:sz w:val="24"/>
+        </w:rPr>
+        <w:t>:</w:t>
+      </w:r>
+      <w:r>
+        <w:rPr>
+          <w:rFonts w:ascii="Arial" w:hAnsi="Arial" w:cs="Arial"/>
+          <w:sz w:val="24"/>
+        </w:rPr>
+        <w:t xml:space="preserve"> Es una variable extraída de las opiniones. La eliminamos porque ya forma parte del índice de fiabilidad, de modo que si se quedara duplicaríamos la importancia de la opinión del cliente.</w:t>
+      </w:r>
+    </w:p>
+    <w:p>
+      <w:pPr>
+        <w:spacing w:line="276" w:lineRule="auto"/>
+        <w:jc w:val="both"/>
+        <w:rPr>
+          <w:rFonts w:ascii="Arial" w:hAnsi="Arial" w:cs="Arial"/>
+          <w:sz w:val="24"/>
+        </w:rPr>
+      </w:pPr>
+      <w:r>
+        <w:rPr>
+          <w:rFonts w:ascii="Arial" w:hAnsi="Arial" w:cs="Arial"/>
+          <w:sz w:val="24"/>
+        </w:rPr>
+        <w:t>Otras consideraciones a tener en cuenta es la eliminación de los identificadores. Los cuales se mantienen para poder identificar el coche, pero estas nunca se usarán para entrenar sino que habrá que excluirlas a la de entrenar los modelos. Y habrá que tener en cuenta también que no se ha eliminado ninguna de las variables dummies creadas de modo que podría provocar redundancia en los modelos por lo que a la hora de entrenar modelos si se usan esas variables tendremos que eliminar una de las variables para evitar la colinealidad perfecta.</w:t>
+      </w:r>
+      <w:bookmarkStart w:id="0" w:name="_GoBack"/>
+      <w:bookmarkEnd w:id="0"/>
+    </w:p>
+    <w:p>
+      <w:pPr>
         <w:pStyle w:val="Ttulo1"/>
         <w:numPr>
           <w:ilvl w:val="0"/>
@@ -5076,7 +5992,6 @@
           <w:b/>
           <w:color w:val="auto"/>
         </w:rPr>
-        <w:lastRenderedPageBreak/>
         <w:t>Fase 4: Minería de Datos</w:t>
       </w:r>
     </w:p>
@@ -5106,7 +6021,7 @@
     </w:p>
     <w:p/>
     <w:sectPr>
-      <w:footerReference w:type="default" r:id="rId11"/>
+      <w:footerReference w:type="default" r:id="rId12"/>
       <w:pgSz w:w="11906" w:h="16838"/>
       <w:pgMar w:top="1417" w:right="1701" w:bottom="1417" w:left="1701" w:header="708" w:footer="708" w:gutter="0"/>
       <w:cols w:space="708"/>
@@ -5171,7 +6086,7 @@
           <w:rPr>
             <w:noProof/>
           </w:rPr>
-          <w:t>6</w:t>
+          <w:t>8</w:t>
         </w:r>
         <w:r>
           <w:fldChar w:fldCharType="end"/>
@@ -5336,6 +6251,95 @@
     </w:lvl>
   </w:abstractNum>
   <w:abstractNum w:abstractNumId="1" w15:restartNumberingAfterBreak="0">
+    <w:nsid w:val="03C832E4"/>
+    <w:multiLevelType w:val="hybridMultilevel"/>
+    <w:tmpl w:val="C71CF586"/>
+    <w:lvl w:ilvl="0" w:tplc="0C0A0017">
+      <w:start w:val="1"/>
+      <w:numFmt w:val="lowerLetter"/>
+      <w:lvlText w:val="%1)"/>
+      <w:lvlJc w:val="left"/>
+      <w:pPr>
+        <w:ind w:left="720" w:hanging="360"/>
+      </w:pPr>
+      <w:rPr>
+        <w:rFonts w:hint="default"/>
+      </w:rPr>
+    </w:lvl>
+    <w:lvl w:ilvl="1" w:tplc="0C0A0019" w:tentative="1">
+      <w:start w:val="1"/>
+      <w:numFmt w:val="lowerLetter"/>
+      <w:lvlText w:val="%2."/>
+      <w:lvlJc w:val="left"/>
+      <w:pPr>
+        <w:ind w:left="1440" w:hanging="360"/>
+      </w:pPr>
+    </w:lvl>
+    <w:lvl w:ilvl="2" w:tplc="0C0A001B" w:tentative="1">
+      <w:start w:val="1"/>
+      <w:numFmt w:val="lowerRoman"/>
+      <w:lvlText w:val="%3."/>
+      <w:lvlJc w:val="right"/>
+      <w:pPr>
+        <w:ind w:left="2160" w:hanging="180"/>
+      </w:pPr>
+    </w:lvl>
+    <w:lvl w:ilvl="3" w:tplc="0C0A000F" w:tentative="1">
+      <w:start w:val="1"/>
+      <w:numFmt w:val="decimal"/>
+      <w:lvlText w:val="%4."/>
+      <w:lvlJc w:val="left"/>
+      <w:pPr>
+        <w:ind w:left="2880" w:hanging="360"/>
+      </w:pPr>
+    </w:lvl>
+    <w:lvl w:ilvl="4" w:tplc="0C0A0019" w:tentative="1">
+      <w:start w:val="1"/>
+      <w:numFmt w:val="lowerLetter"/>
+      <w:lvlText w:val="%5."/>
+      <w:lvlJc w:val="left"/>
+      <w:pPr>
+        <w:ind w:left="3600" w:hanging="360"/>
+      </w:pPr>
+    </w:lvl>
+    <w:lvl w:ilvl="5" w:tplc="0C0A001B" w:tentative="1">
+      <w:start w:val="1"/>
+      <w:numFmt w:val="lowerRoman"/>
+      <w:lvlText w:val="%6."/>
+      <w:lvlJc w:val="right"/>
+      <w:pPr>
+        <w:ind w:left="4320" w:hanging="180"/>
+      </w:pPr>
+    </w:lvl>
+    <w:lvl w:ilvl="6" w:tplc="0C0A000F" w:tentative="1">
+      <w:start w:val="1"/>
+      <w:numFmt w:val="decimal"/>
+      <w:lvlText w:val="%7."/>
+      <w:lvlJc w:val="left"/>
+      <w:pPr>
+        <w:ind w:left="5040" w:hanging="360"/>
+      </w:pPr>
+    </w:lvl>
+    <w:lvl w:ilvl="7" w:tplc="0C0A0019" w:tentative="1">
+      <w:start w:val="1"/>
+      <w:numFmt w:val="lowerLetter"/>
+      <w:lvlText w:val="%8."/>
+      <w:lvlJc w:val="left"/>
+      <w:pPr>
+        <w:ind w:left="5760" w:hanging="360"/>
+      </w:pPr>
+    </w:lvl>
+    <w:lvl w:ilvl="8" w:tplc="0C0A001B" w:tentative="1">
+      <w:start w:val="1"/>
+      <w:numFmt w:val="lowerRoman"/>
+      <w:lvlText w:val="%9."/>
+      <w:lvlJc w:val="right"/>
+      <w:pPr>
+        <w:ind w:left="6480" w:hanging="180"/>
+      </w:pPr>
+    </w:lvl>
+  </w:abstractNum>
+  <w:abstractNum w:abstractNumId="2" w15:restartNumberingAfterBreak="0">
     <w:nsid w:val="7D3A75FD"/>
     <w:multiLevelType w:val="hybridMultilevel"/>
     <w:tmpl w:val="E148304E"/>
@@ -5452,6 +6456,9 @@
     <w:abstractNumId w:val="0"/>
   </w:num>
   <w:num w:numId="2">
+    <w:abstractNumId w:val="2"/>
+  </w:num>
+  <w:num w:numId="3">
     <w:abstractNumId w:val="1"/>
   </w:num>
 </w:numbering>
@@ -5895,6 +6902,28 @@
       <w:szCs w:val="26"/>
     </w:rPr>
   </w:style>
+  <w:style w:type="paragraph" w:styleId="Ttulo3">
+    <w:name w:val="heading 3"/>
+    <w:basedOn w:val="Normal"/>
+    <w:next w:val="Normal"/>
+    <w:link w:val="Ttulo3Car"/>
+    <w:uiPriority w:val="9"/>
+    <w:unhideWhenUsed/>
+    <w:qFormat/>
+    <w:rsid w:val="00583E93"/>
+    <w:pPr>
+      <w:keepNext/>
+      <w:keepLines/>
+      <w:spacing w:before="40" w:after="0"/>
+      <w:outlineLvl w:val="2"/>
+    </w:pPr>
+    <w:rPr>
+      <w:rFonts w:asciiTheme="majorHAnsi" w:eastAsiaTheme="majorEastAsia" w:hAnsiTheme="majorHAnsi" w:cstheme="majorBidi"/>
+      <w:color w:val="1F4D78" w:themeColor="accent1" w:themeShade="7F"/>
+      <w:sz w:val="24"/>
+      <w:szCs w:val="24"/>
+    </w:rPr>
+  </w:style>
   <w:style w:type="character" w:default="1" w:styleId="Fuentedeprrafopredeter">
     <w:name w:val="Default Paragraph Font"/>
     <w:uiPriority w:val="1"/>
@@ -6021,6 +7050,19 @@
     <w:link w:val="Piedepgina"/>
     <w:uiPriority w:val="99"/>
     <w:rsid w:val="00A92D14"/>
+  </w:style>
+  <w:style w:type="character" w:customStyle="1" w:styleId="Ttulo3Car">
+    <w:name w:val="Título 3 Car"/>
+    <w:basedOn w:val="Fuentedeprrafopredeter"/>
+    <w:link w:val="Ttulo3"/>
+    <w:uiPriority w:val="9"/>
+    <w:rsid w:val="00583E93"/>
+    <w:rPr>
+      <w:rFonts w:asciiTheme="majorHAnsi" w:eastAsiaTheme="majorEastAsia" w:hAnsiTheme="majorHAnsi" w:cstheme="majorBidi"/>
+      <w:color w:val="1F4D78" w:themeColor="accent1" w:themeShade="7F"/>
+      <w:sz w:val="24"/>
+      <w:szCs w:val="24"/>
+    </w:rPr>
   </w:style>
 </w:styles>
 </file>
@@ -6291,7 +7333,7 @@
 </file>
 
 <file path=customXml/itemProps1.xml><?xml version="1.0" encoding="utf-8"?>
-<ds:datastoreItem xmlns:ds="http://schemas.openxmlformats.org/officeDocument/2006/customXml" ds:itemID="{F9D8EC2C-D396-4E2B-813C-FE88F5D28284}">
+<ds:datastoreItem xmlns:ds="http://schemas.openxmlformats.org/officeDocument/2006/customXml" ds:itemID="{D840D134-AEAE-4145-8656-71A55400AC7E}">
   <ds:schemaRefs>
     <ds:schemaRef ds:uri="http://schemas.openxmlformats.org/officeDocument/2006/bibliography"/>
   </ds:schemaRefs>

</xml_diff>

<commit_message>
Punto 1 retocado + punto 1 en documento y punto 4.1 arbol de decisiones - *falta revisar, comentar y hacer el documento*
</commit_message>
<xml_diff>
--- a/SistemaAnalisisMercadoAutomocion.docx
+++ b/SistemaAnalisisMercadoAutomocion.docx
@@ -1,6 +1,6 @@
 
 <file path=word/document.xml><?xml version="1.0" encoding="utf-8"?>
-<w:document xmlns:wpc="http://schemas.microsoft.com/office/word/2010/wordprocessingCanvas" xmlns:mc="http://schemas.openxmlformats.org/markup-compatibility/2006" xmlns:o="urn:schemas-microsoft-com:office:office" xmlns:r="http://schemas.openxmlformats.org/officeDocument/2006/relationships" xmlns:m="http://schemas.openxmlformats.org/officeDocument/2006/math" xmlns:v="urn:schemas-microsoft-com:vml" xmlns:wp14="http://schemas.microsoft.com/office/word/2010/wordprocessingDrawing" xmlns:wp="http://schemas.openxmlformats.org/drawingml/2006/wordprocessingDrawing" xmlns:w10="urn:schemas-microsoft-com:office:word" xmlns:w="http://schemas.openxmlformats.org/wordprocessingml/2006/main" xmlns:w14="http://schemas.microsoft.com/office/word/2010/wordml" xmlns:w15="http://schemas.microsoft.com/office/word/2012/wordml" xmlns:wpg="http://schemas.microsoft.com/office/word/2010/wordprocessingGroup" xmlns:wpi="http://schemas.microsoft.com/office/word/2010/wordprocessingInk" xmlns:wne="http://schemas.microsoft.com/office/word/2006/wordml" xmlns:wps="http://schemas.microsoft.com/office/word/2010/wordprocessingShape" mc:Ignorable="w14 w15 wp14">
+<w:document xmlns:wpc="http://schemas.microsoft.com/office/word/2010/wordprocessingCanvas" xmlns:cx="http://schemas.microsoft.com/office/drawing/2014/chartex" xmlns:cx1="http://schemas.microsoft.com/office/drawing/2015/9/8/chartex" xmlns:cx2="http://schemas.microsoft.com/office/drawing/2015/10/21/chartex" xmlns:cx3="http://schemas.microsoft.com/office/drawing/2016/5/9/chartex" xmlns:cx4="http://schemas.microsoft.com/office/drawing/2016/5/10/chartex" xmlns:cx5="http://schemas.microsoft.com/office/drawing/2016/5/11/chartex" xmlns:cx6="http://schemas.microsoft.com/office/drawing/2016/5/12/chartex" xmlns:cx7="http://schemas.microsoft.com/office/drawing/2016/5/13/chartex" xmlns:cx8="http://schemas.microsoft.com/office/drawing/2016/5/14/chartex" xmlns:mc="http://schemas.openxmlformats.org/markup-compatibility/2006" xmlns:aink="http://schemas.microsoft.com/office/drawing/2016/ink" xmlns:am3d="http://schemas.microsoft.com/office/drawing/2017/model3d" xmlns:o="urn:schemas-microsoft-com:office:office" xmlns:oel="http://schemas.microsoft.com/office/2019/extlst" xmlns:r="http://schemas.openxmlformats.org/officeDocument/2006/relationships" xmlns:m="http://schemas.openxmlformats.org/officeDocument/2006/math" xmlns:v="urn:schemas-microsoft-com:vml" xmlns:wp14="http://schemas.microsoft.com/office/word/2010/wordprocessingDrawing" xmlns:wp="http://schemas.openxmlformats.org/drawingml/2006/wordprocessingDrawing" xmlns:w10="urn:schemas-microsoft-com:office:word" xmlns:w="http://schemas.openxmlformats.org/wordprocessingml/2006/main" xmlns:w14="http://schemas.microsoft.com/office/word/2010/wordml" xmlns:w15="http://schemas.microsoft.com/office/word/2012/wordml" xmlns:w16cex="http://schemas.microsoft.com/office/word/2018/wordml/cex" xmlns:w16cid="http://schemas.microsoft.com/office/word/2016/wordml/cid" xmlns:w16="http://schemas.microsoft.com/office/word/2018/wordml" xmlns:w16du="http://schemas.microsoft.com/office/word/2023/wordml/word16du" xmlns:w16sdtdh="http://schemas.microsoft.com/office/word/2020/wordml/sdtdatahash" xmlns:w16sdtfl="http://schemas.microsoft.com/office/word/2024/wordml/sdtformatlock" xmlns:w16se="http://schemas.microsoft.com/office/word/2015/wordml/symex" xmlns:wpg="http://schemas.microsoft.com/office/word/2010/wordprocessingGroup" xmlns:wpi="http://schemas.microsoft.com/office/word/2010/wordprocessingInk" xmlns:wne="http://schemas.microsoft.com/office/word/2006/wordml" xmlns:wps="http://schemas.microsoft.com/office/word/2010/wordprocessingShape" mc:Ignorable="w14 w15 w16se w16cid w16 w16cex w16sdtdh w16sdtfl w16du wp14">
   <w:body>
     <w:p>
       <w:pPr>
@@ -466,39 +466,7 @@
           <w:rFonts w:ascii="Arial" w:hAnsi="Arial" w:cs="Arial"/>
           <w:sz w:val="24"/>
         </w:rPr>
-        <w:t>El objetivo principal del este proyecto es el desarrollo de un sistema de análisis del mercado de automoción centrado en la venta de vehículos de segunda mano. Para ello, se aplicará la metodología KDD (</w:t>
-      </w:r>
-      <w:proofErr w:type="spellStart"/>
-      <w:r>
-        <w:rPr>
-          <w:rFonts w:ascii="Arial" w:hAnsi="Arial" w:cs="Arial"/>
-          <w:sz w:val="24"/>
-        </w:rPr>
-        <w:t>Knowledge</w:t>
-      </w:r>
-      <w:proofErr w:type="spellEnd"/>
-      <w:r>
-        <w:rPr>
-          <w:rFonts w:ascii="Arial" w:hAnsi="Arial" w:cs="Arial"/>
-          <w:sz w:val="24"/>
-        </w:rPr>
-        <w:t xml:space="preserve"> Discovery in </w:t>
-      </w:r>
-      <w:proofErr w:type="spellStart"/>
-      <w:r>
-        <w:rPr>
-          <w:rFonts w:ascii="Arial" w:hAnsi="Arial" w:cs="Arial"/>
-          <w:sz w:val="24"/>
-        </w:rPr>
-        <w:t>Databases</w:t>
-      </w:r>
-      <w:proofErr w:type="spellEnd"/>
-      <w:r>
-        <w:rPr>
-          <w:rFonts w:ascii="Arial" w:hAnsi="Arial" w:cs="Arial"/>
-          <w:sz w:val="24"/>
-        </w:rPr>
-        <w:t>), donde a través de diferentes fases se busca extraer el conocimiento para la toma de decisiones estratégicas.</w:t>
+        <w:t>El objetivo principal del este proyecto es el desarrollo de un sistema de análisis del mercado de automoción centrado en la venta de vehículos de segunda mano. Para ello, se aplicará la metodología KDD (Knowledge Discovery in Databases), donde a través de diferentes fases se busca extraer el conocimiento para la toma de decisiones estratégicas.</w:t>
       </w:r>
     </w:p>
     <w:p>
@@ -602,23 +570,7 @@
           <w:rFonts w:ascii="Arial" w:hAnsi="Arial" w:cs="Arial"/>
           <w:sz w:val="24"/>
         </w:rPr>
-        <w:t xml:space="preserve">El fichero </w:t>
-      </w:r>
-      <w:proofErr w:type="spellStart"/>
-      <w:r>
-        <w:rPr>
-          <w:rFonts w:ascii="Arial" w:hAnsi="Arial" w:cs="Arial"/>
-          <w:sz w:val="24"/>
-        </w:rPr>
-        <w:t>vehículos.json</w:t>
-      </w:r>
-      <w:proofErr w:type="spellEnd"/>
-      <w:r>
-        <w:rPr>
-          <w:rFonts w:ascii="Arial" w:hAnsi="Arial" w:cs="Arial"/>
-          <w:sz w:val="24"/>
-        </w:rPr>
-        <w:t>, con características técnicas.</w:t>
+        <w:t>El fichero vehículos.json, con características técnicas.</w:t>
       </w:r>
     </w:p>
     <w:p>
@@ -688,19 +640,8 @@
           <w:color w:val="auto"/>
           <w:sz w:val="28"/>
         </w:rPr>
-        <w:t xml:space="preserve">Datos del fichero </w:t>
-      </w:r>
-      <w:proofErr w:type="spellStart"/>
-      <w:r>
-        <w:rPr>
-          <w:rFonts w:ascii="Arial" w:hAnsi="Arial" w:cs="Arial"/>
-          <w:b/>
-          <w:color w:val="auto"/>
-          <w:sz w:val="28"/>
-        </w:rPr>
-        <w:t>vehículos.json</w:t>
-      </w:r>
-      <w:proofErr w:type="spellEnd"/>
+        <w:t>Datos del fichero vehículos.json</w:t>
+      </w:r>
     </w:p>
     <w:p>
       <w:pPr>
@@ -855,21 +796,12 @@
                 <w:sz w:val="24"/>
               </w:rPr>
             </w:pPr>
-            <w:proofErr w:type="spellStart"/>
-            <w:r>
-              <w:rPr>
-                <w:rFonts w:ascii="Arial" w:hAnsi="Arial" w:cs="Arial"/>
-                <w:sz w:val="24"/>
-              </w:rPr>
-              <w:t>Vehiculo</w:t>
-            </w:r>
-            <w:proofErr w:type="spellEnd"/>
-            <w:r>
-              <w:rPr>
-                <w:rFonts w:ascii="Arial" w:hAnsi="Arial" w:cs="Arial"/>
-                <w:sz w:val="24"/>
-              </w:rPr>
-              <w:t>-id</w:t>
+            <w:r>
+              <w:rPr>
+                <w:rFonts w:ascii="Arial" w:hAnsi="Arial" w:cs="Arial"/>
+                <w:sz w:val="24"/>
+              </w:rPr>
+              <w:t>Vehiculo-id</w:t>
             </w:r>
           </w:p>
         </w:tc>
@@ -1146,7 +1078,6 @@
                 <w:sz w:val="24"/>
               </w:rPr>
             </w:pPr>
-            <w:proofErr w:type="spellStart"/>
             <w:r>
               <w:rPr>
                 <w:rFonts w:ascii="Arial" w:hAnsi="Arial" w:cs="Arial"/>
@@ -1154,7 +1085,6 @@
               </w:rPr>
               <w:t>Anio-fabricacion</w:t>
             </w:r>
-            <w:proofErr w:type="spellEnd"/>
           </w:p>
         </w:tc>
         <w:tc>
@@ -1336,7 +1266,6 @@
                 <w:sz w:val="24"/>
               </w:rPr>
             </w:pPr>
-            <w:proofErr w:type="spellStart"/>
             <w:r>
               <w:rPr>
                 <w:rFonts w:ascii="Arial" w:hAnsi="Arial" w:cs="Arial"/>
@@ -1344,7 +1273,6 @@
               </w:rPr>
               <w:t>Transmision</w:t>
             </w:r>
-            <w:proofErr w:type="spellEnd"/>
           </w:p>
         </w:tc>
         <w:tc>
@@ -1437,7 +1365,6 @@
                 <w:rFonts w:ascii="Arial" w:hAnsi="Arial" w:cs="Arial"/>
                 <w:sz w:val="24"/>
               </w:rPr>
-              <w:lastRenderedPageBreak/>
               <w:t>Potencia-cv</w:t>
             </w:r>
           </w:p>
@@ -2071,23 +1998,7 @@
                 <w:rFonts w:ascii="Arial" w:hAnsi="Arial" w:cs="Arial"/>
                 <w:sz w:val="24"/>
               </w:rPr>
-              <w:t xml:space="preserve">Compacto, Sedán, Deportivo, SUV, </w:t>
-            </w:r>
-            <w:proofErr w:type="spellStart"/>
-            <w:r>
-              <w:rPr>
-                <w:rFonts w:ascii="Arial" w:hAnsi="Arial" w:cs="Arial"/>
-                <w:sz w:val="24"/>
-              </w:rPr>
-              <w:t>Executive</w:t>
-            </w:r>
-            <w:proofErr w:type="spellEnd"/>
-            <w:r>
-              <w:rPr>
-                <w:rFonts w:ascii="Arial" w:hAnsi="Arial" w:cs="Arial"/>
-                <w:sz w:val="24"/>
-              </w:rPr>
-              <w:t>.</w:t>
+              <w:t>Compacto, Sedán, Deportivo, SUV, Executive.</w:t>
             </w:r>
           </w:p>
         </w:tc>
@@ -2376,21 +2287,12 @@
                 <w:sz w:val="24"/>
               </w:rPr>
             </w:pPr>
-            <w:proofErr w:type="spellStart"/>
-            <w:r>
-              <w:rPr>
-                <w:rFonts w:ascii="Arial" w:hAnsi="Arial" w:cs="Arial"/>
-                <w:sz w:val="24"/>
-              </w:rPr>
-              <w:t>Vehiculo</w:t>
-            </w:r>
-            <w:proofErr w:type="spellEnd"/>
-            <w:r>
-              <w:rPr>
-                <w:rFonts w:ascii="Arial" w:hAnsi="Arial" w:cs="Arial"/>
-                <w:sz w:val="24"/>
-              </w:rPr>
-              <w:t>-id</w:t>
+            <w:r>
+              <w:rPr>
+                <w:rFonts w:ascii="Arial" w:hAnsi="Arial" w:cs="Arial"/>
+                <w:sz w:val="24"/>
+              </w:rPr>
+              <w:t>Vehiculo-id</w:t>
             </w:r>
           </w:p>
         </w:tc>
@@ -2573,21 +2475,12 @@
                 <w:sz w:val="24"/>
               </w:rPr>
             </w:pPr>
-            <w:proofErr w:type="spellStart"/>
-            <w:r>
-              <w:rPr>
-                <w:rFonts w:ascii="Arial" w:hAnsi="Arial" w:cs="Arial"/>
-                <w:sz w:val="24"/>
-              </w:rPr>
-              <w:t>Region</w:t>
-            </w:r>
-            <w:proofErr w:type="spellEnd"/>
-            <w:r>
-              <w:rPr>
-                <w:rFonts w:ascii="Arial" w:hAnsi="Arial" w:cs="Arial"/>
-                <w:sz w:val="24"/>
-              </w:rPr>
-              <w:t>-vendedor</w:t>
+            <w:r>
+              <w:rPr>
+                <w:rFonts w:ascii="Arial" w:hAnsi="Arial" w:cs="Arial"/>
+                <w:sz w:val="24"/>
+              </w:rPr>
+              <w:t>Region-vendedor</w:t>
             </w:r>
           </w:p>
         </w:tc>
@@ -2676,7 +2569,6 @@
                 <w:sz w:val="24"/>
               </w:rPr>
             </w:pPr>
-            <w:proofErr w:type="spellStart"/>
             <w:r>
               <w:rPr>
                 <w:rFonts w:ascii="Arial" w:hAnsi="Arial" w:cs="Arial"/>
@@ -2684,7 +2576,6 @@
               </w:rPr>
               <w:t>Precio_venta_real</w:t>
             </w:r>
-            <w:proofErr w:type="spellEnd"/>
           </w:p>
         </w:tc>
         <w:tc>
@@ -2772,7 +2663,6 @@
                 <w:sz w:val="24"/>
               </w:rPr>
             </w:pPr>
-            <w:proofErr w:type="spellStart"/>
             <w:r>
               <w:rPr>
                 <w:rFonts w:ascii="Arial" w:hAnsi="Arial" w:cs="Arial"/>
@@ -2780,7 +2670,6 @@
               </w:rPr>
               <w:t>Kilometraje_venta</w:t>
             </w:r>
-            <w:proofErr w:type="spellEnd"/>
           </w:p>
         </w:tc>
         <w:tc>
@@ -2797,21 +2686,12 @@
                 <w:sz w:val="24"/>
               </w:rPr>
             </w:pPr>
-            <w:proofErr w:type="spellStart"/>
-            <w:r>
-              <w:rPr>
-                <w:rFonts w:ascii="Arial" w:hAnsi="Arial" w:cs="Arial"/>
-                <w:sz w:val="24"/>
-              </w:rPr>
-              <w:t>Kilometros</w:t>
-            </w:r>
-            <w:proofErr w:type="spellEnd"/>
-            <w:r>
-              <w:rPr>
-                <w:rFonts w:ascii="Arial" w:hAnsi="Arial" w:cs="Arial"/>
-                <w:sz w:val="24"/>
-              </w:rPr>
-              <w:t xml:space="preserve"> del vehículo</w:t>
+            <w:r>
+              <w:rPr>
+                <w:rFonts w:ascii="Arial" w:hAnsi="Arial" w:cs="Arial"/>
+                <w:sz w:val="24"/>
+              </w:rPr>
+              <w:t>Kilometros del vehículo</w:t>
             </w:r>
           </w:p>
         </w:tc>
@@ -2877,16 +2757,13 @@
                 <w:sz w:val="24"/>
               </w:rPr>
             </w:pPr>
-            <w:proofErr w:type="spellStart"/>
-            <w:r>
-              <w:rPr>
-                <w:rFonts w:ascii="Arial" w:hAnsi="Arial" w:cs="Arial"/>
-                <w:sz w:val="24"/>
-              </w:rPr>
-              <w:lastRenderedPageBreak/>
+            <w:r>
+              <w:rPr>
+                <w:rFonts w:ascii="Arial" w:hAnsi="Arial" w:cs="Arial"/>
+                <w:sz w:val="24"/>
+              </w:rPr>
               <w:t>Servicios_realizados</w:t>
             </w:r>
-            <w:proofErr w:type="spellEnd"/>
           </w:p>
         </w:tc>
         <w:tc>
@@ -2974,7 +2851,6 @@
                 <w:sz w:val="24"/>
               </w:rPr>
             </w:pPr>
-            <w:proofErr w:type="spellStart"/>
             <w:r>
               <w:rPr>
                 <w:rFonts w:ascii="Arial" w:hAnsi="Arial" w:cs="Arial"/>
@@ -2982,7 +2858,6 @@
               </w:rPr>
               <w:t>Coste_mantenimiento_anual</w:t>
             </w:r>
-            <w:proofErr w:type="spellEnd"/>
           </w:p>
         </w:tc>
         <w:tc>
@@ -3070,7 +2945,6 @@
                 <w:sz w:val="24"/>
               </w:rPr>
             </w:pPr>
-            <w:proofErr w:type="spellStart"/>
             <w:r>
               <w:rPr>
                 <w:rFonts w:ascii="Arial" w:hAnsi="Arial" w:cs="Arial"/>
@@ -3078,7 +2952,6 @@
               </w:rPr>
               <w:t>Incidencias_mecánicas</w:t>
             </w:r>
-            <w:proofErr w:type="spellEnd"/>
           </w:p>
         </w:tc>
         <w:tc>
@@ -3166,7 +3039,6 @@
                 <w:sz w:val="24"/>
               </w:rPr>
             </w:pPr>
-            <w:proofErr w:type="spellStart"/>
             <w:r>
               <w:rPr>
                 <w:rFonts w:ascii="Arial" w:hAnsi="Arial" w:cs="Arial"/>
@@ -3174,7 +3046,6 @@
               </w:rPr>
               <w:t>Valor_residual_estimad</w:t>
             </w:r>
-            <w:proofErr w:type="spellEnd"/>
           </w:p>
         </w:tc>
         <w:tc>
@@ -3425,7 +3296,6 @@
                 <w:sz w:val="24"/>
               </w:rPr>
             </w:pPr>
-            <w:proofErr w:type="spellStart"/>
             <w:r>
               <w:rPr>
                 <w:rFonts w:ascii="Arial" w:hAnsi="Arial" w:cs="Arial"/>
@@ -3433,7 +3303,6 @@
               </w:rPr>
               <w:t>Review_id</w:t>
             </w:r>
-            <w:proofErr w:type="spellEnd"/>
           </w:p>
         </w:tc>
         <w:tc>
@@ -3521,7 +3390,6 @@
                 <w:sz w:val="24"/>
               </w:rPr>
             </w:pPr>
-            <w:proofErr w:type="spellStart"/>
             <w:r>
               <w:rPr>
                 <w:rFonts w:ascii="Arial" w:hAnsi="Arial" w:cs="Arial"/>
@@ -3529,7 +3397,6 @@
               </w:rPr>
               <w:t>Vehiculo_id</w:t>
             </w:r>
-            <w:proofErr w:type="spellEnd"/>
           </w:p>
         </w:tc>
         <w:tc>
@@ -3617,7 +3484,6 @@
                 <w:sz w:val="24"/>
               </w:rPr>
             </w:pPr>
-            <w:proofErr w:type="spellStart"/>
             <w:r>
               <w:rPr>
                 <w:rFonts w:ascii="Arial" w:hAnsi="Arial" w:cs="Arial"/>
@@ -3625,7 +3491,6 @@
               </w:rPr>
               <w:t>Cliente_id</w:t>
             </w:r>
-            <w:proofErr w:type="spellEnd"/>
           </w:p>
         </w:tc>
         <w:tc>
@@ -3713,7 +3578,6 @@
                 <w:sz w:val="24"/>
               </w:rPr>
             </w:pPr>
-            <w:proofErr w:type="spellStart"/>
             <w:r>
               <w:rPr>
                 <w:rFonts w:ascii="Arial" w:hAnsi="Arial" w:cs="Arial"/>
@@ -3721,7 +3585,6 @@
               </w:rPr>
               <w:t>Puntuación_conjunta</w:t>
             </w:r>
-            <w:proofErr w:type="spellEnd"/>
           </w:p>
         </w:tc>
         <w:tc>
@@ -4373,7 +4236,6 @@
                 <w:sz w:val="24"/>
               </w:rPr>
             </w:pPr>
-            <w:proofErr w:type="spellStart"/>
             <w:r>
               <w:rPr>
                 <w:rFonts w:ascii="Arial" w:hAnsi="Arial" w:cs="Arial"/>
@@ -4381,7 +4243,6 @@
               </w:rPr>
               <w:t>Texto_review</w:t>
             </w:r>
-            <w:proofErr w:type="spellEnd"/>
           </w:p>
         </w:tc>
         <w:tc>
@@ -4486,8 +4347,3351 @@
           <w:b/>
           <w:color w:val="auto"/>
         </w:rPr>
-        <w:lastRenderedPageBreak/>
         <w:t>Fase 1: Selección y comprensión del dominio</w:t>
+      </w:r>
+    </w:p>
+    <w:p>
+      <w:pPr>
+        <w:pStyle w:val="Ttulo2"/>
+        <w:numPr>
+          <w:ilvl w:val="1"/>
+          <w:numId w:val="1"/>
+        </w:numPr>
+        <w:spacing w:line="276" w:lineRule="auto"/>
+        <w:jc w:val="both"/>
+        <w:rPr>
+          <w:rFonts w:ascii="Arial" w:hAnsi="Arial" w:cs="Arial"/>
+          <w:b/>
+          <w:color w:val="auto"/>
+          <w:sz w:val="28"/>
+        </w:rPr>
+      </w:pPr>
+      <w:r>
+        <w:rPr>
+          <w:rFonts w:ascii="Arial" w:hAnsi="Arial" w:cs="Arial"/>
+          <w:b/>
+          <w:color w:val="auto"/>
+          <w:sz w:val="28"/>
+        </w:rPr>
+        <w:t>An</w:t>
+      </w:r>
+      <w:r>
+        <w:rPr>
+          <w:rFonts w:ascii="Arial" w:hAnsi="Arial" w:cs="Arial"/>
+          <w:b/>
+          <w:color w:val="auto"/>
+          <w:sz w:val="28"/>
+        </w:rPr>
+        <w:t>á</w:t>
+      </w:r>
+      <w:r>
+        <w:rPr>
+          <w:rFonts w:ascii="Arial" w:hAnsi="Arial" w:cs="Arial"/>
+          <w:b/>
+          <w:color w:val="auto"/>
+          <w:sz w:val="28"/>
+        </w:rPr>
+        <w:t>lisis Exploratorio del Dominio</w:t>
+      </w:r>
+    </w:p>
+    <w:p>
+      <w:pPr>
+        <w:pStyle w:val="Prrafodelista"/>
+        <w:numPr>
+          <w:ilvl w:val="0"/>
+          <w:numId w:val="6"/>
+        </w:numPr>
+        <w:jc w:val="both"/>
+        <w:rPr>
+          <w:rFonts w:ascii="Arial" w:hAnsi="Arial" w:cs="Arial"/>
+          <w:sz w:val="24"/>
+          <w:szCs w:val="24"/>
+        </w:rPr>
+      </w:pPr>
+      <w:r>
+        <w:rPr>
+          <w:rFonts w:ascii="Arial" w:hAnsi="Arial" w:cs="Arial"/>
+          <w:sz w:val="24"/>
+          <w:szCs w:val="24"/>
+        </w:rPr>
+        <w:t>Analizar distribuci</w:t>
+      </w:r>
+      <w:r>
+        <w:rPr>
+          <w:rFonts w:ascii="Arial" w:hAnsi="Arial" w:cs="Arial"/>
+          <w:sz w:val="24"/>
+          <w:szCs w:val="24"/>
+        </w:rPr>
+        <w:t>ó</w:t>
+      </w:r>
+      <w:r>
+        <w:rPr>
+          <w:rFonts w:ascii="Arial" w:hAnsi="Arial" w:cs="Arial"/>
+          <w:sz w:val="24"/>
+          <w:szCs w:val="24"/>
+        </w:rPr>
+        <w:t>n de marcas, modelos y segmentos</w:t>
+      </w:r>
+    </w:p>
+    <w:p>
+      <w:pPr>
+        <w:pStyle w:val="Prrafodelista"/>
+        <w:jc w:val="both"/>
+        <w:rPr>
+          <w:rFonts w:ascii="Arial" w:hAnsi="Arial" w:cs="Arial"/>
+          <w:sz w:val="24"/>
+          <w:szCs w:val="24"/>
+        </w:rPr>
+      </w:pPr>
+    </w:p>
+    <w:p>
+      <w:pPr>
+        <w:pStyle w:val="Prrafodelista"/>
+        <w:ind w:left="0"/>
+        <w:jc w:val="both"/>
+        <w:rPr>
+          <w:rFonts w:ascii="Arial" w:hAnsi="Arial" w:cs="Arial"/>
+          <w:sz w:val="24"/>
+          <w:szCs w:val="24"/>
+        </w:rPr>
+      </w:pPr>
+      <w:r>
+        <w:rPr>
+          <w:rFonts w:ascii="Arial" w:hAnsi="Arial" w:cs="Arial"/>
+          <w:sz w:val="24"/>
+          <w:szCs w:val="24"/>
+        </w:rPr>
+        <w:t>El objetivo de este primer apartado es comprender la composición del conjunto de datos, identificando cómo se distribuyen los vehículos según marca, modelo y segmento de mercado. Este análisis permite detectar posibles sesgos en los datos y entender qué tipos de vehículos están más representados.</w:t>
+      </w:r>
+    </w:p>
+    <w:p>
+      <w:pPr>
+        <w:pStyle w:val="Prrafodelista"/>
+        <w:ind w:left="0"/>
+        <w:jc w:val="both"/>
+        <w:rPr>
+          <w:rFonts w:ascii="Arial" w:hAnsi="Arial" w:cs="Arial"/>
+          <w:sz w:val="24"/>
+          <w:szCs w:val="24"/>
+        </w:rPr>
+      </w:pPr>
+    </w:p>
+    <w:p>
+      <w:pPr>
+        <w:pStyle w:val="Prrafodelista"/>
+        <w:ind w:left="0"/>
+        <w:jc w:val="both"/>
+        <w:rPr>
+          <w:rFonts w:ascii="Arial" w:hAnsi="Arial" w:cs="Arial"/>
+          <w:b/>
+          <w:bCs/>
+          <w:sz w:val="24"/>
+          <w:szCs w:val="24"/>
+        </w:rPr>
+      </w:pPr>
+      <w:r>
+        <w:rPr>
+          <w:rFonts w:ascii="Arial" w:hAnsi="Arial" w:cs="Arial"/>
+          <w:b/>
+          <w:bCs/>
+          <w:sz w:val="24"/>
+          <w:szCs w:val="24"/>
+        </w:rPr>
+        <w:t>Análisis de marca</w:t>
+      </w:r>
+    </w:p>
+    <w:p>
+      <w:pPr>
+        <w:pStyle w:val="Prrafodelista"/>
+        <w:ind w:left="0"/>
+        <w:jc w:val="both"/>
+        <w:rPr>
+          <w:rFonts w:ascii="Arial" w:hAnsi="Arial" w:cs="Arial"/>
+          <w:sz w:val="24"/>
+          <w:szCs w:val="24"/>
+        </w:rPr>
+      </w:pPr>
+      <w:r>
+        <w:rPr>
+          <w:rFonts w:ascii="Arial" w:hAnsi="Arial" w:cs="Arial"/>
+          <w:sz w:val="24"/>
+          <w:szCs w:val="24"/>
+        </w:rPr>
+        <w:drawing>
+          <wp:inline distT="0" distB="0" distL="0" distR="0" wp14:anchorId="4974BAD4" wp14:editId="7EFD87A5">
+            <wp:extent cx="5400040" cy="3444240"/>
+            <wp:effectExtent l="0" t="0" r="0" b="3810"/>
+            <wp:docPr id="1091477871" name="Imagen 1"/>
+            <wp:cNvGraphicFramePr>
+              <a:graphicFrameLocks xmlns:a="http://schemas.openxmlformats.org/drawingml/2006/main" noChangeAspect="1"/>
+            </wp:cNvGraphicFramePr>
+            <a:graphic xmlns:a="http://schemas.openxmlformats.org/drawingml/2006/main">
+              <a:graphicData uri="http://schemas.openxmlformats.org/drawingml/2006/picture">
+                <pic:pic xmlns:pic="http://schemas.openxmlformats.org/drawingml/2006/picture">
+                  <pic:nvPicPr>
+                    <pic:cNvPr id="1091477871" name=""/>
+                    <pic:cNvPicPr/>
+                  </pic:nvPicPr>
+                  <pic:blipFill>
+                    <a:blip r:embed="rId10"/>
+                    <a:stretch>
+                      <a:fillRect/>
+                    </a:stretch>
+                  </pic:blipFill>
+                  <pic:spPr>
+                    <a:xfrm>
+                      <a:off x="0" y="0"/>
+                      <a:ext cx="5400040" cy="3444240"/>
+                    </a:xfrm>
+                    <a:prstGeom prst="rect">
+                      <a:avLst/>
+                    </a:prstGeom>
+                  </pic:spPr>
+                </pic:pic>
+              </a:graphicData>
+            </a:graphic>
+          </wp:inline>
+        </w:drawing>
+      </w:r>
+    </w:p>
+    <w:p>
+      <w:pPr>
+        <w:pStyle w:val="Prrafodelista"/>
+        <w:numPr>
+          <w:ilvl w:val="0"/>
+          <w:numId w:val="2"/>
+        </w:numPr>
+        <w:jc w:val="both"/>
+        <w:rPr>
+          <w:rFonts w:ascii="Arial" w:hAnsi="Arial" w:cs="Arial"/>
+          <w:sz w:val="24"/>
+          <w:szCs w:val="24"/>
+        </w:rPr>
+      </w:pPr>
+      <w:r>
+        <w:rPr>
+          <w:rFonts w:ascii="Arial" w:hAnsi="Arial" w:cs="Arial"/>
+          <w:sz w:val="24"/>
+          <w:szCs w:val="24"/>
+        </w:rPr>
+        <w:t xml:space="preserve">Se observa que marcas generalistas como </w:t>
+      </w:r>
+      <w:r>
+        <w:rPr>
+          <w:rFonts w:ascii="Arial" w:hAnsi="Arial" w:cs="Arial"/>
+          <w:sz w:val="24"/>
+          <w:szCs w:val="24"/>
+        </w:rPr>
+        <w:t>Kia</w:t>
+      </w:r>
+      <w:r>
+        <w:rPr>
+          <w:rFonts w:ascii="Arial" w:hAnsi="Arial" w:cs="Arial"/>
+          <w:sz w:val="24"/>
+          <w:szCs w:val="24"/>
+        </w:rPr>
+        <w:t xml:space="preserve">, </w:t>
+      </w:r>
+      <w:r>
+        <w:rPr>
+          <w:rFonts w:ascii="Arial" w:hAnsi="Arial" w:cs="Arial"/>
+          <w:sz w:val="24"/>
+          <w:szCs w:val="24"/>
+        </w:rPr>
+        <w:t>Peugeot</w:t>
+      </w:r>
+      <w:r>
+        <w:rPr>
+          <w:rFonts w:ascii="Arial" w:hAnsi="Arial" w:cs="Arial"/>
+          <w:sz w:val="24"/>
+          <w:szCs w:val="24"/>
+        </w:rPr>
+        <w:t>, Ford o Toyota concentran un mayor número de vehículos.</w:t>
+      </w:r>
+    </w:p>
+    <w:p>
+      <w:pPr>
+        <w:pStyle w:val="Prrafodelista"/>
+        <w:ind w:left="0"/>
+        <w:jc w:val="both"/>
+        <w:rPr>
+          <w:rFonts w:ascii="Arial" w:hAnsi="Arial" w:cs="Arial"/>
+          <w:sz w:val="24"/>
+          <w:szCs w:val="24"/>
+        </w:rPr>
+      </w:pPr>
+    </w:p>
+    <w:p>
+      <w:pPr>
+        <w:pStyle w:val="Prrafodelista"/>
+        <w:numPr>
+          <w:ilvl w:val="0"/>
+          <w:numId w:val="2"/>
+        </w:numPr>
+        <w:jc w:val="both"/>
+        <w:rPr>
+          <w:rFonts w:ascii="Arial" w:hAnsi="Arial" w:cs="Arial"/>
+          <w:sz w:val="24"/>
+          <w:szCs w:val="24"/>
+        </w:rPr>
+      </w:pPr>
+      <w:r>
+        <w:rPr>
+          <w:rFonts w:ascii="Arial" w:hAnsi="Arial" w:cs="Arial"/>
+          <w:sz w:val="24"/>
+          <w:szCs w:val="24"/>
+        </w:rPr>
+        <w:t xml:space="preserve">Las marcas premium (BMW, </w:t>
+      </w:r>
+      <w:r>
+        <w:rPr>
+          <w:rFonts w:ascii="Arial" w:hAnsi="Arial" w:cs="Arial"/>
+          <w:sz w:val="24"/>
+          <w:szCs w:val="24"/>
+        </w:rPr>
+        <w:t>Mercedes</w:t>
+      </w:r>
+      <w:r>
+        <w:rPr>
+          <w:rFonts w:ascii="Arial" w:hAnsi="Arial" w:cs="Arial"/>
+          <w:sz w:val="24"/>
+          <w:szCs w:val="24"/>
+        </w:rPr>
+        <w:t xml:space="preserve">, </w:t>
+      </w:r>
+      <w:r>
+        <w:rPr>
+          <w:rFonts w:ascii="Arial" w:hAnsi="Arial" w:cs="Arial"/>
+          <w:sz w:val="24"/>
+          <w:szCs w:val="24"/>
+        </w:rPr>
+        <w:t>Renault</w:t>
+      </w:r>
+      <w:r>
+        <w:rPr>
+          <w:rFonts w:ascii="Arial" w:hAnsi="Arial" w:cs="Arial"/>
+          <w:sz w:val="24"/>
+          <w:szCs w:val="24"/>
+        </w:rPr>
+        <w:t>) aparecen en menor proporción, pero siguen teniendo una presencia relevante.</w:t>
+      </w:r>
+    </w:p>
+    <w:p>
+      <w:pPr>
+        <w:pStyle w:val="Prrafodelista"/>
+        <w:ind w:left="0"/>
+        <w:jc w:val="both"/>
+        <w:rPr>
+          <w:rFonts w:ascii="Arial" w:hAnsi="Arial" w:cs="Arial"/>
+          <w:sz w:val="24"/>
+          <w:szCs w:val="24"/>
+        </w:rPr>
+      </w:pPr>
+    </w:p>
+    <w:p>
+      <w:pPr>
+        <w:pStyle w:val="Prrafodelista"/>
+        <w:numPr>
+          <w:ilvl w:val="0"/>
+          <w:numId w:val="2"/>
+        </w:numPr>
+        <w:jc w:val="both"/>
+        <w:rPr>
+          <w:rFonts w:ascii="Arial" w:hAnsi="Arial" w:cs="Arial"/>
+          <w:sz w:val="24"/>
+          <w:szCs w:val="24"/>
+        </w:rPr>
+      </w:pPr>
+      <w:r>
+        <w:rPr>
+          <w:rFonts w:ascii="Arial" w:hAnsi="Arial" w:cs="Arial"/>
+          <w:sz w:val="24"/>
+          <w:szCs w:val="24"/>
+        </w:rPr>
+        <w:t xml:space="preserve">Esta distribución es coherente con el mercado real, donde los vehículos </w:t>
+      </w:r>
+      <w:r>
+        <w:rPr>
+          <w:rFonts w:ascii="Arial" w:hAnsi="Arial" w:cs="Arial"/>
+          <w:sz w:val="24"/>
+          <w:szCs w:val="24"/>
+        </w:rPr>
+        <w:t>de las marcas más asequibles</w:t>
+      </w:r>
+      <w:r>
+        <w:rPr>
+          <w:rFonts w:ascii="Arial" w:hAnsi="Arial" w:cs="Arial"/>
+          <w:sz w:val="24"/>
+          <w:szCs w:val="24"/>
+        </w:rPr>
+        <w:t xml:space="preserve"> dominan en volumen de ventas.</w:t>
+      </w:r>
+    </w:p>
+    <w:p>
+      <w:pPr>
+        <w:pStyle w:val="Prrafodelista"/>
+        <w:jc w:val="both"/>
+        <w:rPr>
+          <w:rFonts w:ascii="Arial" w:hAnsi="Arial" w:cs="Arial"/>
+          <w:sz w:val="24"/>
+          <w:szCs w:val="24"/>
+        </w:rPr>
+      </w:pPr>
+    </w:p>
+    <w:p>
+      <w:pPr>
+        <w:pStyle w:val="Prrafodelista"/>
+        <w:ind w:left="0"/>
+        <w:jc w:val="both"/>
+        <w:rPr>
+          <w:rFonts w:ascii="Arial" w:hAnsi="Arial" w:cs="Arial"/>
+          <w:b/>
+          <w:bCs/>
+          <w:sz w:val="24"/>
+          <w:szCs w:val="24"/>
+        </w:rPr>
+      </w:pPr>
+      <w:r>
+        <w:rPr>
+          <w:rFonts w:ascii="Arial" w:hAnsi="Arial" w:cs="Arial"/>
+          <w:b/>
+          <w:bCs/>
+          <w:sz w:val="24"/>
+          <w:szCs w:val="24"/>
+        </w:rPr>
+        <w:t xml:space="preserve">Análisis de </w:t>
+      </w:r>
+      <w:r>
+        <w:rPr>
+          <w:rFonts w:ascii="Arial" w:hAnsi="Arial" w:cs="Arial"/>
+          <w:b/>
+          <w:bCs/>
+          <w:sz w:val="24"/>
+          <w:szCs w:val="24"/>
+        </w:rPr>
+        <w:t>modelo</w:t>
+      </w:r>
+    </w:p>
+    <w:p>
+      <w:pPr>
+        <w:pStyle w:val="Prrafodelista"/>
+        <w:ind w:left="0"/>
+        <w:jc w:val="both"/>
+        <w:rPr>
+          <w:rFonts w:ascii="Arial" w:hAnsi="Arial" w:cs="Arial"/>
+          <w:b/>
+          <w:bCs/>
+          <w:sz w:val="24"/>
+          <w:szCs w:val="24"/>
+        </w:rPr>
+      </w:pPr>
+      <w:r>
+        <w:rPr>
+          <w:rFonts w:ascii="Arial" w:hAnsi="Arial" w:cs="Arial"/>
+          <w:sz w:val="24"/>
+          <w:szCs w:val="24"/>
+        </w:rPr>
+        <w:drawing>
+          <wp:inline distT="0" distB="0" distL="0" distR="0" wp14:anchorId="712DDBD3" wp14:editId="54BE750D">
+            <wp:extent cx="5400040" cy="3341370"/>
+            <wp:effectExtent l="0" t="0" r="0" b="0"/>
+            <wp:docPr id="1843902610" name="Imagen 1"/>
+            <wp:cNvGraphicFramePr>
+              <a:graphicFrameLocks xmlns:a="http://schemas.openxmlformats.org/drawingml/2006/main" noChangeAspect="1"/>
+            </wp:cNvGraphicFramePr>
+            <a:graphic xmlns:a="http://schemas.openxmlformats.org/drawingml/2006/main">
+              <a:graphicData uri="http://schemas.openxmlformats.org/drawingml/2006/picture">
+                <pic:pic xmlns:pic="http://schemas.openxmlformats.org/drawingml/2006/picture">
+                  <pic:nvPicPr>
+                    <pic:cNvPr id="1843902610" name=""/>
+                    <pic:cNvPicPr/>
+                  </pic:nvPicPr>
+                  <pic:blipFill>
+                    <a:blip r:embed="rId11"/>
+                    <a:stretch>
+                      <a:fillRect/>
+                    </a:stretch>
+                  </pic:blipFill>
+                  <pic:spPr>
+                    <a:xfrm>
+                      <a:off x="0" y="0"/>
+                      <a:ext cx="5400040" cy="3341370"/>
+                    </a:xfrm>
+                    <a:prstGeom prst="rect">
+                      <a:avLst/>
+                    </a:prstGeom>
+                  </pic:spPr>
+                </pic:pic>
+              </a:graphicData>
+            </a:graphic>
+          </wp:inline>
+        </w:drawing>
+      </w:r>
+    </w:p>
+    <w:p>
+      <w:pPr>
+        <w:pStyle w:val="Prrafodelista"/>
+        <w:numPr>
+          <w:ilvl w:val="0"/>
+          <w:numId w:val="2"/>
+        </w:numPr>
+        <w:jc w:val="both"/>
+        <w:rPr>
+          <w:rFonts w:ascii="Arial" w:hAnsi="Arial" w:cs="Arial"/>
+          <w:sz w:val="24"/>
+          <w:szCs w:val="24"/>
+        </w:rPr>
+      </w:pPr>
+      <w:r>
+        <w:rPr>
+          <w:rFonts w:ascii="Arial" w:hAnsi="Arial" w:cs="Arial"/>
+          <w:sz w:val="24"/>
+          <w:szCs w:val="24"/>
+        </w:rPr>
+        <w:t>Se detecta una alta variedad de modelos, sin que uno solo monopolice el conjunto de datos</w:t>
+      </w:r>
+      <w:r>
+        <w:rPr>
+          <w:rFonts w:ascii="Arial" w:hAnsi="Arial" w:cs="Arial"/>
+          <w:sz w:val="24"/>
+          <w:szCs w:val="24"/>
+        </w:rPr>
+        <w:t>, aunque algunos predominan más que otros</w:t>
+      </w:r>
+      <w:r>
+        <w:rPr>
+          <w:rFonts w:ascii="Arial" w:hAnsi="Arial" w:cs="Arial"/>
+          <w:sz w:val="24"/>
+          <w:szCs w:val="24"/>
+        </w:rPr>
+        <w:t>.</w:t>
+      </w:r>
+    </w:p>
+    <w:p>
+      <w:pPr>
+        <w:pStyle w:val="Prrafodelista"/>
+        <w:jc w:val="both"/>
+        <w:rPr>
+          <w:rFonts w:ascii="Arial" w:hAnsi="Arial" w:cs="Arial"/>
+          <w:sz w:val="24"/>
+          <w:szCs w:val="24"/>
+        </w:rPr>
+      </w:pPr>
+    </w:p>
+    <w:p>
+      <w:pPr>
+        <w:pStyle w:val="Prrafodelista"/>
+        <w:numPr>
+          <w:ilvl w:val="0"/>
+          <w:numId w:val="2"/>
+        </w:numPr>
+        <w:jc w:val="both"/>
+        <w:rPr>
+          <w:rFonts w:ascii="Arial" w:hAnsi="Arial" w:cs="Arial"/>
+          <w:sz w:val="24"/>
+          <w:szCs w:val="24"/>
+        </w:rPr>
+      </w:pPr>
+      <w:r>
+        <w:rPr>
+          <w:rFonts w:ascii="Arial" w:hAnsi="Arial" w:cs="Arial"/>
+          <w:sz w:val="24"/>
+          <w:szCs w:val="24"/>
+        </w:rPr>
+        <w:t xml:space="preserve">Algunos modelos </w:t>
+      </w:r>
+      <w:r>
+        <w:rPr>
+          <w:rFonts w:ascii="Arial" w:hAnsi="Arial" w:cs="Arial"/>
+          <w:sz w:val="24"/>
+          <w:szCs w:val="24"/>
+        </w:rPr>
+        <w:t>más vendidos</w:t>
+      </w:r>
+      <w:r>
+        <w:rPr>
+          <w:rFonts w:ascii="Arial" w:hAnsi="Arial" w:cs="Arial"/>
+          <w:sz w:val="24"/>
+          <w:szCs w:val="24"/>
+        </w:rPr>
+        <w:t xml:space="preserve"> aparecen con mayor frecuencia, lo cual es coherente con su alta demanda en el mercado.</w:t>
+      </w:r>
+    </w:p>
+    <w:p>
+      <w:pPr>
+        <w:pStyle w:val="Prrafodelista"/>
+        <w:jc w:val="both"/>
+        <w:rPr>
+          <w:rFonts w:ascii="Arial" w:hAnsi="Arial" w:cs="Arial"/>
+          <w:sz w:val="24"/>
+          <w:szCs w:val="24"/>
+        </w:rPr>
+      </w:pPr>
+    </w:p>
+    <w:p>
+      <w:pPr>
+        <w:pStyle w:val="Prrafodelista"/>
+        <w:numPr>
+          <w:ilvl w:val="0"/>
+          <w:numId w:val="2"/>
+        </w:numPr>
+        <w:jc w:val="both"/>
+        <w:rPr>
+          <w:rFonts w:ascii="Arial" w:hAnsi="Arial" w:cs="Arial"/>
+          <w:sz w:val="24"/>
+          <w:szCs w:val="24"/>
+        </w:rPr>
+      </w:pPr>
+      <w:r>
+        <w:rPr>
+          <w:rFonts w:ascii="Arial" w:hAnsi="Arial" w:cs="Arial"/>
+          <w:sz w:val="24"/>
+          <w:szCs w:val="24"/>
+        </w:rPr>
+        <w:t>La diversidad de modelos aporta riqueza al análisis y evita conclusiones sesgadas hacia un único tipo de vehículo.</w:t>
+      </w:r>
+    </w:p>
+    <w:p>
+      <w:pPr>
+        <w:pStyle w:val="Prrafodelista"/>
+        <w:ind w:left="0"/>
+        <w:jc w:val="both"/>
+        <w:rPr>
+          <w:rFonts w:ascii="Arial" w:hAnsi="Arial" w:cs="Arial"/>
+          <w:b/>
+          <w:bCs/>
+          <w:sz w:val="24"/>
+          <w:szCs w:val="24"/>
+        </w:rPr>
+      </w:pPr>
+    </w:p>
+    <w:p>
+      <w:pPr>
+        <w:pStyle w:val="Prrafodelista"/>
+        <w:ind w:left="0"/>
+        <w:jc w:val="both"/>
+        <w:rPr>
+          <w:rFonts w:ascii="Arial" w:hAnsi="Arial" w:cs="Arial"/>
+          <w:b/>
+          <w:bCs/>
+          <w:sz w:val="24"/>
+          <w:szCs w:val="24"/>
+        </w:rPr>
+      </w:pPr>
+      <w:r>
+        <w:rPr>
+          <w:rFonts w:ascii="Arial" w:hAnsi="Arial" w:cs="Arial"/>
+          <w:b/>
+          <w:bCs/>
+          <w:sz w:val="24"/>
+          <w:szCs w:val="24"/>
+        </w:rPr>
+        <w:t xml:space="preserve">Análisis de </w:t>
+      </w:r>
+      <w:r>
+        <w:rPr>
+          <w:rFonts w:ascii="Arial" w:hAnsi="Arial" w:cs="Arial"/>
+          <w:b/>
+          <w:bCs/>
+          <w:sz w:val="24"/>
+          <w:szCs w:val="24"/>
+        </w:rPr>
+        <w:t>segmento</w:t>
+      </w:r>
+    </w:p>
+    <w:p>
+      <w:pPr>
+        <w:pStyle w:val="Prrafodelista"/>
+        <w:jc w:val="both"/>
+        <w:rPr>
+          <w:rFonts w:ascii="Arial" w:hAnsi="Arial" w:cs="Arial"/>
+          <w:sz w:val="24"/>
+          <w:szCs w:val="24"/>
+        </w:rPr>
+      </w:pPr>
+      <w:r>
+        <w:rPr>
+          <w:rFonts w:ascii="Arial" w:hAnsi="Arial" w:cs="Arial"/>
+          <w:sz w:val="24"/>
+          <w:szCs w:val="24"/>
+        </w:rPr>
+        <w:drawing>
+          <wp:inline distT="0" distB="0" distL="0" distR="0" wp14:anchorId="13028AE2" wp14:editId="4310009F">
+            <wp:extent cx="5400040" cy="3223260"/>
+            <wp:effectExtent l="0" t="0" r="0" b="0"/>
+            <wp:docPr id="792466080" name="Imagen 1"/>
+            <wp:cNvGraphicFramePr>
+              <a:graphicFrameLocks xmlns:a="http://schemas.openxmlformats.org/drawingml/2006/main" noChangeAspect="1"/>
+            </wp:cNvGraphicFramePr>
+            <a:graphic xmlns:a="http://schemas.openxmlformats.org/drawingml/2006/main">
+              <a:graphicData uri="http://schemas.openxmlformats.org/drawingml/2006/picture">
+                <pic:pic xmlns:pic="http://schemas.openxmlformats.org/drawingml/2006/picture">
+                  <pic:nvPicPr>
+                    <pic:cNvPr id="792466080" name=""/>
+                    <pic:cNvPicPr/>
+                  </pic:nvPicPr>
+                  <pic:blipFill>
+                    <a:blip r:embed="rId12"/>
+                    <a:stretch>
+                      <a:fillRect/>
+                    </a:stretch>
+                  </pic:blipFill>
+                  <pic:spPr>
+                    <a:xfrm>
+                      <a:off x="0" y="0"/>
+                      <a:ext cx="5400040" cy="3223260"/>
+                    </a:xfrm>
+                    <a:prstGeom prst="rect">
+                      <a:avLst/>
+                    </a:prstGeom>
+                  </pic:spPr>
+                </pic:pic>
+              </a:graphicData>
+            </a:graphic>
+          </wp:inline>
+        </w:drawing>
+      </w:r>
+    </w:p>
+    <w:p>
+      <w:pPr>
+        <w:pStyle w:val="Prrafodelista"/>
+        <w:numPr>
+          <w:ilvl w:val="0"/>
+          <w:numId w:val="2"/>
+        </w:numPr>
+        <w:jc w:val="both"/>
+        <w:rPr>
+          <w:rFonts w:ascii="Arial" w:hAnsi="Arial" w:cs="Arial"/>
+          <w:sz w:val="24"/>
+          <w:szCs w:val="24"/>
+        </w:rPr>
+      </w:pPr>
+      <w:r>
+        <w:rPr>
+          <w:rFonts w:ascii="Arial" w:hAnsi="Arial" w:cs="Arial"/>
+          <w:sz w:val="24"/>
+          <w:szCs w:val="24"/>
+        </w:rPr>
+        <w:t>Los vehículos Sedán y compacto tienen los precios más altos registrados</w:t>
+      </w:r>
+    </w:p>
+    <w:p>
+      <w:pPr>
+        <w:pStyle w:val="Prrafodelista"/>
+        <w:jc w:val="both"/>
+        <w:rPr>
+          <w:rFonts w:ascii="Arial" w:hAnsi="Arial" w:cs="Arial"/>
+          <w:sz w:val="24"/>
+          <w:szCs w:val="24"/>
+        </w:rPr>
+      </w:pPr>
+    </w:p>
+    <w:p>
+      <w:pPr>
+        <w:pStyle w:val="Prrafodelista"/>
+        <w:numPr>
+          <w:ilvl w:val="0"/>
+          <w:numId w:val="2"/>
+        </w:numPr>
+        <w:jc w:val="both"/>
+        <w:rPr>
+          <w:rFonts w:ascii="Arial" w:hAnsi="Arial" w:cs="Arial"/>
+          <w:sz w:val="24"/>
+          <w:szCs w:val="24"/>
+        </w:rPr>
+      </w:pPr>
+      <w:r>
+        <w:rPr>
+          <w:rFonts w:ascii="Arial" w:hAnsi="Arial" w:cs="Arial"/>
+          <w:sz w:val="24"/>
+          <w:szCs w:val="24"/>
+        </w:rPr>
+        <w:t>También se puede observar los valores de venta medios de cada segmento</w:t>
+      </w:r>
+    </w:p>
+    <w:p>
+      <w:pPr>
+        <w:pStyle w:val="Prrafodelista"/>
+        <w:jc w:val="both"/>
+        <w:rPr>
+          <w:rFonts w:ascii="Arial" w:hAnsi="Arial" w:cs="Arial"/>
+          <w:sz w:val="24"/>
+          <w:szCs w:val="24"/>
+        </w:rPr>
+      </w:pPr>
+    </w:p>
+    <w:p>
+      <w:pPr>
+        <w:pStyle w:val="Prrafodelista"/>
+        <w:numPr>
+          <w:ilvl w:val="0"/>
+          <w:numId w:val="2"/>
+        </w:numPr>
+        <w:jc w:val="both"/>
+        <w:rPr>
+          <w:rFonts w:ascii="Arial" w:hAnsi="Arial" w:cs="Arial"/>
+          <w:sz w:val="24"/>
+          <w:szCs w:val="24"/>
+        </w:rPr>
+      </w:pPr>
+      <w:r>
+        <w:rPr>
+          <w:rFonts w:ascii="Arial" w:hAnsi="Arial" w:cs="Arial"/>
+          <w:sz w:val="24"/>
+          <w:szCs w:val="24"/>
+        </w:rPr>
+        <w:t xml:space="preserve">Los vehículos SUV tienen una gran cantidad de </w:t>
+      </w:r>
+      <w:r>
+        <w:rPr>
+          <w:rFonts w:ascii="Arial" w:hAnsi="Arial" w:cs="Arial"/>
+          <w:sz w:val="24"/>
+          <w:szCs w:val="24"/>
+        </w:rPr>
+        <w:t>outliers</w:t>
+      </w:r>
+      <w:r>
+        <w:rPr>
+          <w:rFonts w:ascii="Arial" w:hAnsi="Arial" w:cs="Arial"/>
+          <w:sz w:val="24"/>
+          <w:szCs w:val="24"/>
+        </w:rPr>
+        <w:t xml:space="preserve"> en cuanto a sus precios de venta</w:t>
+      </w:r>
+    </w:p>
+    <w:p>
+      <w:pPr>
+        <w:pStyle w:val="Prrafodelista"/>
+        <w:jc w:val="both"/>
+        <w:rPr>
+          <w:rFonts w:ascii="Arial" w:hAnsi="Arial" w:cs="Arial"/>
+          <w:sz w:val="24"/>
+          <w:szCs w:val="24"/>
+        </w:rPr>
+      </w:pPr>
+    </w:p>
+    <w:p>
+      <w:pPr>
+        <w:pStyle w:val="Prrafodelista"/>
+        <w:ind w:left="0"/>
+        <w:jc w:val="both"/>
+        <w:rPr>
+          <w:rFonts w:ascii="Arial" w:hAnsi="Arial" w:cs="Arial"/>
+          <w:sz w:val="24"/>
+          <w:szCs w:val="24"/>
+        </w:rPr>
+      </w:pPr>
+    </w:p>
+    <w:p>
+      <w:pPr>
+        <w:pStyle w:val="Prrafodelista"/>
+        <w:numPr>
+          <w:ilvl w:val="0"/>
+          <w:numId w:val="6"/>
+        </w:numPr>
+        <w:jc w:val="both"/>
+        <w:rPr>
+          <w:rFonts w:ascii="Arial" w:hAnsi="Arial" w:cs="Arial"/>
+          <w:sz w:val="24"/>
+          <w:szCs w:val="24"/>
+        </w:rPr>
+      </w:pPr>
+      <w:r>
+        <w:rPr>
+          <w:rFonts w:ascii="Arial" w:hAnsi="Arial" w:cs="Arial"/>
+          <w:sz w:val="24"/>
+          <w:szCs w:val="24"/>
+        </w:rPr>
+        <w:t>Identificar relaciones entre caracter</w:t>
+      </w:r>
+      <w:r>
+        <w:rPr>
+          <w:rFonts w:ascii="Arial" w:hAnsi="Arial" w:cs="Arial"/>
+          <w:sz w:val="24"/>
+          <w:szCs w:val="24"/>
+        </w:rPr>
+        <w:t>í</w:t>
+      </w:r>
+      <w:r>
+        <w:rPr>
+          <w:rFonts w:ascii="Arial" w:hAnsi="Arial" w:cs="Arial"/>
+          <w:sz w:val="24"/>
+          <w:szCs w:val="24"/>
+        </w:rPr>
+        <w:t xml:space="preserve">sticas </w:t>
+      </w:r>
+      <w:r>
+        <w:rPr>
+          <w:rFonts w:ascii="Arial" w:hAnsi="Arial" w:cs="Arial"/>
+          <w:sz w:val="24"/>
+          <w:szCs w:val="24"/>
+        </w:rPr>
+        <w:t>técnicas</w:t>
+      </w:r>
+      <w:r>
+        <w:rPr>
+          <w:rFonts w:ascii="Arial" w:hAnsi="Arial" w:cs="Arial"/>
+          <w:sz w:val="24"/>
+          <w:szCs w:val="24"/>
+        </w:rPr>
+        <w:t xml:space="preserve"> y precios</w:t>
+      </w:r>
+    </w:p>
+    <w:p>
+      <w:pPr>
+        <w:pStyle w:val="Prrafodelista"/>
+        <w:ind w:left="0"/>
+        <w:jc w:val="both"/>
+        <w:rPr>
+          <w:rFonts w:ascii="Arial" w:hAnsi="Arial" w:cs="Arial"/>
+          <w:sz w:val="24"/>
+          <w:szCs w:val="24"/>
+        </w:rPr>
+      </w:pPr>
+    </w:p>
+    <w:p>
+      <w:pPr>
+        <w:pStyle w:val="Prrafodelista"/>
+        <w:ind w:left="0"/>
+        <w:jc w:val="both"/>
+        <w:rPr>
+          <w:rFonts w:ascii="Arial" w:hAnsi="Arial" w:cs="Arial"/>
+          <w:sz w:val="24"/>
+          <w:szCs w:val="24"/>
+        </w:rPr>
+      </w:pPr>
+      <w:r>
+        <w:rPr>
+          <w:rFonts w:ascii="Arial" w:hAnsi="Arial" w:cs="Arial"/>
+          <w:sz w:val="24"/>
+          <w:szCs w:val="24"/>
+        </w:rPr>
+        <w:t>Para este análisis se han seleccionado las siguientes variables técnicas y económicas:</w:t>
+      </w:r>
+    </w:p>
+    <w:p>
+      <w:pPr>
+        <w:pStyle w:val="Prrafodelista"/>
+        <w:ind w:left="0"/>
+        <w:jc w:val="both"/>
+        <w:rPr>
+          <w:rFonts w:ascii="Arial" w:hAnsi="Arial" w:cs="Arial"/>
+          <w:sz w:val="24"/>
+          <w:szCs w:val="24"/>
+        </w:rPr>
+      </w:pPr>
+    </w:p>
+    <w:p>
+      <w:pPr>
+        <w:pStyle w:val="Prrafodelista"/>
+        <w:numPr>
+          <w:ilvl w:val="0"/>
+          <w:numId w:val="2"/>
+        </w:numPr>
+        <w:jc w:val="both"/>
+        <w:rPr>
+          <w:rFonts w:ascii="Arial" w:hAnsi="Arial" w:cs="Arial"/>
+          <w:sz w:val="24"/>
+          <w:szCs w:val="24"/>
+        </w:rPr>
+      </w:pPr>
+      <w:r>
+        <w:rPr>
+          <w:rFonts w:ascii="Arial" w:hAnsi="Arial" w:cs="Arial"/>
+          <w:sz w:val="24"/>
+          <w:szCs w:val="24"/>
+        </w:rPr>
+        <w:t>potencia_cv</w:t>
+      </w:r>
+    </w:p>
+    <w:p>
+      <w:pPr>
+        <w:pStyle w:val="Prrafodelista"/>
+        <w:numPr>
+          <w:ilvl w:val="0"/>
+          <w:numId w:val="2"/>
+        </w:numPr>
+        <w:jc w:val="both"/>
+        <w:rPr>
+          <w:rFonts w:ascii="Arial" w:hAnsi="Arial" w:cs="Arial"/>
+          <w:sz w:val="24"/>
+          <w:szCs w:val="24"/>
+        </w:rPr>
+      </w:pPr>
+      <w:r>
+        <w:rPr>
+          <w:rFonts w:ascii="Arial" w:hAnsi="Arial" w:cs="Arial"/>
+          <w:sz w:val="24"/>
+          <w:szCs w:val="24"/>
+        </w:rPr>
+        <w:t>cilindrada</w:t>
+      </w:r>
+    </w:p>
+    <w:p>
+      <w:pPr>
+        <w:pStyle w:val="Prrafodelista"/>
+        <w:numPr>
+          <w:ilvl w:val="0"/>
+          <w:numId w:val="2"/>
+        </w:numPr>
+        <w:jc w:val="both"/>
+        <w:rPr>
+          <w:rFonts w:ascii="Arial" w:hAnsi="Arial" w:cs="Arial"/>
+          <w:sz w:val="24"/>
+          <w:szCs w:val="24"/>
+        </w:rPr>
+      </w:pPr>
+      <w:r>
+        <w:rPr>
+          <w:rFonts w:ascii="Arial" w:hAnsi="Arial" w:cs="Arial"/>
+          <w:sz w:val="24"/>
+          <w:szCs w:val="24"/>
+        </w:rPr>
+        <w:t>consumo_urbano</w:t>
+      </w:r>
+    </w:p>
+    <w:p>
+      <w:pPr>
+        <w:pStyle w:val="Prrafodelista"/>
+        <w:numPr>
+          <w:ilvl w:val="0"/>
+          <w:numId w:val="2"/>
+        </w:numPr>
+        <w:jc w:val="both"/>
+        <w:rPr>
+          <w:rFonts w:ascii="Arial" w:hAnsi="Arial" w:cs="Arial"/>
+          <w:sz w:val="24"/>
+          <w:szCs w:val="24"/>
+        </w:rPr>
+      </w:pPr>
+      <w:r>
+        <w:rPr>
+          <w:rFonts w:ascii="Arial" w:hAnsi="Arial" w:cs="Arial"/>
+          <w:sz w:val="24"/>
+          <w:szCs w:val="24"/>
+        </w:rPr>
+        <w:t>consumo_extraurbano</w:t>
+      </w:r>
+    </w:p>
+    <w:p>
+      <w:pPr>
+        <w:pStyle w:val="Prrafodelista"/>
+        <w:numPr>
+          <w:ilvl w:val="0"/>
+          <w:numId w:val="2"/>
+        </w:numPr>
+        <w:jc w:val="both"/>
+        <w:rPr>
+          <w:rFonts w:ascii="Arial" w:hAnsi="Arial" w:cs="Arial"/>
+          <w:sz w:val="24"/>
+          <w:szCs w:val="24"/>
+        </w:rPr>
+      </w:pPr>
+      <w:r>
+        <w:rPr>
+          <w:rFonts w:ascii="Arial" w:hAnsi="Arial" w:cs="Arial"/>
+          <w:sz w:val="24"/>
+          <w:szCs w:val="24"/>
+        </w:rPr>
+        <w:t>emisiones_co2</w:t>
+      </w:r>
+    </w:p>
+    <w:p>
+      <w:pPr>
+        <w:pStyle w:val="Prrafodelista"/>
+        <w:numPr>
+          <w:ilvl w:val="0"/>
+          <w:numId w:val="2"/>
+        </w:numPr>
+        <w:jc w:val="both"/>
+        <w:rPr>
+          <w:rFonts w:ascii="Arial" w:hAnsi="Arial" w:cs="Arial"/>
+          <w:sz w:val="24"/>
+          <w:szCs w:val="24"/>
+        </w:rPr>
+      </w:pPr>
+      <w:r>
+        <w:rPr>
+          <w:rFonts w:ascii="Arial" w:hAnsi="Arial" w:cs="Arial"/>
+          <w:sz w:val="24"/>
+          <w:szCs w:val="24"/>
+        </w:rPr>
+        <w:t>precio_base</w:t>
+      </w:r>
+    </w:p>
+    <w:p>
+      <w:pPr>
+        <w:pStyle w:val="Prrafodelista"/>
+        <w:ind w:left="0"/>
+        <w:jc w:val="both"/>
+        <w:rPr>
+          <w:rFonts w:ascii="Arial" w:hAnsi="Arial" w:cs="Arial"/>
+          <w:sz w:val="24"/>
+          <w:szCs w:val="24"/>
+        </w:rPr>
+      </w:pPr>
+    </w:p>
+    <w:p>
+      <w:pPr>
+        <w:pStyle w:val="Prrafodelista"/>
+        <w:ind w:left="0"/>
+        <w:jc w:val="both"/>
+        <w:rPr>
+          <w:rFonts w:ascii="Arial" w:hAnsi="Arial" w:cs="Arial"/>
+          <w:sz w:val="24"/>
+          <w:szCs w:val="24"/>
+        </w:rPr>
+      </w:pPr>
+      <w:r>
+        <w:rPr>
+          <w:rFonts w:ascii="Arial" w:hAnsi="Arial" w:cs="Arial"/>
+          <w:sz w:val="24"/>
+          <w:szCs w:val="24"/>
+        </w:rPr>
+        <w:t>Estas variables se han elegido porque representan:</w:t>
+      </w:r>
+    </w:p>
+    <w:p>
+      <w:pPr>
+        <w:pStyle w:val="Prrafodelista"/>
+        <w:ind w:left="0"/>
+        <w:jc w:val="both"/>
+        <w:rPr>
+          <w:rFonts w:ascii="Arial" w:hAnsi="Arial" w:cs="Arial"/>
+          <w:sz w:val="24"/>
+          <w:szCs w:val="24"/>
+        </w:rPr>
+      </w:pPr>
+    </w:p>
+    <w:p>
+      <w:pPr>
+        <w:pStyle w:val="Prrafodelista"/>
+        <w:numPr>
+          <w:ilvl w:val="0"/>
+          <w:numId w:val="2"/>
+        </w:numPr>
+        <w:jc w:val="both"/>
+        <w:rPr>
+          <w:rFonts w:ascii="Arial" w:hAnsi="Arial" w:cs="Arial"/>
+          <w:sz w:val="24"/>
+          <w:szCs w:val="24"/>
+        </w:rPr>
+      </w:pPr>
+      <w:r>
+        <w:rPr>
+          <w:rFonts w:ascii="Arial" w:hAnsi="Arial" w:cs="Arial"/>
+          <w:sz w:val="24"/>
+          <w:szCs w:val="24"/>
+        </w:rPr>
+        <w:t>Prestaciones del vehículo (potencia, cilindrada)</w:t>
+      </w:r>
+    </w:p>
+    <w:p>
+      <w:pPr>
+        <w:pStyle w:val="Prrafodelista"/>
+        <w:ind w:left="0"/>
+        <w:jc w:val="both"/>
+        <w:rPr>
+          <w:rFonts w:ascii="Arial" w:hAnsi="Arial" w:cs="Arial"/>
+          <w:sz w:val="24"/>
+          <w:szCs w:val="24"/>
+        </w:rPr>
+      </w:pPr>
+    </w:p>
+    <w:p>
+      <w:pPr>
+        <w:pStyle w:val="Prrafodelista"/>
+        <w:numPr>
+          <w:ilvl w:val="0"/>
+          <w:numId w:val="2"/>
+        </w:numPr>
+        <w:jc w:val="both"/>
+        <w:rPr>
+          <w:rFonts w:ascii="Arial" w:hAnsi="Arial" w:cs="Arial"/>
+          <w:sz w:val="24"/>
+          <w:szCs w:val="24"/>
+        </w:rPr>
+      </w:pPr>
+      <w:r>
+        <w:rPr>
+          <w:rFonts w:ascii="Arial" w:hAnsi="Arial" w:cs="Arial"/>
+          <w:sz w:val="24"/>
+          <w:szCs w:val="24"/>
+        </w:rPr>
+        <w:t>Eficiencia y sostenibilidad (consumos y emisiones)</w:t>
+      </w:r>
+    </w:p>
+    <w:p>
+      <w:pPr>
+        <w:pStyle w:val="Prrafodelista"/>
+        <w:ind w:left="0"/>
+        <w:jc w:val="both"/>
+        <w:rPr>
+          <w:rFonts w:ascii="Arial" w:hAnsi="Arial" w:cs="Arial"/>
+          <w:sz w:val="24"/>
+          <w:szCs w:val="24"/>
+        </w:rPr>
+      </w:pPr>
+    </w:p>
+    <w:p>
+      <w:pPr>
+        <w:pStyle w:val="Prrafodelista"/>
+        <w:ind w:left="0"/>
+        <w:jc w:val="both"/>
+        <w:rPr>
+          <w:rFonts w:ascii="Arial" w:hAnsi="Arial" w:cs="Arial"/>
+          <w:sz w:val="24"/>
+          <w:szCs w:val="24"/>
+        </w:rPr>
+      </w:pPr>
+      <w:r>
+        <w:rPr>
+          <w:rFonts w:ascii="Arial" w:hAnsi="Arial" w:cs="Arial"/>
+          <w:sz w:val="24"/>
+          <w:szCs w:val="24"/>
+        </w:rPr>
+        <w:t>Se calcula la matriz de correlación entre las variables seleccionadas con el fin de identificar relaciones lineales entre características técnicas y precio.</w:t>
+      </w:r>
+    </w:p>
+    <w:p>
+      <w:pPr>
+        <w:pStyle w:val="Prrafodelista"/>
+        <w:ind w:left="0"/>
+        <w:jc w:val="both"/>
+        <w:rPr>
+          <w:rFonts w:ascii="Arial" w:hAnsi="Arial" w:cs="Arial"/>
+          <w:sz w:val="24"/>
+          <w:szCs w:val="24"/>
+        </w:rPr>
+      </w:pPr>
+      <w:r>
+        <w:rPr>
+          <w:rFonts w:ascii="Arial" w:hAnsi="Arial" w:cs="Arial"/>
+          <w:sz w:val="24"/>
+          <w:szCs w:val="24"/>
+        </w:rPr>
+        <w:drawing>
+          <wp:inline distT="0" distB="0" distL="0" distR="0" wp14:anchorId="3FA17B7C" wp14:editId="152E020C">
+            <wp:extent cx="5400040" cy="4980940"/>
+            <wp:effectExtent l="0" t="0" r="0" b="0"/>
+            <wp:docPr id="1829220382" name="Imagen 1"/>
+            <wp:cNvGraphicFramePr>
+              <a:graphicFrameLocks xmlns:a="http://schemas.openxmlformats.org/drawingml/2006/main" noChangeAspect="1"/>
+            </wp:cNvGraphicFramePr>
+            <a:graphic xmlns:a="http://schemas.openxmlformats.org/drawingml/2006/main">
+              <a:graphicData uri="http://schemas.openxmlformats.org/drawingml/2006/picture">
+                <pic:pic xmlns:pic="http://schemas.openxmlformats.org/drawingml/2006/picture">
+                  <pic:nvPicPr>
+                    <pic:cNvPr id="1829220382" name=""/>
+                    <pic:cNvPicPr/>
+                  </pic:nvPicPr>
+                  <pic:blipFill>
+                    <a:blip r:embed="rId13"/>
+                    <a:stretch>
+                      <a:fillRect/>
+                    </a:stretch>
+                  </pic:blipFill>
+                  <pic:spPr>
+                    <a:xfrm>
+                      <a:off x="0" y="0"/>
+                      <a:ext cx="5400040" cy="4980940"/>
+                    </a:xfrm>
+                    <a:prstGeom prst="rect">
+                      <a:avLst/>
+                    </a:prstGeom>
+                  </pic:spPr>
+                </pic:pic>
+              </a:graphicData>
+            </a:graphic>
+          </wp:inline>
+        </w:drawing>
+      </w:r>
+    </w:p>
+    <w:p>
+      <w:pPr>
+        <w:pStyle w:val="Prrafodelista"/>
+        <w:numPr>
+          <w:ilvl w:val="0"/>
+          <w:numId w:val="2"/>
+        </w:numPr>
+        <w:jc w:val="both"/>
+        <w:rPr>
+          <w:rFonts w:ascii="Arial" w:hAnsi="Arial" w:cs="Arial"/>
+          <w:sz w:val="24"/>
+          <w:szCs w:val="24"/>
+        </w:rPr>
+      </w:pPr>
+      <w:r>
+        <w:rPr>
+          <w:rFonts w:ascii="Arial" w:hAnsi="Arial" w:cs="Arial"/>
+          <w:sz w:val="24"/>
+          <w:szCs w:val="24"/>
+        </w:rPr>
+        <w:t>Relaccion fuerte entre: potencia_cv y precio_base (0.84)</w:t>
+      </w:r>
+    </w:p>
+    <w:p>
+      <w:pPr>
+        <w:pStyle w:val="Prrafodelista"/>
+        <w:ind w:left="0"/>
+        <w:jc w:val="both"/>
+        <w:rPr>
+          <w:rFonts w:ascii="Arial" w:hAnsi="Arial" w:cs="Arial"/>
+          <w:sz w:val="24"/>
+          <w:szCs w:val="24"/>
+        </w:rPr>
+      </w:pPr>
+      <w:r>
+        <w:rPr>
+          <w:rFonts w:ascii="Arial" w:hAnsi="Arial" w:cs="Arial"/>
+          <w:sz w:val="24"/>
+          <w:szCs w:val="24"/>
+        </w:rPr>
+        <w:t xml:space="preserve">Los vehículos con mayor potencia tienden a presentar precios base más elevados, lo que indica que las </w:t>
+      </w:r>
+      <w:r>
+        <w:rPr>
+          <w:rFonts w:ascii="Arial" w:hAnsi="Arial" w:cs="Arial"/>
+          <w:sz w:val="24"/>
+          <w:szCs w:val="24"/>
+        </w:rPr>
+        <w:t>caracteristicas</w:t>
+      </w:r>
+      <w:r>
+        <w:rPr>
+          <w:rFonts w:ascii="Arial" w:hAnsi="Arial" w:cs="Arial"/>
+          <w:sz w:val="24"/>
+          <w:szCs w:val="24"/>
+        </w:rPr>
+        <w:t xml:space="preserve"> del motor son un factor determinante en el valor del vehículo.</w:t>
+      </w:r>
+    </w:p>
+    <w:p>
+      <w:pPr>
+        <w:pStyle w:val="Prrafodelista"/>
+        <w:ind w:left="0"/>
+        <w:jc w:val="both"/>
+        <w:rPr>
+          <w:rFonts w:ascii="Arial" w:hAnsi="Arial" w:cs="Arial"/>
+          <w:sz w:val="24"/>
+          <w:szCs w:val="24"/>
+        </w:rPr>
+      </w:pPr>
+    </w:p>
+    <w:p>
+      <w:pPr>
+        <w:pStyle w:val="Prrafodelista"/>
+        <w:numPr>
+          <w:ilvl w:val="0"/>
+          <w:numId w:val="2"/>
+        </w:numPr>
+        <w:jc w:val="both"/>
+        <w:rPr>
+          <w:rFonts w:ascii="Arial" w:hAnsi="Arial" w:cs="Arial"/>
+          <w:sz w:val="24"/>
+          <w:szCs w:val="24"/>
+        </w:rPr>
+      </w:pPr>
+      <w:r>
+        <w:rPr>
+          <w:rFonts w:ascii="Arial" w:hAnsi="Arial" w:cs="Arial"/>
+          <w:sz w:val="24"/>
+          <w:szCs w:val="24"/>
+        </w:rPr>
+        <w:t>Relaccion negativa entre: cilindrada y precio_base (-0.67)</w:t>
+      </w:r>
+    </w:p>
+    <w:p>
+      <w:pPr>
+        <w:pStyle w:val="Prrafodelista"/>
+        <w:ind w:left="0"/>
+        <w:jc w:val="both"/>
+        <w:rPr>
+          <w:rFonts w:ascii="Arial" w:hAnsi="Arial" w:cs="Arial"/>
+          <w:sz w:val="24"/>
+          <w:szCs w:val="24"/>
+        </w:rPr>
+      </w:pPr>
+      <w:r>
+        <w:rPr>
+          <w:rFonts w:ascii="Arial" w:hAnsi="Arial" w:cs="Arial"/>
+          <w:sz w:val="24"/>
+          <w:szCs w:val="24"/>
+        </w:rPr>
+        <w:t>Una mayor cilindrada no implica necesariamente un mayor precio base.</w:t>
+      </w:r>
+    </w:p>
+    <w:p>
+      <w:pPr>
+        <w:pStyle w:val="Prrafodelista"/>
+        <w:ind w:left="0"/>
+        <w:jc w:val="both"/>
+        <w:rPr>
+          <w:rFonts w:ascii="Arial" w:hAnsi="Arial" w:cs="Arial"/>
+          <w:sz w:val="24"/>
+          <w:szCs w:val="24"/>
+        </w:rPr>
+      </w:pPr>
+    </w:p>
+    <w:p>
+      <w:pPr>
+        <w:pStyle w:val="Prrafodelista"/>
+        <w:numPr>
+          <w:ilvl w:val="0"/>
+          <w:numId w:val="2"/>
+        </w:numPr>
+        <w:jc w:val="both"/>
+        <w:rPr>
+          <w:rFonts w:ascii="Arial" w:hAnsi="Arial" w:cs="Arial"/>
+          <w:sz w:val="24"/>
+          <w:szCs w:val="24"/>
+        </w:rPr>
+      </w:pPr>
+      <w:r>
+        <w:rPr>
+          <w:rFonts w:ascii="Arial" w:hAnsi="Arial" w:cs="Arial"/>
+          <w:sz w:val="24"/>
+          <w:szCs w:val="24"/>
+        </w:rPr>
+        <w:t>Relaccion negativa entre: cilindrada y precio_base (-0.67)</w:t>
+      </w:r>
+    </w:p>
+    <w:p>
+      <w:pPr>
+        <w:pStyle w:val="Prrafodelista"/>
+        <w:ind w:left="0"/>
+        <w:jc w:val="both"/>
+        <w:rPr>
+          <w:rFonts w:ascii="Arial" w:hAnsi="Arial" w:cs="Arial"/>
+          <w:sz w:val="24"/>
+          <w:szCs w:val="24"/>
+        </w:rPr>
+      </w:pPr>
+      <w:r>
+        <w:rPr>
+          <w:rFonts w:ascii="Arial" w:hAnsi="Arial" w:cs="Arial"/>
+          <w:sz w:val="24"/>
+          <w:szCs w:val="24"/>
+        </w:rPr>
+        <w:t>Una mayor cilindrada no implica necesariamente un mayor precio base.</w:t>
+      </w:r>
+    </w:p>
+    <w:p>
+      <w:pPr>
+        <w:pStyle w:val="Prrafodelista"/>
+        <w:ind w:left="0"/>
+        <w:jc w:val="both"/>
+        <w:rPr>
+          <w:rFonts w:ascii="Arial" w:hAnsi="Arial" w:cs="Arial"/>
+          <w:sz w:val="24"/>
+          <w:szCs w:val="24"/>
+        </w:rPr>
+      </w:pPr>
+    </w:p>
+    <w:p>
+      <w:pPr>
+        <w:pStyle w:val="Prrafodelista"/>
+        <w:numPr>
+          <w:ilvl w:val="0"/>
+          <w:numId w:val="2"/>
+        </w:numPr>
+        <w:jc w:val="both"/>
+        <w:rPr>
+          <w:rFonts w:ascii="Arial" w:hAnsi="Arial" w:cs="Arial"/>
+          <w:sz w:val="24"/>
+          <w:szCs w:val="24"/>
+        </w:rPr>
+      </w:pPr>
+      <w:r>
+        <w:rPr>
+          <w:rFonts w:ascii="Arial" w:hAnsi="Arial" w:cs="Arial"/>
+          <w:sz w:val="24"/>
+          <w:szCs w:val="24"/>
+        </w:rPr>
+        <w:t>Relaccion negativa entre: Precio base y consumo_urbano (-0.61)</w:t>
+      </w:r>
+    </w:p>
+    <w:p>
+      <w:pPr>
+        <w:pStyle w:val="Prrafodelista"/>
+        <w:numPr>
+          <w:ilvl w:val="0"/>
+          <w:numId w:val="2"/>
+        </w:numPr>
+        <w:jc w:val="both"/>
+        <w:rPr>
+          <w:rFonts w:ascii="Arial" w:hAnsi="Arial" w:cs="Arial"/>
+          <w:sz w:val="24"/>
+          <w:szCs w:val="24"/>
+        </w:rPr>
+      </w:pPr>
+      <w:r>
+        <w:rPr>
+          <w:rFonts w:ascii="Arial" w:hAnsi="Arial" w:cs="Arial"/>
+          <w:sz w:val="24"/>
+          <w:szCs w:val="24"/>
+        </w:rPr>
+        <w:t>Relaccion negativa entre: Precio base y consumo_extraurbano (-0.59)</w:t>
+      </w:r>
+    </w:p>
+    <w:p>
+      <w:pPr>
+        <w:pStyle w:val="Prrafodelista"/>
+        <w:ind w:left="0"/>
+        <w:jc w:val="both"/>
+        <w:rPr>
+          <w:rFonts w:ascii="Arial" w:hAnsi="Arial" w:cs="Arial"/>
+          <w:sz w:val="24"/>
+          <w:szCs w:val="24"/>
+        </w:rPr>
+      </w:pPr>
+      <w:r>
+        <w:rPr>
+          <w:rFonts w:ascii="Arial" w:hAnsi="Arial" w:cs="Arial"/>
+          <w:sz w:val="24"/>
+          <w:szCs w:val="24"/>
+        </w:rPr>
+        <w:t>Los vehículos con menores consumos tienden a tener precios base más altos.</w:t>
+      </w:r>
+    </w:p>
+    <w:p>
+      <w:pPr>
+        <w:pStyle w:val="Prrafodelista"/>
+        <w:ind w:left="0"/>
+        <w:jc w:val="both"/>
+        <w:rPr>
+          <w:rFonts w:ascii="Arial" w:hAnsi="Arial" w:cs="Arial"/>
+          <w:sz w:val="24"/>
+          <w:szCs w:val="24"/>
+        </w:rPr>
+      </w:pPr>
+    </w:p>
+    <w:p>
+      <w:pPr>
+        <w:pStyle w:val="Prrafodelista"/>
+        <w:numPr>
+          <w:ilvl w:val="0"/>
+          <w:numId w:val="2"/>
+        </w:numPr>
+        <w:jc w:val="both"/>
+        <w:rPr>
+          <w:rFonts w:ascii="Arial" w:hAnsi="Arial" w:cs="Arial"/>
+          <w:sz w:val="24"/>
+          <w:szCs w:val="24"/>
+        </w:rPr>
+      </w:pPr>
+      <w:r>
+        <w:rPr>
+          <w:rFonts w:ascii="Arial" w:hAnsi="Arial" w:cs="Arial"/>
+          <w:sz w:val="24"/>
+          <w:szCs w:val="24"/>
+        </w:rPr>
+        <w:t>Relaccion negativa entre: emisiones_co2 y precio_base (-0.73)</w:t>
+      </w:r>
+    </w:p>
+    <w:p>
+      <w:pPr>
+        <w:pStyle w:val="Prrafodelista"/>
+        <w:ind w:left="0"/>
+        <w:jc w:val="both"/>
+        <w:rPr>
+          <w:rFonts w:ascii="Arial" w:hAnsi="Arial" w:cs="Arial"/>
+          <w:sz w:val="24"/>
+          <w:szCs w:val="24"/>
+        </w:rPr>
+      </w:pPr>
+      <w:r>
+        <w:rPr>
+          <w:rFonts w:ascii="Arial" w:hAnsi="Arial" w:cs="Arial"/>
+          <w:sz w:val="24"/>
+          <w:szCs w:val="24"/>
+        </w:rPr>
+        <w:t>Vehículos con menores emisiones presentan precios base más elevados.</w:t>
+      </w:r>
+    </w:p>
+    <w:p>
+      <w:pPr>
+        <w:pStyle w:val="Prrafodelista"/>
+        <w:ind w:left="0"/>
+        <w:jc w:val="both"/>
+        <w:rPr>
+          <w:rFonts w:ascii="Arial" w:hAnsi="Arial" w:cs="Arial"/>
+          <w:sz w:val="24"/>
+          <w:szCs w:val="24"/>
+        </w:rPr>
+      </w:pPr>
+    </w:p>
+    <w:p>
+      <w:pPr>
+        <w:pStyle w:val="Prrafodelista"/>
+        <w:numPr>
+          <w:ilvl w:val="0"/>
+          <w:numId w:val="2"/>
+        </w:numPr>
+        <w:jc w:val="both"/>
+        <w:rPr>
+          <w:rFonts w:ascii="Arial" w:hAnsi="Arial" w:cs="Arial"/>
+          <w:sz w:val="24"/>
+          <w:szCs w:val="24"/>
+        </w:rPr>
+      </w:pPr>
+      <w:r>
+        <w:rPr>
+          <w:rFonts w:ascii="Arial" w:hAnsi="Arial" w:cs="Arial"/>
+          <w:sz w:val="24"/>
+          <w:szCs w:val="24"/>
+        </w:rPr>
+        <w:t>Relaccion fuerte entre: cilindrada y consumo_urbano (0,73) / consumo_extraurbano (0,72)</w:t>
+      </w:r>
+    </w:p>
+    <w:p>
+      <w:pPr>
+        <w:pStyle w:val="Prrafodelista"/>
+        <w:numPr>
+          <w:ilvl w:val="0"/>
+          <w:numId w:val="2"/>
+        </w:numPr>
+        <w:jc w:val="both"/>
+        <w:rPr>
+          <w:rFonts w:ascii="Arial" w:hAnsi="Arial" w:cs="Arial"/>
+          <w:sz w:val="24"/>
+          <w:szCs w:val="24"/>
+        </w:rPr>
+      </w:pPr>
+      <w:r>
+        <w:rPr>
+          <w:rFonts w:ascii="Arial" w:hAnsi="Arial" w:cs="Arial"/>
+          <w:sz w:val="24"/>
+          <w:szCs w:val="24"/>
+        </w:rPr>
+        <w:t>Relaccion negativa entre: potencia_cv y consumos (-0,31|-0,32) / emisiones (-0,43)</w:t>
+      </w:r>
+    </w:p>
+    <w:p>
+      <w:pPr>
+        <w:pStyle w:val="Prrafodelista"/>
+        <w:ind w:left="0"/>
+        <w:jc w:val="both"/>
+        <w:rPr>
+          <w:rFonts w:ascii="Arial" w:hAnsi="Arial" w:cs="Arial"/>
+          <w:sz w:val="24"/>
+          <w:szCs w:val="24"/>
+        </w:rPr>
+      </w:pPr>
+      <w:r>
+        <w:rPr>
+          <w:rFonts w:ascii="Arial" w:hAnsi="Arial" w:cs="Arial"/>
+          <w:sz w:val="24"/>
+          <w:szCs w:val="24"/>
+        </w:rPr>
+        <w:t>Estas relaciones indican que la potencia no depende únicamente de la cilindrada, y que existen vehículos de alta potencia con tecnologías más eficientes, como híbridos o eléctricos.</w:t>
+      </w:r>
+    </w:p>
+    <w:p>
+      <w:pPr>
+        <w:pStyle w:val="Prrafodelista"/>
+        <w:ind w:left="0"/>
+        <w:jc w:val="both"/>
+        <w:rPr>
+          <w:rFonts w:ascii="Arial" w:hAnsi="Arial" w:cs="Arial"/>
+          <w:sz w:val="24"/>
+          <w:szCs w:val="24"/>
+        </w:rPr>
+      </w:pPr>
+    </w:p>
+    <w:p>
+      <w:pPr>
+        <w:pStyle w:val="Prrafodelista"/>
+        <w:numPr>
+          <w:ilvl w:val="0"/>
+          <w:numId w:val="6"/>
+        </w:numPr>
+        <w:jc w:val="both"/>
+        <w:rPr>
+          <w:rFonts w:ascii="Arial" w:hAnsi="Arial" w:cs="Arial"/>
+          <w:sz w:val="24"/>
+          <w:szCs w:val="24"/>
+        </w:rPr>
+      </w:pPr>
+      <w:r>
+        <w:rPr>
+          <w:rFonts w:ascii="Arial" w:hAnsi="Arial" w:cs="Arial"/>
+          <w:sz w:val="24"/>
+          <w:szCs w:val="24"/>
+        </w:rPr>
+        <w:t>Estudiar patrones de ventas y mantenimiento</w:t>
+      </w:r>
+    </w:p>
+    <w:p>
+      <w:pPr>
+        <w:pStyle w:val="Prrafodelista"/>
+        <w:jc w:val="both"/>
+        <w:rPr>
+          <w:rFonts w:ascii="Arial" w:hAnsi="Arial" w:cs="Arial"/>
+          <w:sz w:val="24"/>
+          <w:szCs w:val="24"/>
+        </w:rPr>
+      </w:pPr>
+    </w:p>
+    <w:p>
+      <w:pPr>
+        <w:pStyle w:val="Prrafodelista"/>
+        <w:ind w:left="0"/>
+        <w:jc w:val="both"/>
+        <w:rPr>
+          <w:rFonts w:ascii="Arial" w:hAnsi="Arial" w:cs="Arial"/>
+          <w:b/>
+          <w:bCs/>
+          <w:sz w:val="24"/>
+          <w:szCs w:val="24"/>
+        </w:rPr>
+      </w:pPr>
+      <w:r>
+        <w:rPr>
+          <w:rFonts w:ascii="Arial" w:hAnsi="Arial" w:cs="Arial"/>
+          <w:b/>
+          <w:bCs/>
+          <w:sz w:val="24"/>
+          <w:szCs w:val="24"/>
+        </w:rPr>
+        <w:t>Análisis descriptivo de ventas y mantenimiento</w:t>
+      </w:r>
+    </w:p>
+    <w:p>
+      <w:pPr>
+        <w:pStyle w:val="Prrafodelista"/>
+        <w:ind w:left="0"/>
+        <w:jc w:val="both"/>
+        <w:rPr>
+          <w:rFonts w:ascii="Arial" w:hAnsi="Arial" w:cs="Arial"/>
+          <w:sz w:val="24"/>
+          <w:szCs w:val="24"/>
+        </w:rPr>
+      </w:pPr>
+    </w:p>
+    <w:p>
+      <w:pPr>
+        <w:pStyle w:val="Prrafodelista"/>
+        <w:ind w:left="0"/>
+        <w:jc w:val="both"/>
+        <w:rPr>
+          <w:rFonts w:ascii="Arial" w:hAnsi="Arial" w:cs="Arial"/>
+          <w:sz w:val="24"/>
+          <w:szCs w:val="24"/>
+        </w:rPr>
+      </w:pPr>
+      <w:r>
+        <w:rPr>
+          <w:rFonts w:ascii="Arial" w:hAnsi="Arial" w:cs="Arial"/>
+          <w:sz w:val="24"/>
+          <w:szCs w:val="24"/>
+        </w:rPr>
+        <w:t>Se realiza un análisis de ventas y mantenimiento con las siguientes variables:</w:t>
+      </w:r>
+    </w:p>
+    <w:p>
+      <w:pPr>
+        <w:pStyle w:val="Prrafodelista"/>
+        <w:ind w:left="0"/>
+        <w:jc w:val="both"/>
+        <w:rPr>
+          <w:rFonts w:ascii="Arial" w:hAnsi="Arial" w:cs="Arial"/>
+          <w:sz w:val="24"/>
+          <w:szCs w:val="24"/>
+        </w:rPr>
+      </w:pPr>
+    </w:p>
+    <w:p>
+      <w:pPr>
+        <w:pStyle w:val="Prrafodelista"/>
+        <w:numPr>
+          <w:ilvl w:val="0"/>
+          <w:numId w:val="2"/>
+        </w:numPr>
+        <w:jc w:val="both"/>
+        <w:rPr>
+          <w:rFonts w:ascii="Arial" w:hAnsi="Arial" w:cs="Arial"/>
+          <w:sz w:val="24"/>
+          <w:szCs w:val="24"/>
+        </w:rPr>
+      </w:pPr>
+      <w:r>
+        <w:rPr>
+          <w:rFonts w:ascii="Arial" w:hAnsi="Arial" w:cs="Arial"/>
+          <w:sz w:val="24"/>
+          <w:szCs w:val="24"/>
+        </w:rPr>
+        <w:t>precio_venta_real</w:t>
+      </w:r>
+    </w:p>
+    <w:p>
+      <w:pPr>
+        <w:pStyle w:val="Prrafodelista"/>
+        <w:numPr>
+          <w:ilvl w:val="0"/>
+          <w:numId w:val="2"/>
+        </w:numPr>
+        <w:jc w:val="both"/>
+        <w:rPr>
+          <w:rFonts w:ascii="Arial" w:hAnsi="Arial" w:cs="Arial"/>
+          <w:sz w:val="24"/>
+          <w:szCs w:val="24"/>
+        </w:rPr>
+      </w:pPr>
+      <w:r>
+        <w:rPr>
+          <w:rFonts w:ascii="Arial" w:hAnsi="Arial" w:cs="Arial"/>
+          <w:sz w:val="24"/>
+          <w:szCs w:val="24"/>
+        </w:rPr>
+        <w:t>kilometraje_venta</w:t>
+      </w:r>
+    </w:p>
+    <w:p>
+      <w:pPr>
+        <w:pStyle w:val="Prrafodelista"/>
+        <w:numPr>
+          <w:ilvl w:val="0"/>
+          <w:numId w:val="2"/>
+        </w:numPr>
+        <w:jc w:val="both"/>
+        <w:rPr>
+          <w:rFonts w:ascii="Arial" w:hAnsi="Arial" w:cs="Arial"/>
+          <w:sz w:val="24"/>
+          <w:szCs w:val="24"/>
+        </w:rPr>
+      </w:pPr>
+      <w:r>
+        <w:rPr>
+          <w:rFonts w:ascii="Arial" w:hAnsi="Arial" w:cs="Arial"/>
+          <w:sz w:val="24"/>
+          <w:szCs w:val="24"/>
+        </w:rPr>
+        <w:t>coste_mantenimiento_anual</w:t>
+      </w:r>
+    </w:p>
+    <w:p>
+      <w:pPr>
+        <w:pStyle w:val="Prrafodelista"/>
+        <w:numPr>
+          <w:ilvl w:val="0"/>
+          <w:numId w:val="2"/>
+        </w:numPr>
+        <w:jc w:val="both"/>
+        <w:rPr>
+          <w:rFonts w:ascii="Arial" w:hAnsi="Arial" w:cs="Arial"/>
+          <w:sz w:val="24"/>
+          <w:szCs w:val="24"/>
+        </w:rPr>
+      </w:pPr>
+      <w:r>
+        <w:rPr>
+          <w:rFonts w:ascii="Arial" w:hAnsi="Arial" w:cs="Arial"/>
+          <w:sz w:val="24"/>
+          <w:szCs w:val="24"/>
+        </w:rPr>
+        <w:t>incidencias_mecanicas</w:t>
+      </w:r>
+    </w:p>
+    <w:p>
+      <w:pPr>
+        <w:spacing w:after="0"/>
+        <w:jc w:val="both"/>
+        <w:rPr>
+          <w:rFonts w:ascii="Arial" w:hAnsi="Arial" w:cs="Arial"/>
+          <w:sz w:val="24"/>
+          <w:szCs w:val="24"/>
+        </w:rPr>
+      </w:pPr>
+      <w:r>
+        <w:rPr>
+          <w:rFonts w:ascii="Arial" w:hAnsi="Arial" w:cs="Arial"/>
+          <w:sz w:val="24"/>
+          <w:szCs w:val="24"/>
+        </w:rPr>
+        <w:t>Resultados:</w:t>
+      </w:r>
+    </w:p>
+    <w:p>
+      <w:pPr>
+        <w:spacing w:after="0"/>
+        <w:jc w:val="both"/>
+        <w:rPr>
+          <w:rFonts w:ascii="Arial" w:hAnsi="Arial" w:cs="Arial"/>
+          <w:sz w:val="24"/>
+          <w:szCs w:val="24"/>
+        </w:rPr>
+      </w:pPr>
+    </w:p>
+    <w:p>
+      <w:pPr>
+        <w:pStyle w:val="Prrafodelista"/>
+        <w:numPr>
+          <w:ilvl w:val="0"/>
+          <w:numId w:val="2"/>
+        </w:numPr>
+        <w:jc w:val="both"/>
+        <w:rPr>
+          <w:rFonts w:ascii="Arial" w:hAnsi="Arial" w:cs="Arial"/>
+          <w:sz w:val="24"/>
+          <w:szCs w:val="24"/>
+        </w:rPr>
+      </w:pPr>
+      <w:r>
+        <w:rPr>
+          <w:rFonts w:ascii="Arial" w:hAnsi="Arial" w:cs="Arial"/>
+          <w:sz w:val="24"/>
+          <w:szCs w:val="24"/>
+        </w:rPr>
+        <w:t>El precio medio de venta real se sitúa en torno a los 34.000 €.</w:t>
+      </w:r>
+    </w:p>
+    <w:p>
+      <w:pPr>
+        <w:pStyle w:val="Prrafodelista"/>
+        <w:jc w:val="both"/>
+        <w:rPr>
+          <w:rFonts w:ascii="Arial" w:hAnsi="Arial" w:cs="Arial"/>
+          <w:sz w:val="24"/>
+          <w:szCs w:val="24"/>
+        </w:rPr>
+      </w:pPr>
+    </w:p>
+    <w:p>
+      <w:pPr>
+        <w:pStyle w:val="Prrafodelista"/>
+        <w:numPr>
+          <w:ilvl w:val="0"/>
+          <w:numId w:val="2"/>
+        </w:numPr>
+        <w:jc w:val="both"/>
+        <w:rPr>
+          <w:rFonts w:ascii="Arial" w:hAnsi="Arial" w:cs="Arial"/>
+          <w:sz w:val="24"/>
+          <w:szCs w:val="24"/>
+        </w:rPr>
+      </w:pPr>
+      <w:r>
+        <w:rPr>
+          <w:rFonts w:ascii="Arial" w:hAnsi="Arial" w:cs="Arial"/>
+          <w:sz w:val="24"/>
+          <w:szCs w:val="24"/>
+        </w:rPr>
+        <w:t xml:space="preserve">El kilometraje </w:t>
+      </w:r>
+      <w:r>
+        <w:rPr>
+          <w:rFonts w:ascii="Arial" w:hAnsi="Arial" w:cs="Arial"/>
+          <w:sz w:val="24"/>
+          <w:szCs w:val="24"/>
+        </w:rPr>
+        <w:t>de venta representa mucha diferencia entre los vehículos con los kilometrajes más bajos y los más altos</w:t>
+      </w:r>
+      <w:r>
+        <w:rPr>
+          <w:rFonts w:ascii="Arial" w:hAnsi="Arial" w:cs="Arial"/>
+          <w:sz w:val="24"/>
+          <w:szCs w:val="24"/>
+        </w:rPr>
+        <w:t>.</w:t>
+      </w:r>
+    </w:p>
+    <w:p>
+      <w:pPr>
+        <w:pStyle w:val="Prrafodelista"/>
+        <w:rPr>
+          <w:rFonts w:ascii="Arial" w:hAnsi="Arial" w:cs="Arial"/>
+          <w:sz w:val="24"/>
+          <w:szCs w:val="24"/>
+        </w:rPr>
+      </w:pPr>
+    </w:p>
+    <w:p>
+      <w:pPr>
+        <w:pStyle w:val="Prrafodelista"/>
+        <w:numPr>
+          <w:ilvl w:val="0"/>
+          <w:numId w:val="2"/>
+        </w:numPr>
+        <w:jc w:val="both"/>
+        <w:rPr>
+          <w:rFonts w:ascii="Arial" w:hAnsi="Arial" w:cs="Arial"/>
+          <w:sz w:val="24"/>
+          <w:szCs w:val="24"/>
+        </w:rPr>
+      </w:pPr>
+      <w:r>
+        <w:rPr>
+          <w:rFonts w:ascii="Arial" w:hAnsi="Arial" w:cs="Arial"/>
+          <w:sz w:val="24"/>
+          <w:szCs w:val="24"/>
+        </w:rPr>
+        <w:t>La mayoría de vehículos presentan pocas o ninguna incidencia mecánica.</w:t>
+      </w:r>
+    </w:p>
+    <w:p>
+      <w:pPr>
+        <w:pStyle w:val="Prrafodelista"/>
+        <w:rPr>
+          <w:rFonts w:ascii="Arial" w:hAnsi="Arial" w:cs="Arial"/>
+          <w:sz w:val="24"/>
+          <w:szCs w:val="24"/>
+        </w:rPr>
+      </w:pPr>
+    </w:p>
+    <w:p>
+      <w:pPr>
+        <w:pStyle w:val="Prrafodelista"/>
+        <w:numPr>
+          <w:ilvl w:val="0"/>
+          <w:numId w:val="2"/>
+        </w:numPr>
+        <w:jc w:val="both"/>
+        <w:rPr>
+          <w:rFonts w:ascii="Arial" w:hAnsi="Arial" w:cs="Arial"/>
+          <w:sz w:val="24"/>
+          <w:szCs w:val="24"/>
+        </w:rPr>
+      </w:pPr>
+      <w:r>
+        <w:rPr>
+          <w:rFonts w:ascii="Arial" w:hAnsi="Arial" w:cs="Arial"/>
+          <w:sz w:val="24"/>
+          <w:szCs w:val="24"/>
+        </w:rPr>
+        <w:t>El coste de mantenimiento anual muestra variabilidad entre vehículos.</w:t>
+      </w:r>
+    </w:p>
+    <w:p>
+      <w:pPr>
+        <w:pStyle w:val="Prrafodelista"/>
+        <w:ind w:left="0"/>
+        <w:jc w:val="both"/>
+        <w:rPr>
+          <w:rFonts w:ascii="Arial" w:hAnsi="Arial" w:cs="Arial"/>
+          <w:sz w:val="24"/>
+          <w:szCs w:val="24"/>
+        </w:rPr>
+      </w:pPr>
+    </w:p>
+    <w:p>
+      <w:pPr>
+        <w:pStyle w:val="Prrafodelista"/>
+        <w:ind w:left="0"/>
+        <w:jc w:val="both"/>
+        <w:rPr>
+          <w:rFonts w:ascii="Arial" w:hAnsi="Arial" w:cs="Arial"/>
+          <w:b/>
+          <w:bCs/>
+          <w:sz w:val="24"/>
+          <w:szCs w:val="24"/>
+        </w:rPr>
+      </w:pPr>
+      <w:r>
+        <w:rPr>
+          <w:rFonts w:ascii="Arial" w:hAnsi="Arial" w:cs="Arial"/>
+          <w:b/>
+          <w:bCs/>
+          <w:sz w:val="24"/>
+          <w:szCs w:val="24"/>
+        </w:rPr>
+        <w:t>Relación entre kilometraje y precio de venta</w:t>
+      </w:r>
+    </w:p>
+    <w:p>
+      <w:pPr>
+        <w:pStyle w:val="Prrafodelista"/>
+        <w:ind w:left="0"/>
+        <w:jc w:val="both"/>
+        <w:rPr>
+          <w:rFonts w:ascii="Arial" w:hAnsi="Arial" w:cs="Arial"/>
+          <w:sz w:val="24"/>
+          <w:szCs w:val="24"/>
+        </w:rPr>
+      </w:pPr>
+    </w:p>
+    <w:p>
+      <w:pPr>
+        <w:pStyle w:val="Prrafodelista"/>
+        <w:ind w:left="0"/>
+        <w:jc w:val="both"/>
+        <w:rPr>
+          <w:rFonts w:ascii="Arial" w:hAnsi="Arial" w:cs="Arial"/>
+          <w:sz w:val="24"/>
+          <w:szCs w:val="24"/>
+        </w:rPr>
+      </w:pPr>
+      <w:r>
+        <w:rPr>
+          <w:rFonts w:ascii="Arial" w:hAnsi="Arial" w:cs="Arial"/>
+          <w:sz w:val="24"/>
+          <w:szCs w:val="24"/>
+        </w:rPr>
+        <w:drawing>
+          <wp:inline distT="0" distB="0" distL="0" distR="0" wp14:anchorId="7325F814" wp14:editId="45B01F21">
+            <wp:extent cx="5400040" cy="4982210"/>
+            <wp:effectExtent l="0" t="0" r="0" b="8890"/>
+            <wp:docPr id="1331388295" name="Imagen 1"/>
+            <wp:cNvGraphicFramePr>
+              <a:graphicFrameLocks xmlns:a="http://schemas.openxmlformats.org/drawingml/2006/main" noChangeAspect="1"/>
+            </wp:cNvGraphicFramePr>
+            <a:graphic xmlns:a="http://schemas.openxmlformats.org/drawingml/2006/main">
+              <a:graphicData uri="http://schemas.openxmlformats.org/drawingml/2006/picture">
+                <pic:pic xmlns:pic="http://schemas.openxmlformats.org/drawingml/2006/picture">
+                  <pic:nvPicPr>
+                    <pic:cNvPr id="1331388295" name=""/>
+                    <pic:cNvPicPr/>
+                  </pic:nvPicPr>
+                  <pic:blipFill>
+                    <a:blip r:embed="rId14"/>
+                    <a:stretch>
+                      <a:fillRect/>
+                    </a:stretch>
+                  </pic:blipFill>
+                  <pic:spPr>
+                    <a:xfrm>
+                      <a:off x="0" y="0"/>
+                      <a:ext cx="5400040" cy="4982210"/>
+                    </a:xfrm>
+                    <a:prstGeom prst="rect">
+                      <a:avLst/>
+                    </a:prstGeom>
+                  </pic:spPr>
+                </pic:pic>
+              </a:graphicData>
+            </a:graphic>
+          </wp:inline>
+        </w:drawing>
+      </w:r>
+    </w:p>
+    <w:p>
+      <w:pPr>
+        <w:jc w:val="both"/>
+        <w:rPr>
+          <w:rFonts w:ascii="Arial" w:hAnsi="Arial" w:cs="Arial"/>
+          <w:sz w:val="24"/>
+          <w:szCs w:val="24"/>
+        </w:rPr>
+      </w:pPr>
+      <w:r>
+        <w:rPr>
+          <w:rFonts w:ascii="Arial" w:hAnsi="Arial" w:cs="Arial"/>
+          <w:sz w:val="24"/>
+          <w:szCs w:val="24"/>
+        </w:rPr>
+        <w:t>La correlación entre el kilometraje y el precio de venta real es muy débil y cercana a cero, lo que indica que, en este conjunto de datos, el kilometraje por sí solo no explica de forma significativa el precio de venta.</w:t>
+      </w:r>
+    </w:p>
+    <w:p>
+      <w:pPr>
+        <w:pStyle w:val="Prrafodelista"/>
+        <w:ind w:left="0"/>
+        <w:jc w:val="both"/>
+        <w:rPr>
+          <w:rFonts w:ascii="Arial" w:hAnsi="Arial" w:cs="Arial"/>
+          <w:sz w:val="24"/>
+          <w:szCs w:val="24"/>
+        </w:rPr>
+      </w:pPr>
+    </w:p>
+    <w:p>
+      <w:pPr>
+        <w:pStyle w:val="Prrafodelista"/>
+        <w:ind w:left="0"/>
+        <w:jc w:val="both"/>
+        <w:rPr>
+          <w:rFonts w:ascii="Arial" w:hAnsi="Arial" w:cs="Arial"/>
+          <w:b/>
+          <w:bCs/>
+          <w:sz w:val="24"/>
+          <w:szCs w:val="24"/>
+        </w:rPr>
+      </w:pPr>
+      <w:r>
+        <w:rPr>
+          <w:rFonts w:ascii="Arial" w:hAnsi="Arial" w:cs="Arial"/>
+          <w:b/>
+          <w:bCs/>
+          <w:sz w:val="24"/>
+          <w:szCs w:val="24"/>
+        </w:rPr>
+        <w:t>Coste de mantenimiento por marca</w:t>
+      </w:r>
+    </w:p>
+    <w:p>
+      <w:pPr>
+        <w:pStyle w:val="Prrafodelista"/>
+        <w:ind w:left="0"/>
+        <w:jc w:val="both"/>
+        <w:rPr>
+          <w:rFonts w:ascii="Arial" w:hAnsi="Arial" w:cs="Arial"/>
+          <w:b/>
+          <w:bCs/>
+          <w:sz w:val="24"/>
+          <w:szCs w:val="24"/>
+        </w:rPr>
+      </w:pPr>
+    </w:p>
+    <w:p>
+      <w:pPr>
+        <w:pStyle w:val="Prrafodelista"/>
+        <w:ind w:left="0"/>
+        <w:jc w:val="both"/>
+        <w:rPr>
+          <w:rFonts w:ascii="Arial" w:hAnsi="Arial" w:cs="Arial"/>
+          <w:sz w:val="24"/>
+          <w:szCs w:val="24"/>
+        </w:rPr>
+      </w:pPr>
+      <w:r>
+        <w:rPr>
+          <w:rFonts w:ascii="Arial" w:hAnsi="Arial" w:cs="Arial"/>
+          <w:sz w:val="24"/>
+          <w:szCs w:val="24"/>
+        </w:rPr>
+        <w:t>Se observan diferencias claras en el coste medio de mantenimiento entre marcas.</w:t>
+      </w:r>
+    </w:p>
+    <w:p>
+      <w:pPr>
+        <w:pStyle w:val="Prrafodelista"/>
+        <w:ind w:left="0"/>
+        <w:jc w:val="both"/>
+        <w:rPr>
+          <w:rFonts w:ascii="Arial" w:hAnsi="Arial" w:cs="Arial"/>
+          <w:sz w:val="24"/>
+          <w:szCs w:val="24"/>
+        </w:rPr>
+      </w:pPr>
+      <w:r>
+        <w:rPr>
+          <w:rFonts w:ascii="Arial" w:hAnsi="Arial" w:cs="Arial"/>
+          <w:sz w:val="24"/>
+          <w:szCs w:val="24"/>
+        </w:rPr>
+        <w:t xml:space="preserve">Las marcas de gama </w:t>
+      </w:r>
+      <w:r>
+        <w:rPr>
+          <w:rFonts w:ascii="Arial" w:hAnsi="Arial" w:cs="Arial"/>
+          <w:sz w:val="24"/>
+          <w:szCs w:val="24"/>
+        </w:rPr>
+        <w:t>más</w:t>
+      </w:r>
+      <w:r>
+        <w:rPr>
+          <w:rFonts w:ascii="Arial" w:hAnsi="Arial" w:cs="Arial"/>
+          <w:sz w:val="24"/>
+          <w:szCs w:val="24"/>
+        </w:rPr>
+        <w:t xml:space="preserve"> alta presentan costes de mantenimiento más elevados, mientras que las marcas </w:t>
+      </w:r>
+      <w:r>
+        <w:rPr>
+          <w:rFonts w:ascii="Arial" w:hAnsi="Arial" w:cs="Arial"/>
+          <w:sz w:val="24"/>
+          <w:szCs w:val="24"/>
+        </w:rPr>
+        <w:t>más</w:t>
+      </w:r>
+      <w:r>
+        <w:rPr>
+          <w:rFonts w:ascii="Arial" w:hAnsi="Arial" w:cs="Arial"/>
+          <w:sz w:val="24"/>
+          <w:szCs w:val="24"/>
+        </w:rPr>
+        <w:t xml:space="preserve"> baratas tienden a mostrar costes inferiores.</w:t>
+      </w:r>
+    </w:p>
+    <w:p>
+      <w:pPr>
+        <w:pStyle w:val="Prrafodelista"/>
+        <w:ind w:left="0"/>
+        <w:jc w:val="both"/>
+        <w:rPr>
+          <w:rFonts w:ascii="Arial" w:hAnsi="Arial" w:cs="Arial"/>
+          <w:sz w:val="24"/>
+          <w:szCs w:val="24"/>
+        </w:rPr>
+      </w:pPr>
+    </w:p>
+    <w:p>
+      <w:pPr>
+        <w:pStyle w:val="Prrafodelista"/>
+        <w:ind w:left="0"/>
+        <w:jc w:val="both"/>
+        <w:rPr>
+          <w:rFonts w:ascii="Arial" w:hAnsi="Arial" w:cs="Arial"/>
+          <w:b/>
+          <w:bCs/>
+          <w:sz w:val="24"/>
+          <w:szCs w:val="24"/>
+        </w:rPr>
+      </w:pPr>
+      <w:r>
+        <w:rPr>
+          <w:rFonts w:ascii="Arial" w:hAnsi="Arial" w:cs="Arial"/>
+          <w:b/>
+          <w:bCs/>
+          <w:sz w:val="24"/>
+          <w:szCs w:val="24"/>
+        </w:rPr>
+        <w:t xml:space="preserve">Coste de mantenimiento </w:t>
+      </w:r>
+      <w:r>
+        <w:rPr>
+          <w:rFonts w:ascii="Arial" w:hAnsi="Arial" w:cs="Arial"/>
+          <w:b/>
+          <w:bCs/>
+          <w:sz w:val="24"/>
+          <w:szCs w:val="24"/>
+        </w:rPr>
+        <w:t>e incidencias</w:t>
+      </w:r>
+    </w:p>
+    <w:p>
+      <w:pPr>
+        <w:pStyle w:val="Prrafodelista"/>
+        <w:ind w:left="0"/>
+        <w:jc w:val="both"/>
+        <w:rPr>
+          <w:rFonts w:ascii="Arial" w:hAnsi="Arial" w:cs="Arial"/>
+          <w:b/>
+          <w:bCs/>
+          <w:sz w:val="24"/>
+          <w:szCs w:val="24"/>
+        </w:rPr>
+      </w:pPr>
+    </w:p>
+    <w:p>
+      <w:pPr>
+        <w:pStyle w:val="Prrafodelista"/>
+        <w:ind w:left="0"/>
+        <w:jc w:val="both"/>
+        <w:rPr>
+          <w:rFonts w:ascii="Arial" w:hAnsi="Arial" w:cs="Arial"/>
+          <w:sz w:val="24"/>
+          <w:szCs w:val="24"/>
+        </w:rPr>
+      </w:pPr>
+      <w:r>
+        <w:rPr>
+          <w:rFonts w:ascii="Arial" w:hAnsi="Arial" w:cs="Arial"/>
+          <w:sz w:val="24"/>
+          <w:szCs w:val="24"/>
+        </w:rPr>
+        <w:drawing>
+          <wp:inline distT="0" distB="0" distL="0" distR="0" wp14:anchorId="72CCBAEA" wp14:editId="2B512267">
+            <wp:extent cx="5400040" cy="4982210"/>
+            <wp:effectExtent l="0" t="0" r="0" b="8890"/>
+            <wp:docPr id="1787216502" name="Imagen 1"/>
+            <wp:cNvGraphicFramePr>
+              <a:graphicFrameLocks xmlns:a="http://schemas.openxmlformats.org/drawingml/2006/main" noChangeAspect="1"/>
+            </wp:cNvGraphicFramePr>
+            <a:graphic xmlns:a="http://schemas.openxmlformats.org/drawingml/2006/main">
+              <a:graphicData uri="http://schemas.openxmlformats.org/drawingml/2006/picture">
+                <pic:pic xmlns:pic="http://schemas.openxmlformats.org/drawingml/2006/picture">
+                  <pic:nvPicPr>
+                    <pic:cNvPr id="1787216502" name=""/>
+                    <pic:cNvPicPr/>
+                  </pic:nvPicPr>
+                  <pic:blipFill>
+                    <a:blip r:embed="rId15"/>
+                    <a:stretch>
+                      <a:fillRect/>
+                    </a:stretch>
+                  </pic:blipFill>
+                  <pic:spPr>
+                    <a:xfrm>
+                      <a:off x="0" y="0"/>
+                      <a:ext cx="5400040" cy="4982210"/>
+                    </a:xfrm>
+                    <a:prstGeom prst="rect">
+                      <a:avLst/>
+                    </a:prstGeom>
+                  </pic:spPr>
+                </pic:pic>
+              </a:graphicData>
+            </a:graphic>
+          </wp:inline>
+        </w:drawing>
+      </w:r>
+    </w:p>
+    <w:p>
+      <w:pPr>
+        <w:pStyle w:val="Prrafodelista"/>
+        <w:ind w:left="0"/>
+        <w:jc w:val="both"/>
+        <w:rPr>
+          <w:rFonts w:ascii="Arial" w:hAnsi="Arial" w:cs="Arial"/>
+          <w:sz w:val="24"/>
+          <w:szCs w:val="24"/>
+        </w:rPr>
+      </w:pPr>
+    </w:p>
+    <w:p>
+      <w:pPr>
+        <w:pStyle w:val="Prrafodelista"/>
+        <w:ind w:left="0"/>
+        <w:jc w:val="both"/>
+        <w:rPr>
+          <w:rFonts w:ascii="Arial" w:hAnsi="Arial" w:cs="Arial"/>
+          <w:sz w:val="24"/>
+          <w:szCs w:val="24"/>
+        </w:rPr>
+      </w:pPr>
+      <w:r>
+        <w:rPr>
+          <w:rFonts w:ascii="Arial" w:hAnsi="Arial" w:cs="Arial"/>
+          <w:sz w:val="24"/>
+          <w:szCs w:val="24"/>
+        </w:rPr>
+        <w:t>La relación entre el número de incidencias mecánicas y el coste de mantenimiento anual es débil, lo que sugiere que los costes de mantenimiento no dependen únicamente del número de averías.</w:t>
+      </w:r>
+    </w:p>
+    <w:p>
+      <w:pPr>
+        <w:pStyle w:val="Prrafodelista"/>
+        <w:ind w:left="0"/>
+        <w:jc w:val="both"/>
+        <w:rPr>
+          <w:rFonts w:ascii="Arial" w:hAnsi="Arial" w:cs="Arial"/>
+          <w:sz w:val="24"/>
+          <w:szCs w:val="24"/>
+        </w:rPr>
+      </w:pPr>
+    </w:p>
+    <w:p>
+      <w:pPr>
+        <w:pStyle w:val="Prrafodelista"/>
+        <w:ind w:left="0"/>
+        <w:jc w:val="both"/>
+        <w:rPr>
+          <w:rFonts w:ascii="Arial" w:hAnsi="Arial" w:cs="Arial"/>
+          <w:b/>
+          <w:bCs/>
+          <w:sz w:val="24"/>
+          <w:szCs w:val="24"/>
+        </w:rPr>
+      </w:pPr>
+      <w:r>
+        <w:rPr>
+          <w:rFonts w:ascii="Arial" w:hAnsi="Arial" w:cs="Arial"/>
+          <w:b/>
+          <w:bCs/>
+          <w:sz w:val="24"/>
+          <w:szCs w:val="24"/>
+        </w:rPr>
+        <w:t xml:space="preserve">Coste de mantenimiento </w:t>
+      </w:r>
+      <w:r>
+        <w:rPr>
+          <w:rFonts w:ascii="Arial" w:hAnsi="Arial" w:cs="Arial"/>
+          <w:b/>
+          <w:bCs/>
+          <w:sz w:val="24"/>
+          <w:szCs w:val="24"/>
+        </w:rPr>
+        <w:t>y antigüedad</w:t>
+      </w:r>
+    </w:p>
+    <w:p>
+      <w:pPr>
+        <w:pStyle w:val="Prrafodelista"/>
+        <w:ind w:left="0"/>
+        <w:jc w:val="both"/>
+        <w:rPr>
+          <w:rFonts w:ascii="Arial" w:hAnsi="Arial" w:cs="Arial"/>
+          <w:sz w:val="24"/>
+          <w:szCs w:val="24"/>
+        </w:rPr>
+      </w:pPr>
+    </w:p>
+    <w:p>
+      <w:pPr>
+        <w:pStyle w:val="Prrafodelista"/>
+        <w:ind w:left="0"/>
+        <w:jc w:val="both"/>
+        <w:rPr>
+          <w:rFonts w:ascii="Arial" w:hAnsi="Arial" w:cs="Arial"/>
+          <w:sz w:val="24"/>
+          <w:szCs w:val="24"/>
+        </w:rPr>
+      </w:pPr>
+      <w:r>
+        <w:rPr>
+          <w:rFonts w:ascii="Arial" w:hAnsi="Arial" w:cs="Arial"/>
+          <w:sz w:val="24"/>
+          <w:szCs w:val="24"/>
+        </w:rPr>
+        <w:drawing>
+          <wp:inline distT="0" distB="0" distL="0" distR="0" wp14:anchorId="777255D6" wp14:editId="2C68FCE2">
+            <wp:extent cx="5400040" cy="4982210"/>
+            <wp:effectExtent l="0" t="0" r="0" b="8890"/>
+            <wp:docPr id="1751724076" name="Imagen 1"/>
+            <wp:cNvGraphicFramePr>
+              <a:graphicFrameLocks xmlns:a="http://schemas.openxmlformats.org/drawingml/2006/main" noChangeAspect="1"/>
+            </wp:cNvGraphicFramePr>
+            <a:graphic xmlns:a="http://schemas.openxmlformats.org/drawingml/2006/main">
+              <a:graphicData uri="http://schemas.openxmlformats.org/drawingml/2006/picture">
+                <pic:pic xmlns:pic="http://schemas.openxmlformats.org/drawingml/2006/picture">
+                  <pic:nvPicPr>
+                    <pic:cNvPr id="1751724076" name=""/>
+                    <pic:cNvPicPr/>
+                  </pic:nvPicPr>
+                  <pic:blipFill>
+                    <a:blip r:embed="rId16"/>
+                    <a:stretch>
+                      <a:fillRect/>
+                    </a:stretch>
+                  </pic:blipFill>
+                  <pic:spPr>
+                    <a:xfrm>
+                      <a:off x="0" y="0"/>
+                      <a:ext cx="5400040" cy="4982210"/>
+                    </a:xfrm>
+                    <a:prstGeom prst="rect">
+                      <a:avLst/>
+                    </a:prstGeom>
+                  </pic:spPr>
+                </pic:pic>
+              </a:graphicData>
+            </a:graphic>
+          </wp:inline>
+        </w:drawing>
+      </w:r>
+    </w:p>
+    <w:p>
+      <w:pPr>
+        <w:pStyle w:val="Prrafodelista"/>
+        <w:ind w:left="0"/>
+        <w:jc w:val="both"/>
+        <w:rPr>
+          <w:rFonts w:ascii="Arial" w:hAnsi="Arial" w:cs="Arial"/>
+          <w:sz w:val="24"/>
+          <w:szCs w:val="24"/>
+        </w:rPr>
+      </w:pPr>
+      <w:r>
+        <w:rPr>
+          <w:rFonts w:ascii="Arial" w:hAnsi="Arial" w:cs="Arial"/>
+          <w:sz w:val="24"/>
+          <w:szCs w:val="24"/>
+        </w:rPr>
+        <w:t>Se observa una correlación positiva moderada entre la antigüedad del vehículo y el coste de mantenimiento anual, indicando que los vehículos más antiguos tienden a requerir mayores gastos de mantenimiento.</w:t>
+      </w:r>
+    </w:p>
+    <w:p>
+      <w:pPr>
+        <w:pStyle w:val="Prrafodelista"/>
+        <w:jc w:val="both"/>
+        <w:rPr>
+          <w:rFonts w:ascii="Arial" w:hAnsi="Arial" w:cs="Arial"/>
+          <w:sz w:val="24"/>
+          <w:szCs w:val="24"/>
+        </w:rPr>
+      </w:pPr>
+    </w:p>
+    <w:p>
+      <w:pPr>
+        <w:pStyle w:val="Prrafodelista"/>
+        <w:numPr>
+          <w:ilvl w:val="0"/>
+          <w:numId w:val="6"/>
+        </w:numPr>
+        <w:jc w:val="both"/>
+        <w:rPr>
+          <w:rFonts w:ascii="Arial" w:hAnsi="Arial" w:cs="Arial"/>
+          <w:sz w:val="24"/>
+          <w:szCs w:val="24"/>
+        </w:rPr>
+      </w:pPr>
+      <w:r>
+        <w:rPr>
+          <w:rFonts w:ascii="Arial" w:hAnsi="Arial" w:cs="Arial"/>
+          <w:sz w:val="24"/>
+          <w:szCs w:val="24"/>
+        </w:rPr>
+        <w:t>Documentar hip</w:t>
+      </w:r>
+      <w:r>
+        <w:rPr>
+          <w:rFonts w:ascii="Arial" w:hAnsi="Arial" w:cs="Arial"/>
+          <w:sz w:val="24"/>
+          <w:szCs w:val="24"/>
+        </w:rPr>
+        <w:t>ó</w:t>
+      </w:r>
+      <w:r>
+        <w:rPr>
+          <w:rFonts w:ascii="Arial" w:hAnsi="Arial" w:cs="Arial"/>
+          <w:sz w:val="24"/>
+          <w:szCs w:val="24"/>
+        </w:rPr>
+        <w:t>tesis sobre factores que afectan valor residual</w:t>
+      </w:r>
+    </w:p>
+    <w:p>
+      <w:pPr>
+        <w:pStyle w:val="Prrafodelista"/>
+        <w:jc w:val="both"/>
+        <w:rPr>
+          <w:rFonts w:ascii="Arial" w:hAnsi="Arial" w:cs="Arial"/>
+          <w:sz w:val="24"/>
+          <w:szCs w:val="24"/>
+        </w:rPr>
+      </w:pPr>
+    </w:p>
+    <w:p>
+      <w:pPr>
+        <w:pStyle w:val="Prrafodelista"/>
+        <w:ind w:left="0"/>
+        <w:jc w:val="both"/>
+        <w:rPr>
+          <w:rFonts w:ascii="Arial" w:hAnsi="Arial" w:cs="Arial"/>
+          <w:sz w:val="24"/>
+          <w:szCs w:val="24"/>
+        </w:rPr>
+      </w:pPr>
+      <w:r>
+        <w:rPr>
+          <w:rFonts w:ascii="Arial" w:hAnsi="Arial" w:cs="Arial"/>
+          <w:sz w:val="24"/>
+          <w:szCs w:val="24"/>
+        </w:rPr>
+        <w:t>En este apartado se formularán las hipótesis que serán respondidas en fases posteriores mediante modelos predictivos.</w:t>
+      </w:r>
+    </w:p>
+    <w:p>
+      <w:pPr>
+        <w:pStyle w:val="Prrafodelista"/>
+        <w:ind w:left="0"/>
+        <w:jc w:val="both"/>
+        <w:rPr>
+          <w:rFonts w:ascii="Arial" w:hAnsi="Arial" w:cs="Arial"/>
+          <w:sz w:val="24"/>
+          <w:szCs w:val="24"/>
+        </w:rPr>
+      </w:pPr>
+    </w:p>
+    <w:p>
+      <w:pPr>
+        <w:pStyle w:val="Prrafodelista"/>
+        <w:ind w:left="0"/>
+        <w:jc w:val="both"/>
+        <w:rPr>
+          <w:rFonts w:ascii="Arial" w:hAnsi="Arial" w:cs="Arial"/>
+          <w:sz w:val="24"/>
+          <w:szCs w:val="24"/>
+        </w:rPr>
+      </w:pPr>
+      <w:r>
+        <w:rPr>
+          <w:rFonts w:ascii="Arial" w:hAnsi="Arial" w:cs="Arial"/>
+          <w:sz w:val="24"/>
+          <w:szCs w:val="24"/>
+        </w:rPr>
+        <w:t>- Se ha observado una correlación positiva moderada entre la antigüedad del vehículo y el coste de mantenimiento, lo que sugiere un mayor desgaste y una menor percepción de valor en vehículos más antiguos.</w:t>
+      </w:r>
+    </w:p>
+    <w:p>
+      <w:pPr>
+        <w:pStyle w:val="Prrafodelista"/>
+        <w:ind w:left="0"/>
+        <w:jc w:val="both"/>
+        <w:rPr>
+          <w:rFonts w:ascii="Arial" w:hAnsi="Arial" w:cs="Arial"/>
+          <w:sz w:val="24"/>
+          <w:szCs w:val="24"/>
+        </w:rPr>
+      </w:pPr>
+    </w:p>
+    <w:p>
+      <w:pPr>
+        <w:pStyle w:val="Prrafodelista"/>
+        <w:ind w:left="0"/>
+        <w:jc w:val="both"/>
+        <w:rPr>
+          <w:rFonts w:ascii="Arial" w:hAnsi="Arial" w:cs="Arial"/>
+          <w:sz w:val="24"/>
+          <w:szCs w:val="24"/>
+        </w:rPr>
+      </w:pPr>
+      <w:r>
+        <w:rPr>
+          <w:rFonts w:ascii="Arial" w:hAnsi="Arial" w:cs="Arial"/>
+          <w:sz w:val="24"/>
+          <w:szCs w:val="24"/>
+        </w:rPr>
+        <w:t>- Aunque la correlación directa entre kilometraje y precio de venta es débil en esta fase, el kilometraje sigue siendo un indicador del uso del vehículo y, combinado con otras variables, puede influir en el valor.</w:t>
+      </w:r>
+    </w:p>
+    <w:p>
+      <w:pPr>
+        <w:pStyle w:val="Prrafodelista"/>
+        <w:ind w:left="0"/>
+        <w:jc w:val="both"/>
+        <w:rPr>
+          <w:rFonts w:ascii="Arial" w:hAnsi="Arial" w:cs="Arial"/>
+          <w:sz w:val="24"/>
+          <w:szCs w:val="24"/>
+        </w:rPr>
+      </w:pPr>
+    </w:p>
+    <w:p>
+      <w:pPr>
+        <w:pStyle w:val="Prrafodelista"/>
+        <w:ind w:left="0"/>
+        <w:jc w:val="both"/>
+        <w:rPr>
+          <w:rFonts w:ascii="Arial" w:hAnsi="Arial" w:cs="Arial"/>
+          <w:sz w:val="24"/>
+          <w:szCs w:val="24"/>
+        </w:rPr>
+      </w:pPr>
+      <w:r>
+        <w:rPr>
+          <w:rFonts w:ascii="Arial" w:hAnsi="Arial" w:cs="Arial"/>
+          <w:sz w:val="24"/>
+          <w:szCs w:val="24"/>
+        </w:rPr>
+        <w:t>- Las diferencias observadas en el coste de mantenimiento por marca y su relación con la antigüedad indican que los costes de mantenimiento pueden afectar negativamente a la percepción de valor del vehículo</w:t>
+      </w:r>
+    </w:p>
+    <w:p>
+      <w:pPr>
+        <w:pStyle w:val="Prrafodelista"/>
+        <w:ind w:left="0"/>
+        <w:jc w:val="both"/>
+        <w:rPr>
+          <w:rFonts w:ascii="Arial" w:hAnsi="Arial" w:cs="Arial"/>
+          <w:sz w:val="24"/>
+          <w:szCs w:val="24"/>
+        </w:rPr>
+      </w:pPr>
+    </w:p>
+    <w:p>
+      <w:pPr>
+        <w:pStyle w:val="Prrafodelista"/>
+        <w:ind w:left="0"/>
+        <w:jc w:val="both"/>
+        <w:rPr>
+          <w:rFonts w:ascii="Arial" w:hAnsi="Arial" w:cs="Arial"/>
+          <w:sz w:val="24"/>
+          <w:szCs w:val="24"/>
+        </w:rPr>
+      </w:pPr>
+      <w:r>
+        <w:rPr>
+          <w:rFonts w:ascii="Arial" w:hAnsi="Arial" w:cs="Arial"/>
+          <w:sz w:val="24"/>
+          <w:szCs w:val="24"/>
+        </w:rPr>
+        <w:t>- Aunque la correlación directa es débil, las incidencias mecánicas reflejan problemas de fiabilidad que pueden influir en el precio de venta y en el valor residual a largo plazo.</w:t>
+      </w:r>
+    </w:p>
+    <w:p>
+      <w:pPr>
+        <w:pStyle w:val="Prrafodelista"/>
+        <w:ind w:left="0"/>
+        <w:jc w:val="both"/>
+        <w:rPr>
+          <w:rFonts w:ascii="Arial" w:hAnsi="Arial" w:cs="Arial"/>
+          <w:sz w:val="24"/>
+          <w:szCs w:val="24"/>
+        </w:rPr>
+      </w:pPr>
+    </w:p>
+    <w:p>
+      <w:pPr>
+        <w:pStyle w:val="Prrafodelista"/>
+        <w:ind w:left="0"/>
+        <w:jc w:val="both"/>
+        <w:rPr>
+          <w:rFonts w:ascii="Arial" w:hAnsi="Arial" w:cs="Arial"/>
+          <w:sz w:val="24"/>
+          <w:szCs w:val="24"/>
+        </w:rPr>
+      </w:pPr>
+      <w:r>
+        <w:rPr>
+          <w:rFonts w:ascii="Arial" w:hAnsi="Arial" w:cs="Arial"/>
+          <w:sz w:val="24"/>
+          <w:szCs w:val="24"/>
+        </w:rPr>
+        <w:t>- El análisis de correlación entre variables técnicas y precio base muestra que la eficiencia energética y las prestaciones influyen positivamente en la valoración económica del vehículo.</w:t>
+      </w:r>
+    </w:p>
+    <w:p>
+      <w:pPr>
+        <w:pStyle w:val="Prrafodelista"/>
+        <w:jc w:val="both"/>
+        <w:rPr>
+          <w:rFonts w:ascii="Arial" w:hAnsi="Arial" w:cs="Arial"/>
+          <w:sz w:val="24"/>
+          <w:szCs w:val="24"/>
+        </w:rPr>
+      </w:pPr>
+    </w:p>
+    <w:p>
+      <w:pPr>
+        <w:pStyle w:val="Prrafodelista"/>
+        <w:ind w:left="0"/>
+        <w:jc w:val="both"/>
+        <w:rPr>
+          <w:rFonts w:ascii="Arial" w:hAnsi="Arial" w:cs="Arial"/>
+          <w:sz w:val="24"/>
+          <w:szCs w:val="24"/>
+        </w:rPr>
+      </w:pPr>
+      <w:r>
+        <w:rPr>
+          <w:rFonts w:ascii="Arial" w:hAnsi="Arial" w:cs="Arial"/>
+          <w:sz w:val="24"/>
+          <w:szCs w:val="24"/>
+        </w:rPr>
+        <w:t>- Las puntuaciones y recomendaciones reflejan la satisfacción del cliente y pueden influir en la demanda y en el valor del vehículo.</w:t>
+      </w:r>
+    </w:p>
+    <w:p>
+      <w:pPr>
+        <w:pStyle w:val="Prrafodelista"/>
+        <w:jc w:val="both"/>
+        <w:rPr>
+          <w:rFonts w:ascii="Arial" w:hAnsi="Arial" w:cs="Arial"/>
+          <w:sz w:val="24"/>
+          <w:szCs w:val="24"/>
+        </w:rPr>
+      </w:pPr>
+    </w:p>
+    <w:p>
+      <w:pPr>
+        <w:pStyle w:val="Ttulo2"/>
+        <w:numPr>
+          <w:ilvl w:val="1"/>
+          <w:numId w:val="1"/>
+        </w:numPr>
+        <w:spacing w:line="276" w:lineRule="auto"/>
+        <w:jc w:val="both"/>
+        <w:rPr>
+          <w:rFonts w:ascii="Arial" w:hAnsi="Arial" w:cs="Arial"/>
+          <w:b/>
+          <w:color w:val="auto"/>
+          <w:sz w:val="28"/>
+        </w:rPr>
+      </w:pPr>
+      <w:r>
+        <w:rPr>
+          <w:rFonts w:ascii="Arial" w:hAnsi="Arial" w:cs="Arial"/>
+          <w:b/>
+          <w:color w:val="auto"/>
+          <w:sz w:val="28"/>
+        </w:rPr>
+        <w:t>Definici</w:t>
+      </w:r>
+      <w:r>
+        <w:rPr>
+          <w:rFonts w:ascii="Arial" w:hAnsi="Arial" w:cs="Arial"/>
+          <w:b/>
+          <w:color w:val="auto"/>
+          <w:sz w:val="28"/>
+        </w:rPr>
+        <w:t>ó</w:t>
+      </w:r>
+      <w:r>
+        <w:rPr>
+          <w:rFonts w:ascii="Arial" w:hAnsi="Arial" w:cs="Arial"/>
+          <w:b/>
+          <w:color w:val="auto"/>
+          <w:sz w:val="28"/>
+        </w:rPr>
+        <w:t>n de Objetivos de Miner</w:t>
+      </w:r>
+      <w:r>
+        <w:rPr>
+          <w:rFonts w:ascii="Arial" w:hAnsi="Arial" w:cs="Arial"/>
+          <w:b/>
+          <w:color w:val="auto"/>
+          <w:sz w:val="28"/>
+        </w:rPr>
+        <w:t>í</w:t>
+      </w:r>
+      <w:r>
+        <w:rPr>
+          <w:rFonts w:ascii="Arial" w:hAnsi="Arial" w:cs="Arial"/>
+          <w:b/>
+          <w:color w:val="auto"/>
+          <w:sz w:val="28"/>
+        </w:rPr>
+        <w:t>a</w:t>
+      </w:r>
+    </w:p>
+    <w:p>
+      <w:pPr>
+        <w:pStyle w:val="Prrafodelista"/>
+        <w:numPr>
+          <w:ilvl w:val="0"/>
+          <w:numId w:val="8"/>
+        </w:numPr>
+        <w:jc w:val="both"/>
+        <w:rPr>
+          <w:rFonts w:ascii="Arial" w:hAnsi="Arial" w:cs="Arial"/>
+          <w:sz w:val="24"/>
+          <w:szCs w:val="24"/>
+        </w:rPr>
+      </w:pPr>
+      <w:r>
+        <w:rPr>
+          <w:rFonts w:ascii="Arial" w:hAnsi="Arial" w:cs="Arial"/>
+          <w:sz w:val="24"/>
+          <w:szCs w:val="24"/>
+        </w:rPr>
+        <w:t>¿Qué características determinan el precio de un vehículo?</w:t>
+      </w:r>
+    </w:p>
+    <w:p>
+      <w:pPr>
+        <w:pStyle w:val="Prrafodelista"/>
+        <w:jc w:val="both"/>
+        <w:rPr>
+          <w:rFonts w:ascii="Arial" w:hAnsi="Arial" w:cs="Arial"/>
+          <w:sz w:val="24"/>
+          <w:szCs w:val="24"/>
+        </w:rPr>
+      </w:pPr>
+    </w:p>
+    <w:p>
+      <w:pPr>
+        <w:pStyle w:val="Prrafodelista"/>
+        <w:ind w:left="0"/>
+        <w:jc w:val="both"/>
+        <w:rPr>
+          <w:rFonts w:ascii="Arial" w:hAnsi="Arial" w:cs="Arial"/>
+          <w:sz w:val="24"/>
+          <w:szCs w:val="24"/>
+        </w:rPr>
+      </w:pPr>
+      <w:r>
+        <w:rPr>
+          <w:rFonts w:ascii="Arial" w:hAnsi="Arial" w:cs="Arial"/>
+          <w:sz w:val="24"/>
+          <w:szCs w:val="24"/>
+        </w:rPr>
+        <w:t>Se plantea analizar qué variables técnicas (potencia, consumo, emisiones), comerciales (segmento, marca) y de percepción del cliente influyen de forma significativa en el precio del vehículo.</w:t>
+      </w:r>
+    </w:p>
+    <w:p>
+      <w:pPr>
+        <w:pStyle w:val="Prrafodelista"/>
+        <w:ind w:left="0"/>
+        <w:jc w:val="both"/>
+        <w:rPr>
+          <w:rFonts w:ascii="Arial" w:hAnsi="Arial" w:cs="Arial"/>
+          <w:sz w:val="24"/>
+          <w:szCs w:val="24"/>
+        </w:rPr>
+      </w:pPr>
+    </w:p>
+    <w:p>
+      <w:pPr>
+        <w:pStyle w:val="Prrafodelista"/>
+        <w:numPr>
+          <w:ilvl w:val="0"/>
+          <w:numId w:val="8"/>
+        </w:numPr>
+        <w:jc w:val="both"/>
+        <w:rPr>
+          <w:rFonts w:ascii="Arial" w:hAnsi="Arial" w:cs="Arial"/>
+          <w:sz w:val="24"/>
+          <w:szCs w:val="24"/>
+        </w:rPr>
+      </w:pPr>
+      <w:r>
+        <w:rPr>
+          <w:rFonts w:ascii="Arial" w:hAnsi="Arial" w:cs="Arial"/>
+          <w:sz w:val="24"/>
+          <w:szCs w:val="24"/>
+        </w:rPr>
+        <w:t>¿Podemos segmentar vehículos por perfil de uso y eficiencia?</w:t>
+      </w:r>
+    </w:p>
+    <w:p>
+      <w:pPr>
+        <w:pStyle w:val="Prrafodelista"/>
+        <w:jc w:val="both"/>
+        <w:rPr>
+          <w:rFonts w:ascii="Arial" w:hAnsi="Arial" w:cs="Arial"/>
+          <w:sz w:val="24"/>
+          <w:szCs w:val="24"/>
+        </w:rPr>
+      </w:pPr>
+    </w:p>
+    <w:p>
+      <w:pPr>
+        <w:pStyle w:val="Prrafodelista"/>
+        <w:ind w:left="0"/>
+        <w:jc w:val="both"/>
+        <w:rPr>
+          <w:rFonts w:ascii="Arial" w:hAnsi="Arial" w:cs="Arial"/>
+          <w:sz w:val="24"/>
+          <w:szCs w:val="24"/>
+        </w:rPr>
+      </w:pPr>
+      <w:r>
+        <w:rPr>
+          <w:rFonts w:ascii="Arial" w:hAnsi="Arial" w:cs="Arial"/>
+          <w:sz w:val="24"/>
+          <w:szCs w:val="24"/>
+        </w:rPr>
+        <w:t>Se propone segmentar los vehículos en función de su perfil de uso y eficiencia energética, utilizando variables como consumo, emisiones, tipo de combustible y kilometraje.</w:t>
+      </w:r>
+    </w:p>
+    <w:p>
+      <w:pPr>
+        <w:pStyle w:val="Prrafodelista"/>
+        <w:ind w:left="0"/>
+        <w:jc w:val="both"/>
+        <w:rPr>
+          <w:rFonts w:ascii="Arial" w:hAnsi="Arial" w:cs="Arial"/>
+          <w:sz w:val="24"/>
+          <w:szCs w:val="24"/>
+        </w:rPr>
+      </w:pPr>
+    </w:p>
+    <w:p>
+      <w:pPr>
+        <w:pStyle w:val="Prrafodelista"/>
+        <w:numPr>
+          <w:ilvl w:val="0"/>
+          <w:numId w:val="8"/>
+        </w:numPr>
+        <w:jc w:val="both"/>
+        <w:rPr>
+          <w:rFonts w:ascii="Arial" w:hAnsi="Arial" w:cs="Arial"/>
+          <w:sz w:val="24"/>
+          <w:szCs w:val="24"/>
+        </w:rPr>
+      </w:pPr>
+      <w:r>
+        <w:rPr>
+          <w:rFonts w:ascii="Arial" w:hAnsi="Arial" w:cs="Arial"/>
+          <w:sz w:val="24"/>
+          <w:szCs w:val="24"/>
+        </w:rPr>
+        <w:t>¿Qué factores predicen los costes de mantenimiento?</w:t>
+      </w:r>
+    </w:p>
+    <w:p>
+      <w:pPr>
+        <w:pStyle w:val="Prrafodelista"/>
+        <w:jc w:val="both"/>
+        <w:rPr>
+          <w:rFonts w:ascii="Arial" w:hAnsi="Arial" w:cs="Arial"/>
+          <w:sz w:val="24"/>
+          <w:szCs w:val="24"/>
+        </w:rPr>
+      </w:pPr>
+    </w:p>
+    <w:p>
+      <w:pPr>
+        <w:pStyle w:val="Prrafodelista"/>
+        <w:ind w:left="0"/>
+        <w:jc w:val="both"/>
+        <w:rPr>
+          <w:rFonts w:ascii="Arial" w:hAnsi="Arial" w:cs="Arial"/>
+          <w:sz w:val="24"/>
+          <w:szCs w:val="24"/>
+        </w:rPr>
+      </w:pPr>
+      <w:r>
+        <w:rPr>
+          <w:rFonts w:ascii="Arial" w:hAnsi="Arial" w:cs="Arial"/>
+          <w:sz w:val="24"/>
+          <w:szCs w:val="24"/>
+        </w:rPr>
+        <w:t>Se analizará la relación entre antigüedad, kilometraje, incidencias mecánicas, marca y costes de mantenimiento anual para identificar los factores que influyen en el gasto de mantenimiento.</w:t>
+      </w:r>
+    </w:p>
+    <w:p>
+      <w:pPr>
+        <w:pStyle w:val="Prrafodelista"/>
+        <w:ind w:left="0"/>
+        <w:jc w:val="both"/>
+        <w:rPr>
+          <w:rFonts w:ascii="Arial" w:hAnsi="Arial" w:cs="Arial"/>
+          <w:sz w:val="24"/>
+          <w:szCs w:val="24"/>
+        </w:rPr>
+      </w:pPr>
+    </w:p>
+    <w:p>
+      <w:pPr>
+        <w:pStyle w:val="Prrafodelista"/>
+        <w:numPr>
+          <w:ilvl w:val="0"/>
+          <w:numId w:val="8"/>
+        </w:numPr>
+        <w:jc w:val="both"/>
+        <w:rPr>
+          <w:rFonts w:ascii="Arial" w:hAnsi="Arial" w:cs="Arial"/>
+          <w:sz w:val="24"/>
+          <w:szCs w:val="24"/>
+        </w:rPr>
+      </w:pPr>
+      <w:r>
+        <w:rPr>
+          <w:rFonts w:ascii="Arial" w:hAnsi="Arial" w:cs="Arial"/>
+          <w:sz w:val="24"/>
+          <w:szCs w:val="24"/>
+        </w:rPr>
+        <w:t>¿Existen patrones en las ventas por temporada y región?</w:t>
+      </w:r>
+    </w:p>
+    <w:p>
+      <w:pPr>
+        <w:pStyle w:val="Prrafodelista"/>
+        <w:jc w:val="both"/>
+        <w:rPr>
+          <w:rFonts w:ascii="Arial" w:hAnsi="Arial" w:cs="Arial"/>
+          <w:sz w:val="24"/>
+          <w:szCs w:val="24"/>
+        </w:rPr>
+      </w:pPr>
+    </w:p>
+    <w:p>
+      <w:pPr>
+        <w:pStyle w:val="Prrafodelista"/>
+        <w:ind w:left="0"/>
+        <w:jc w:val="both"/>
+        <w:rPr>
+          <w:rFonts w:ascii="Arial" w:hAnsi="Arial" w:cs="Arial"/>
+          <w:sz w:val="24"/>
+          <w:szCs w:val="24"/>
+        </w:rPr>
+      </w:pPr>
+      <w:r>
+        <w:rPr>
+          <w:rFonts w:ascii="Arial" w:hAnsi="Arial" w:cs="Arial"/>
+          <w:sz w:val="24"/>
+          <w:szCs w:val="24"/>
+        </w:rPr>
+        <w:t>Se estudiarán posibles patrones temporales y geográficos en las ventas de vehículos, considerando la fecha de venta y la región del vendedor.</w:t>
+      </w:r>
+    </w:p>
+    <w:p>
+      <w:pPr>
+        <w:pStyle w:val="Prrafodelista"/>
+        <w:ind w:left="0"/>
+        <w:jc w:val="both"/>
+        <w:rPr>
+          <w:rFonts w:ascii="Arial" w:hAnsi="Arial" w:cs="Arial"/>
+          <w:sz w:val="24"/>
+          <w:szCs w:val="24"/>
+        </w:rPr>
+      </w:pPr>
+    </w:p>
+    <w:p>
+      <w:pPr>
+        <w:pStyle w:val="Prrafodelista"/>
+        <w:numPr>
+          <w:ilvl w:val="0"/>
+          <w:numId w:val="8"/>
+        </w:numPr>
+        <w:jc w:val="both"/>
+        <w:rPr>
+          <w:rFonts w:ascii="Arial" w:hAnsi="Arial" w:cs="Arial"/>
+          <w:sz w:val="24"/>
+          <w:szCs w:val="24"/>
+        </w:rPr>
+      </w:pPr>
+      <w:r>
+        <w:rPr>
+          <w:rFonts w:ascii="Arial" w:hAnsi="Arial" w:cs="Arial"/>
+          <w:sz w:val="24"/>
+          <w:szCs w:val="24"/>
+        </w:rPr>
+        <w:t>¿Cómo predecir el valor residual de un vehículo?</w:t>
+      </w:r>
+    </w:p>
+    <w:p>
+      <w:pPr>
+        <w:pStyle w:val="Prrafodelista"/>
+        <w:jc w:val="both"/>
+        <w:rPr>
+          <w:rFonts w:ascii="Arial" w:hAnsi="Arial" w:cs="Arial"/>
+          <w:sz w:val="24"/>
+          <w:szCs w:val="24"/>
+        </w:rPr>
+      </w:pPr>
+    </w:p>
+    <w:p>
+      <w:pPr>
+        <w:pStyle w:val="Prrafodelista"/>
+        <w:ind w:left="0"/>
+        <w:jc w:val="both"/>
+        <w:rPr>
+          <w:rFonts w:ascii="Arial" w:hAnsi="Arial" w:cs="Arial"/>
+          <w:sz w:val="24"/>
+          <w:szCs w:val="24"/>
+        </w:rPr>
+      </w:pPr>
+      <w:r>
+        <w:rPr>
+          <w:rFonts w:ascii="Arial" w:hAnsi="Arial" w:cs="Arial"/>
+          <w:sz w:val="24"/>
+          <w:szCs w:val="24"/>
+        </w:rPr>
+        <w:t>Se plantea la construcción de modelos predictivos que permitan estimar el valor residual del vehículo a partir de características técnicas, de uso, mantenimiento y percepción del cliente.</w:t>
+      </w:r>
+    </w:p>
+    <w:p>
+      <w:pPr>
+        <w:pStyle w:val="Prrafodelista"/>
+        <w:ind w:left="0"/>
+        <w:jc w:val="both"/>
+        <w:rPr>
+          <w:rFonts w:ascii="Arial" w:hAnsi="Arial" w:cs="Arial"/>
+          <w:sz w:val="24"/>
+          <w:szCs w:val="24"/>
+        </w:rPr>
+      </w:pPr>
+    </w:p>
+    <w:p>
+      <w:pPr>
+        <w:pStyle w:val="Prrafodelista"/>
+        <w:numPr>
+          <w:ilvl w:val="0"/>
+          <w:numId w:val="8"/>
+        </w:numPr>
+        <w:jc w:val="both"/>
+        <w:rPr>
+          <w:rFonts w:ascii="Arial" w:hAnsi="Arial" w:cs="Arial"/>
+          <w:sz w:val="24"/>
+          <w:szCs w:val="24"/>
+        </w:rPr>
+      </w:pPr>
+      <w:r>
+        <w:rPr>
+          <w:rFonts w:ascii="Arial" w:hAnsi="Arial" w:cs="Arial"/>
+          <w:sz w:val="24"/>
+          <w:szCs w:val="24"/>
+        </w:rPr>
+        <w:t>¿Influye la percepción del cliente en el precio del vehículo?</w:t>
+      </w:r>
+    </w:p>
+    <w:p>
+      <w:pPr>
+        <w:pStyle w:val="Prrafodelista"/>
+        <w:jc w:val="both"/>
+        <w:rPr>
+          <w:rFonts w:ascii="Arial" w:hAnsi="Arial" w:cs="Arial"/>
+          <w:sz w:val="24"/>
+          <w:szCs w:val="24"/>
+        </w:rPr>
+      </w:pPr>
+    </w:p>
+    <w:p>
+      <w:pPr>
+        <w:pStyle w:val="Prrafodelista"/>
+        <w:ind w:left="0"/>
+        <w:jc w:val="both"/>
+        <w:rPr>
+          <w:rFonts w:ascii="Arial" w:hAnsi="Arial" w:cs="Arial"/>
+          <w:sz w:val="24"/>
+          <w:szCs w:val="24"/>
+        </w:rPr>
+      </w:pPr>
+      <w:r>
+        <w:rPr>
+          <w:rFonts w:ascii="Arial" w:hAnsi="Arial" w:cs="Arial"/>
+          <w:sz w:val="24"/>
+          <w:szCs w:val="24"/>
+        </w:rPr>
+        <w:t>Dado que se dispone de información sobre valoraciones y recomendaciones de los clientes, resulta relevante analizar si estas opiniones del vehículo influye</w:t>
+      </w:r>
+      <w:r>
+        <w:rPr>
+          <w:rFonts w:ascii="Arial" w:hAnsi="Arial" w:cs="Arial"/>
+          <w:sz w:val="24"/>
+          <w:szCs w:val="24"/>
+        </w:rPr>
+        <w:t>n</w:t>
+      </w:r>
+      <w:r>
+        <w:rPr>
+          <w:rFonts w:ascii="Arial" w:hAnsi="Arial" w:cs="Arial"/>
+          <w:sz w:val="24"/>
+          <w:szCs w:val="24"/>
+        </w:rPr>
+        <w:t xml:space="preserve"> en su valor.</w:t>
+      </w:r>
+    </w:p>
+    <w:p>
+      <w:pPr>
+        <w:pStyle w:val="Prrafodelista"/>
+        <w:ind w:left="0"/>
+        <w:jc w:val="both"/>
+        <w:rPr>
+          <w:rFonts w:ascii="Arial" w:hAnsi="Arial" w:cs="Arial"/>
+          <w:sz w:val="24"/>
+          <w:szCs w:val="24"/>
+        </w:rPr>
+      </w:pPr>
+    </w:p>
+    <w:p>
+      <w:pPr>
+        <w:pStyle w:val="Prrafodelista"/>
+        <w:numPr>
+          <w:ilvl w:val="0"/>
+          <w:numId w:val="8"/>
+        </w:numPr>
+        <w:jc w:val="both"/>
+        <w:rPr>
+          <w:rFonts w:ascii="Arial" w:hAnsi="Arial" w:cs="Arial"/>
+          <w:sz w:val="24"/>
+          <w:szCs w:val="24"/>
+        </w:rPr>
+      </w:pPr>
+      <w:r>
+        <w:rPr>
+          <w:rFonts w:ascii="Arial" w:hAnsi="Arial" w:cs="Arial"/>
+          <w:sz w:val="24"/>
+          <w:szCs w:val="24"/>
+        </w:rPr>
+        <w:t>¿Es posible detectar vehículos con precios anormales a partir de sus características?</w:t>
+      </w:r>
+    </w:p>
+    <w:p>
+      <w:pPr>
+        <w:pStyle w:val="Prrafodelista"/>
+        <w:jc w:val="both"/>
+        <w:rPr>
+          <w:rFonts w:ascii="Arial" w:hAnsi="Arial" w:cs="Arial"/>
+          <w:sz w:val="24"/>
+          <w:szCs w:val="24"/>
+          <w:u w:val="single"/>
+        </w:rPr>
+      </w:pPr>
+    </w:p>
+    <w:p>
+      <w:pPr>
+        <w:pStyle w:val="Prrafodelista"/>
+        <w:ind w:left="0"/>
+        <w:jc w:val="both"/>
+        <w:rPr>
+          <w:rFonts w:ascii="Arial" w:hAnsi="Arial" w:cs="Arial"/>
+          <w:sz w:val="24"/>
+          <w:szCs w:val="24"/>
+        </w:rPr>
+      </w:pPr>
+      <w:r>
+        <w:rPr>
+          <w:rFonts w:ascii="Arial" w:hAnsi="Arial" w:cs="Arial"/>
+          <w:sz w:val="24"/>
+          <w:szCs w:val="24"/>
+        </w:rPr>
+        <w:t>Posibilidad de identificar vehículos con precios anormales mediante el uso de técnicas de detección de anomalías basadas en características técnicas, de uso y de mantenimiento.</w:t>
       </w:r>
     </w:p>
     <w:p>
@@ -4607,55 +7811,7 @@
           <w:rFonts w:ascii="Arial" w:hAnsi="Arial" w:cs="Arial"/>
           <w:sz w:val="24"/>
         </w:rPr>
-        <w:t xml:space="preserve"> una unión (</w:t>
-      </w:r>
-      <w:proofErr w:type="spellStart"/>
-      <w:r>
-        <w:rPr>
-          <w:rFonts w:ascii="Arial" w:hAnsi="Arial" w:cs="Arial"/>
-          <w:sz w:val="24"/>
-        </w:rPr>
-        <w:t>Left</w:t>
-      </w:r>
-      <w:proofErr w:type="spellEnd"/>
-      <w:r>
-        <w:rPr>
-          <w:rFonts w:ascii="Arial" w:hAnsi="Arial" w:cs="Arial"/>
-          <w:sz w:val="24"/>
-        </w:rPr>
-        <w:t xml:space="preserve"> </w:t>
-      </w:r>
-      <w:proofErr w:type="spellStart"/>
-      <w:r>
-        <w:rPr>
-          <w:rFonts w:ascii="Arial" w:hAnsi="Arial" w:cs="Arial"/>
-          <w:sz w:val="24"/>
-        </w:rPr>
-        <w:t>Join</w:t>
-      </w:r>
-      <w:proofErr w:type="spellEnd"/>
-      <w:r>
-        <w:rPr>
-          <w:rFonts w:ascii="Arial" w:hAnsi="Arial" w:cs="Arial"/>
-          <w:sz w:val="24"/>
-        </w:rPr>
-        <w:t>) entre el histórico de ventas y el catálogo de vehículos. Dado que la cardinalidad es de N</w:t>
-      </w:r>
-      <w:proofErr w:type="gramStart"/>
-      <w:r>
-        <w:rPr>
-          <w:rFonts w:ascii="Arial" w:hAnsi="Arial" w:cs="Arial"/>
-          <w:sz w:val="24"/>
-        </w:rPr>
-        <w:t>:1</w:t>
-      </w:r>
-      <w:proofErr w:type="gramEnd"/>
-      <w:r>
-        <w:rPr>
-          <w:rFonts w:ascii="Arial" w:hAnsi="Arial" w:cs="Arial"/>
-          <w:sz w:val="24"/>
-        </w:rPr>
-        <w:t xml:space="preserve"> (muchas ventas pueden referirse al mismo modelo de coche), esta operación es segura y enriquece cada venta con sus especificaciones técnicas sin alterar el número de registros (600 transacciones).</w:t>
+        <w:t xml:space="preserve"> una unión (Left Join) entre el histórico de ventas y el catálogo de vehículos. Dado que la cardinalidad es de N:1 (muchas ventas pueden referirse al mismo modelo de coche), esta operación es segura y enriquece cada venta con sus especificaciones técnicas sin alterar el número de registros (600 transacciones).</w:t>
       </w:r>
     </w:p>
     <w:p>
@@ -4810,7 +7966,6 @@
           <w:sz w:val="24"/>
           <w:lang w:eastAsia="es-ES"/>
         </w:rPr>
-        <w:lastRenderedPageBreak/>
         <w:drawing>
           <wp:inline distT="0" distB="0" distL="0" distR="0" wp14:anchorId="3DC48EF6" wp14:editId="41ABCA44">
             <wp:extent cx="5400040" cy="3309620"/>
@@ -4827,7 +7982,7 @@
                     <pic:cNvPicPr/>
                   </pic:nvPicPr>
                   <pic:blipFill>
-                    <a:blip r:embed="rId10"/>
+                    <a:blip r:embed="rId17"/>
                     <a:stretch>
                       <a:fillRect/>
                     </a:stretch>
@@ -4991,39 +8146,7 @@
           <w:rFonts w:ascii="Arial" w:hAnsi="Arial" w:cs="Arial"/>
           <w:sz w:val="24"/>
         </w:rPr>
-        <w:t>en algoritmos basados en distancia (como K-</w:t>
-      </w:r>
-      <w:proofErr w:type="spellStart"/>
-      <w:r>
-        <w:rPr>
-          <w:rFonts w:ascii="Arial" w:hAnsi="Arial" w:cs="Arial"/>
-          <w:sz w:val="24"/>
-        </w:rPr>
-        <w:t>Nearest</w:t>
-      </w:r>
-      <w:proofErr w:type="spellEnd"/>
-      <w:r>
-        <w:rPr>
-          <w:rFonts w:ascii="Arial" w:hAnsi="Arial" w:cs="Arial"/>
-          <w:sz w:val="24"/>
-        </w:rPr>
-        <w:t xml:space="preserve"> </w:t>
-      </w:r>
-      <w:proofErr w:type="spellStart"/>
-      <w:r>
-        <w:rPr>
-          <w:rFonts w:ascii="Arial" w:hAnsi="Arial" w:cs="Arial"/>
-          <w:sz w:val="24"/>
-        </w:rPr>
-        <w:t>Neighbors</w:t>
-      </w:r>
-      <w:proofErr w:type="spellEnd"/>
-      <w:r>
-        <w:rPr>
-          <w:rFonts w:ascii="Arial" w:hAnsi="Arial" w:cs="Arial"/>
-          <w:sz w:val="24"/>
-        </w:rPr>
-        <w:t xml:space="preserve"> o SVM), </w:t>
+        <w:t xml:space="preserve">en algoritmos basados en distancia (como K-Nearest Neighbors o SVM), </w:t>
       </w:r>
       <w:r>
         <w:rPr>
@@ -5078,7 +8201,6 @@
           <w:color w:val="auto"/>
           <w:sz w:val="28"/>
         </w:rPr>
-        <w:lastRenderedPageBreak/>
         <w:t>Ingeniería de características</w:t>
       </w:r>
     </w:p>
@@ -5661,15 +8783,7 @@
           <w:rFonts w:ascii="Arial" w:hAnsi="Arial" w:cs="Arial"/>
           <w:sz w:val="24"/>
         </w:rPr>
-        <w:t xml:space="preserve">), los modelos pueden llegar a pensar que el 4 es el doble que el 2 y eso no es real, sino que queremos ver si el tipo de combustible dispara el precio. Del mismo modo que en las regiones vamos a mantener las 4 variables dummies </w:t>
-      </w:r>
-      <w:r>
-        <w:rPr>
-          <w:rFonts w:ascii="Arial" w:hAnsi="Arial" w:cs="Arial"/>
-          <w:sz w:val="24"/>
-        </w:rPr>
-        <w:lastRenderedPageBreak/>
-        <w:t>creadas para ver todas las relaciones. Pero en la fase de modelado tendremos que quitar una de ellas para evitar la colinealidad perfecta.</w:t>
+        <w:t>), los modelos pueden llegar a pensar que el 4 es el doble que el 2 y eso no es real, sino que queremos ver si el tipo de combustible dispara el precio. Del mismo modo que en las regiones vamos a mantener las 4 variables dummies creadas para ver todas las relaciones. Pero en la fase de modelado tendremos que quitar una de ellas para evitar la colinealidad perfecta.</w:t>
       </w:r>
     </w:p>
     <w:p>
@@ -5763,6 +8877,9 @@
     </w:p>
     <w:p>
       <w:r>
+        <w:rPr>
+          <w:noProof/>
+        </w:rPr>
         <w:drawing>
           <wp:inline distT="0" distB="0" distL="0" distR="0" wp14:anchorId="0C449E4C" wp14:editId="560EA78A">
             <wp:extent cx="5400040" cy="4577080"/>
@@ -5779,7 +8896,7 @@
                     <pic:cNvPicPr/>
                   </pic:nvPicPr>
                   <pic:blipFill>
-                    <a:blip r:embed="rId11"/>
+                    <a:blip r:embed="rId18"/>
                     <a:stretch>
                       <a:fillRect/>
                     </a:stretch>
@@ -5904,7 +9021,6 @@
           <w:sz w:val="24"/>
           <w:u w:val="single"/>
         </w:rPr>
-        <w:lastRenderedPageBreak/>
         <w:t>Fecha de venta</w:t>
       </w:r>
       <w:r>
@@ -5968,8 +9084,6 @@
         </w:rPr>
         <w:t>Otras consideraciones a tener en cuenta es la eliminación de los identificadores. Los cuales se mantienen para poder identificar el coche, pero estas nunca se usarán para entrenar sino que habrá que excluirlas a la de entrenar los modelos. Y habrá que tener en cuenta también que no se ha eliminado ninguna de las variables dummies creadas de modo que podría provocar redundancia en los modelos por lo que a la hora de entrenar modelos si se usan esas variables tendremos que eliminar una de las variables para evitar la colinealidad perfecta.</w:t>
       </w:r>
-      <w:bookmarkStart w:id="0" w:name="_GoBack"/>
-      <w:bookmarkEnd w:id="0"/>
     </w:p>
     <w:p>
       <w:pPr>
@@ -6021,7 +9135,7 @@
     </w:p>
     <w:p/>
     <w:sectPr>
-      <w:footerReference w:type="default" r:id="rId12"/>
+      <w:footerReference w:type="default" r:id="rId19"/>
       <w:pgSz w:w="11906" w:h="16838"/>
       <w:pgMar w:top="1417" w:right="1701" w:bottom="1417" w:left="1701" w:header="708" w:footer="708" w:gutter="0"/>
       <w:cols w:space="708"/>
@@ -6033,7 +9147,7 @@
 </file>
 
 <file path=word/endnotes.xml><?xml version="1.0" encoding="utf-8"?>
-<w:endnotes xmlns:wpc="http://schemas.microsoft.com/office/word/2010/wordprocessingCanvas" xmlns:mc="http://schemas.openxmlformats.org/markup-compatibility/2006" xmlns:o="urn:schemas-microsoft-com:office:office" xmlns:r="http://schemas.openxmlformats.org/officeDocument/2006/relationships" xmlns:m="http://schemas.openxmlformats.org/officeDocument/2006/math" xmlns:v="urn:schemas-microsoft-com:vml" xmlns:wp14="http://schemas.microsoft.com/office/word/2010/wordprocessingDrawing" xmlns:wp="http://schemas.openxmlformats.org/drawingml/2006/wordprocessingDrawing" xmlns:w10="urn:schemas-microsoft-com:office:word" xmlns:w="http://schemas.openxmlformats.org/wordprocessingml/2006/main" xmlns:w14="http://schemas.microsoft.com/office/word/2010/wordml" xmlns:w15="http://schemas.microsoft.com/office/word/2012/wordml" xmlns:wpg="http://schemas.microsoft.com/office/word/2010/wordprocessingGroup" xmlns:wpi="http://schemas.microsoft.com/office/word/2010/wordprocessingInk" xmlns:wne="http://schemas.microsoft.com/office/word/2006/wordml" xmlns:wps="http://schemas.microsoft.com/office/word/2010/wordprocessingShape" mc:Ignorable="w14 w15 wp14">
+<w:endnotes xmlns:wpc="http://schemas.microsoft.com/office/word/2010/wordprocessingCanvas" xmlns:cx="http://schemas.microsoft.com/office/drawing/2014/chartex" xmlns:cx1="http://schemas.microsoft.com/office/drawing/2015/9/8/chartex" xmlns:cx2="http://schemas.microsoft.com/office/drawing/2015/10/21/chartex" xmlns:cx3="http://schemas.microsoft.com/office/drawing/2016/5/9/chartex" xmlns:cx4="http://schemas.microsoft.com/office/drawing/2016/5/10/chartex" xmlns:cx5="http://schemas.microsoft.com/office/drawing/2016/5/11/chartex" xmlns:cx6="http://schemas.microsoft.com/office/drawing/2016/5/12/chartex" xmlns:cx7="http://schemas.microsoft.com/office/drawing/2016/5/13/chartex" xmlns:cx8="http://schemas.microsoft.com/office/drawing/2016/5/14/chartex" xmlns:mc="http://schemas.openxmlformats.org/markup-compatibility/2006" xmlns:aink="http://schemas.microsoft.com/office/drawing/2016/ink" xmlns:am3d="http://schemas.microsoft.com/office/drawing/2017/model3d" xmlns:o="urn:schemas-microsoft-com:office:office" xmlns:oel="http://schemas.microsoft.com/office/2019/extlst" xmlns:r="http://schemas.openxmlformats.org/officeDocument/2006/relationships" xmlns:m="http://schemas.openxmlformats.org/officeDocument/2006/math" xmlns:v="urn:schemas-microsoft-com:vml" xmlns:wp14="http://schemas.microsoft.com/office/word/2010/wordprocessingDrawing" xmlns:wp="http://schemas.openxmlformats.org/drawingml/2006/wordprocessingDrawing" xmlns:w10="urn:schemas-microsoft-com:office:word" xmlns:w="http://schemas.openxmlformats.org/wordprocessingml/2006/main" xmlns:w14="http://schemas.microsoft.com/office/word/2010/wordml" xmlns:w15="http://schemas.microsoft.com/office/word/2012/wordml" xmlns:w16cex="http://schemas.microsoft.com/office/word/2018/wordml/cex" xmlns:w16cid="http://schemas.microsoft.com/office/word/2016/wordml/cid" xmlns:w16="http://schemas.microsoft.com/office/word/2018/wordml" xmlns:w16du="http://schemas.microsoft.com/office/word/2023/wordml/word16du" xmlns:w16sdtdh="http://schemas.microsoft.com/office/word/2020/wordml/sdtdatahash" xmlns:w16sdtfl="http://schemas.microsoft.com/office/word/2024/wordml/sdtformatlock" xmlns:w16se="http://schemas.microsoft.com/office/word/2015/wordml/symex" xmlns:wpg="http://schemas.microsoft.com/office/word/2010/wordprocessingGroup" xmlns:wpi="http://schemas.microsoft.com/office/word/2010/wordprocessingInk" xmlns:wne="http://schemas.microsoft.com/office/word/2006/wordml" xmlns:wps="http://schemas.microsoft.com/office/word/2010/wordprocessingShape" mc:Ignorable="w14 w15 w16se w16cid w16 w16cex w16sdtdh w16sdtfl w16du wp14">
   <w:endnote w:type="separator" w:id="-1">
     <w:p>
       <w:pPr>
@@ -6058,7 +9172,7 @@
 </file>
 
 <file path=word/footer1.xml><?xml version="1.0" encoding="utf-8"?>
-<w:ftr xmlns:wpc="http://schemas.microsoft.com/office/word/2010/wordprocessingCanvas" xmlns:mc="http://schemas.openxmlformats.org/markup-compatibility/2006" xmlns:o="urn:schemas-microsoft-com:office:office" xmlns:r="http://schemas.openxmlformats.org/officeDocument/2006/relationships" xmlns:m="http://schemas.openxmlformats.org/officeDocument/2006/math" xmlns:v="urn:schemas-microsoft-com:vml" xmlns:wp14="http://schemas.microsoft.com/office/word/2010/wordprocessingDrawing" xmlns:wp="http://schemas.openxmlformats.org/drawingml/2006/wordprocessingDrawing" xmlns:w10="urn:schemas-microsoft-com:office:word" xmlns:w="http://schemas.openxmlformats.org/wordprocessingml/2006/main" xmlns:w14="http://schemas.microsoft.com/office/word/2010/wordml" xmlns:w15="http://schemas.microsoft.com/office/word/2012/wordml" xmlns:wpg="http://schemas.microsoft.com/office/word/2010/wordprocessingGroup" xmlns:wpi="http://schemas.microsoft.com/office/word/2010/wordprocessingInk" xmlns:wne="http://schemas.microsoft.com/office/word/2006/wordml" xmlns:wps="http://schemas.microsoft.com/office/word/2010/wordprocessingShape" mc:Ignorable="w14 w15 wp14">
+<w:ftr xmlns:wpc="http://schemas.microsoft.com/office/word/2010/wordprocessingCanvas" xmlns:cx="http://schemas.microsoft.com/office/drawing/2014/chartex" xmlns:cx1="http://schemas.microsoft.com/office/drawing/2015/9/8/chartex" xmlns:cx2="http://schemas.microsoft.com/office/drawing/2015/10/21/chartex" xmlns:cx3="http://schemas.microsoft.com/office/drawing/2016/5/9/chartex" xmlns:cx4="http://schemas.microsoft.com/office/drawing/2016/5/10/chartex" xmlns:cx5="http://schemas.microsoft.com/office/drawing/2016/5/11/chartex" xmlns:cx6="http://schemas.microsoft.com/office/drawing/2016/5/12/chartex" xmlns:cx7="http://schemas.microsoft.com/office/drawing/2016/5/13/chartex" xmlns:cx8="http://schemas.microsoft.com/office/drawing/2016/5/14/chartex" xmlns:mc="http://schemas.openxmlformats.org/markup-compatibility/2006" xmlns:aink="http://schemas.microsoft.com/office/drawing/2016/ink" xmlns:am3d="http://schemas.microsoft.com/office/drawing/2017/model3d" xmlns:o="urn:schemas-microsoft-com:office:office" xmlns:oel="http://schemas.microsoft.com/office/2019/extlst" xmlns:r="http://schemas.openxmlformats.org/officeDocument/2006/relationships" xmlns:m="http://schemas.openxmlformats.org/officeDocument/2006/math" xmlns:v="urn:schemas-microsoft-com:vml" xmlns:wp14="http://schemas.microsoft.com/office/word/2010/wordprocessingDrawing" xmlns:wp="http://schemas.openxmlformats.org/drawingml/2006/wordprocessingDrawing" xmlns:w10="urn:schemas-microsoft-com:office:word" xmlns:w="http://schemas.openxmlformats.org/wordprocessingml/2006/main" xmlns:w14="http://schemas.microsoft.com/office/word/2010/wordml" xmlns:w15="http://schemas.microsoft.com/office/word/2012/wordml" xmlns:w16cex="http://schemas.microsoft.com/office/word/2018/wordml/cex" xmlns:w16cid="http://schemas.microsoft.com/office/word/2016/wordml/cid" xmlns:w16="http://schemas.microsoft.com/office/word/2018/wordml" xmlns:w16du="http://schemas.microsoft.com/office/word/2023/wordml/word16du" xmlns:w16sdtdh="http://schemas.microsoft.com/office/word/2020/wordml/sdtdatahash" xmlns:w16sdtfl="http://schemas.microsoft.com/office/word/2024/wordml/sdtformatlock" xmlns:w16se="http://schemas.microsoft.com/office/word/2015/wordml/symex" xmlns:wpg="http://schemas.microsoft.com/office/word/2010/wordprocessingGroup" xmlns:wpi="http://schemas.microsoft.com/office/word/2010/wordprocessingInk" xmlns:wne="http://schemas.microsoft.com/office/word/2006/wordml" xmlns:wps="http://schemas.microsoft.com/office/word/2010/wordprocessingShape" mc:Ignorable="w14 w15 w16se w16cid w16 w16cex w16sdtdh w16sdtfl w16du wp14">
   <w:sdt>
     <w:sdtPr>
       <w:id w:val="91983412"/>
@@ -6103,7 +9217,7 @@
 </file>
 
 <file path=word/footnotes.xml><?xml version="1.0" encoding="utf-8"?>
-<w:footnotes xmlns:wpc="http://schemas.microsoft.com/office/word/2010/wordprocessingCanvas" xmlns:mc="http://schemas.openxmlformats.org/markup-compatibility/2006" xmlns:o="urn:schemas-microsoft-com:office:office" xmlns:r="http://schemas.openxmlformats.org/officeDocument/2006/relationships" xmlns:m="http://schemas.openxmlformats.org/officeDocument/2006/math" xmlns:v="urn:schemas-microsoft-com:vml" xmlns:wp14="http://schemas.microsoft.com/office/word/2010/wordprocessingDrawing" xmlns:wp="http://schemas.openxmlformats.org/drawingml/2006/wordprocessingDrawing" xmlns:w10="urn:schemas-microsoft-com:office:word" xmlns:w="http://schemas.openxmlformats.org/wordprocessingml/2006/main" xmlns:w14="http://schemas.microsoft.com/office/word/2010/wordml" xmlns:w15="http://schemas.microsoft.com/office/word/2012/wordml" xmlns:wpg="http://schemas.microsoft.com/office/word/2010/wordprocessingGroup" xmlns:wpi="http://schemas.microsoft.com/office/word/2010/wordprocessingInk" xmlns:wne="http://schemas.microsoft.com/office/word/2006/wordml" xmlns:wps="http://schemas.microsoft.com/office/word/2010/wordprocessingShape" mc:Ignorable="w14 w15 wp14">
+<w:footnotes xmlns:wpc="http://schemas.microsoft.com/office/word/2010/wordprocessingCanvas" xmlns:cx="http://schemas.microsoft.com/office/drawing/2014/chartex" xmlns:cx1="http://schemas.microsoft.com/office/drawing/2015/9/8/chartex" xmlns:cx2="http://schemas.microsoft.com/office/drawing/2015/10/21/chartex" xmlns:cx3="http://schemas.microsoft.com/office/drawing/2016/5/9/chartex" xmlns:cx4="http://schemas.microsoft.com/office/drawing/2016/5/10/chartex" xmlns:cx5="http://schemas.microsoft.com/office/drawing/2016/5/11/chartex" xmlns:cx6="http://schemas.microsoft.com/office/drawing/2016/5/12/chartex" xmlns:cx7="http://schemas.microsoft.com/office/drawing/2016/5/13/chartex" xmlns:cx8="http://schemas.microsoft.com/office/drawing/2016/5/14/chartex" xmlns:mc="http://schemas.openxmlformats.org/markup-compatibility/2006" xmlns:aink="http://schemas.microsoft.com/office/drawing/2016/ink" xmlns:am3d="http://schemas.microsoft.com/office/drawing/2017/model3d" xmlns:o="urn:schemas-microsoft-com:office:office" xmlns:oel="http://schemas.microsoft.com/office/2019/extlst" xmlns:r="http://schemas.openxmlformats.org/officeDocument/2006/relationships" xmlns:m="http://schemas.openxmlformats.org/officeDocument/2006/math" xmlns:v="urn:schemas-microsoft-com:vml" xmlns:wp14="http://schemas.microsoft.com/office/word/2010/wordprocessingDrawing" xmlns:wp="http://schemas.openxmlformats.org/drawingml/2006/wordprocessingDrawing" xmlns:w10="urn:schemas-microsoft-com:office:word" xmlns:w="http://schemas.openxmlformats.org/wordprocessingml/2006/main" xmlns:w14="http://schemas.microsoft.com/office/word/2010/wordml" xmlns:w15="http://schemas.microsoft.com/office/word/2012/wordml" xmlns:w16cex="http://schemas.microsoft.com/office/word/2018/wordml/cex" xmlns:w16cid="http://schemas.microsoft.com/office/word/2016/wordml/cid" xmlns:w16="http://schemas.microsoft.com/office/word/2018/wordml" xmlns:w16du="http://schemas.microsoft.com/office/word/2023/wordml/word16du" xmlns:w16sdtdh="http://schemas.microsoft.com/office/word/2020/wordml/sdtdatahash" xmlns:w16sdtfl="http://schemas.microsoft.com/office/word/2024/wordml/sdtformatlock" xmlns:w16se="http://schemas.microsoft.com/office/word/2015/wordml/symex" xmlns:wpg="http://schemas.microsoft.com/office/word/2010/wordprocessingGroup" xmlns:wpi="http://schemas.microsoft.com/office/word/2010/wordprocessingInk" xmlns:wne="http://schemas.microsoft.com/office/word/2006/wordml" xmlns:wps="http://schemas.microsoft.com/office/word/2010/wordprocessingShape" mc:Ignorable="w14 w15 w16se w16cid w16 w16cex w16sdtdh w16sdtfl w16du wp14">
   <w:footnote w:type="separator" w:id="-1">
     <w:p>
       <w:pPr>
@@ -6128,7 +9242,7 @@
 </file>
 
 <file path=word/numbering.xml><?xml version="1.0" encoding="utf-8"?>
-<w:numbering xmlns:wpc="http://schemas.microsoft.com/office/word/2010/wordprocessingCanvas" xmlns:mc="http://schemas.openxmlformats.org/markup-compatibility/2006" xmlns:o="urn:schemas-microsoft-com:office:office" xmlns:r="http://schemas.openxmlformats.org/officeDocument/2006/relationships" xmlns:m="http://schemas.openxmlformats.org/officeDocument/2006/math" xmlns:v="urn:schemas-microsoft-com:vml" xmlns:wp14="http://schemas.microsoft.com/office/word/2010/wordprocessingDrawing" xmlns:wp="http://schemas.openxmlformats.org/drawingml/2006/wordprocessingDrawing" xmlns:w10="urn:schemas-microsoft-com:office:word" xmlns:w="http://schemas.openxmlformats.org/wordprocessingml/2006/main" xmlns:w14="http://schemas.microsoft.com/office/word/2010/wordml" xmlns:w15="http://schemas.microsoft.com/office/word/2012/wordml" xmlns:wpg="http://schemas.microsoft.com/office/word/2010/wordprocessingGroup" xmlns:wpi="http://schemas.microsoft.com/office/word/2010/wordprocessingInk" xmlns:wne="http://schemas.microsoft.com/office/word/2006/wordml" xmlns:wps="http://schemas.microsoft.com/office/word/2010/wordprocessingShape" mc:Ignorable="w14 w15 wp14">
+<w:numbering xmlns:wpc="http://schemas.microsoft.com/office/word/2010/wordprocessingCanvas" xmlns:cx="http://schemas.microsoft.com/office/drawing/2014/chartex" xmlns:cx1="http://schemas.microsoft.com/office/drawing/2015/9/8/chartex" xmlns:cx2="http://schemas.microsoft.com/office/drawing/2015/10/21/chartex" xmlns:cx3="http://schemas.microsoft.com/office/drawing/2016/5/9/chartex" xmlns:cx4="http://schemas.microsoft.com/office/drawing/2016/5/10/chartex" xmlns:cx5="http://schemas.microsoft.com/office/drawing/2016/5/11/chartex" xmlns:cx6="http://schemas.microsoft.com/office/drawing/2016/5/12/chartex" xmlns:cx7="http://schemas.microsoft.com/office/drawing/2016/5/13/chartex" xmlns:cx8="http://schemas.microsoft.com/office/drawing/2016/5/14/chartex" xmlns:mc="http://schemas.openxmlformats.org/markup-compatibility/2006" xmlns:aink="http://schemas.microsoft.com/office/drawing/2016/ink" xmlns:am3d="http://schemas.microsoft.com/office/drawing/2017/model3d" xmlns:o="urn:schemas-microsoft-com:office:office" xmlns:oel="http://schemas.microsoft.com/office/2019/extlst" xmlns:r="http://schemas.openxmlformats.org/officeDocument/2006/relationships" xmlns:m="http://schemas.openxmlformats.org/officeDocument/2006/math" xmlns:v="urn:schemas-microsoft-com:vml" xmlns:wp14="http://schemas.microsoft.com/office/word/2010/wordprocessingDrawing" xmlns:wp="http://schemas.openxmlformats.org/drawingml/2006/wordprocessingDrawing" xmlns:w10="urn:schemas-microsoft-com:office:word" xmlns:w="http://schemas.openxmlformats.org/wordprocessingml/2006/main" xmlns:w14="http://schemas.microsoft.com/office/word/2010/wordml" xmlns:w15="http://schemas.microsoft.com/office/word/2012/wordml" xmlns:w16cex="http://schemas.microsoft.com/office/word/2018/wordml/cex" xmlns:w16cid="http://schemas.microsoft.com/office/word/2016/wordml/cid" xmlns:w16="http://schemas.microsoft.com/office/word/2018/wordml" xmlns:w16du="http://schemas.microsoft.com/office/word/2023/wordml/word16du" xmlns:w16sdtdh="http://schemas.microsoft.com/office/word/2020/wordml/sdtdatahash" xmlns:w16sdtfl="http://schemas.microsoft.com/office/word/2024/wordml/sdtformatlock" xmlns:w16se="http://schemas.microsoft.com/office/word/2015/wordml/symex" xmlns:wpg="http://schemas.microsoft.com/office/word/2010/wordprocessingGroup" xmlns:wpi="http://schemas.microsoft.com/office/word/2010/wordprocessingInk" xmlns:wne="http://schemas.microsoft.com/office/word/2006/wordml" xmlns:wps="http://schemas.microsoft.com/office/word/2010/wordprocessingShape" mc:Ignorable="w14 w15 w16se w16cid w16 w16cex w16sdtdh w16sdtfl w16du wp14">
   <w:abstractNum w:abstractNumId="0" w15:restartNumberingAfterBreak="0">
     <w:nsid w:val="022A2E11"/>
     <w:multiLevelType w:val="multilevel"/>
@@ -6340,9 +9454,9 @@
     </w:lvl>
   </w:abstractNum>
   <w:abstractNum w:abstractNumId="2" w15:restartNumberingAfterBreak="0">
-    <w:nsid w:val="7D3A75FD"/>
+    <w:nsid w:val="11F50B2D"/>
     <w:multiLevelType w:val="hybridMultilevel"/>
-    <w:tmpl w:val="E148304E"/>
+    <w:tmpl w:val="FB4A0F8E"/>
     <w:lvl w:ilvl="0" w:tplc="1C8C7BB8">
       <w:start w:val="2"/>
       <w:numFmt w:val="bullet"/>
@@ -6452,20 +9566,519 @@
       </w:rPr>
     </w:lvl>
   </w:abstractNum>
-  <w:num w:numId="1">
+  <w:abstractNum w:abstractNumId="3" w15:restartNumberingAfterBreak="0">
+    <w:nsid w:val="21F140DE"/>
+    <w:multiLevelType w:val="hybridMultilevel"/>
+    <w:tmpl w:val="654A35C2"/>
+    <w:lvl w:ilvl="0" w:tplc="0C0A0001">
+      <w:start w:val="1"/>
+      <w:numFmt w:val="bullet"/>
+      <w:lvlText w:val=""/>
+      <w:lvlJc w:val="left"/>
+      <w:pPr>
+        <w:ind w:left="720" w:hanging="360"/>
+      </w:pPr>
+      <w:rPr>
+        <w:rFonts w:ascii="Symbol" w:hAnsi="Symbol" w:hint="default"/>
+      </w:rPr>
+    </w:lvl>
+    <w:lvl w:ilvl="1" w:tplc="0C0A0003" w:tentative="1">
+      <w:start w:val="1"/>
+      <w:numFmt w:val="bullet"/>
+      <w:lvlText w:val="o"/>
+      <w:lvlJc w:val="left"/>
+      <w:pPr>
+        <w:ind w:left="1440" w:hanging="360"/>
+      </w:pPr>
+      <w:rPr>
+        <w:rFonts w:ascii="Courier New" w:hAnsi="Courier New" w:cs="Courier New" w:hint="default"/>
+      </w:rPr>
+    </w:lvl>
+    <w:lvl w:ilvl="2" w:tplc="0C0A0005" w:tentative="1">
+      <w:start w:val="1"/>
+      <w:numFmt w:val="bullet"/>
+      <w:lvlText w:val=""/>
+      <w:lvlJc w:val="left"/>
+      <w:pPr>
+        <w:ind w:left="2160" w:hanging="360"/>
+      </w:pPr>
+      <w:rPr>
+        <w:rFonts w:ascii="Wingdings" w:hAnsi="Wingdings" w:hint="default"/>
+      </w:rPr>
+    </w:lvl>
+    <w:lvl w:ilvl="3" w:tplc="0C0A0001" w:tentative="1">
+      <w:start w:val="1"/>
+      <w:numFmt w:val="bullet"/>
+      <w:lvlText w:val=""/>
+      <w:lvlJc w:val="left"/>
+      <w:pPr>
+        <w:ind w:left="2880" w:hanging="360"/>
+      </w:pPr>
+      <w:rPr>
+        <w:rFonts w:ascii="Symbol" w:hAnsi="Symbol" w:hint="default"/>
+      </w:rPr>
+    </w:lvl>
+    <w:lvl w:ilvl="4" w:tplc="0C0A0003" w:tentative="1">
+      <w:start w:val="1"/>
+      <w:numFmt w:val="bullet"/>
+      <w:lvlText w:val="o"/>
+      <w:lvlJc w:val="left"/>
+      <w:pPr>
+        <w:ind w:left="3600" w:hanging="360"/>
+      </w:pPr>
+      <w:rPr>
+        <w:rFonts w:ascii="Courier New" w:hAnsi="Courier New" w:cs="Courier New" w:hint="default"/>
+      </w:rPr>
+    </w:lvl>
+    <w:lvl w:ilvl="5" w:tplc="0C0A0005" w:tentative="1">
+      <w:start w:val="1"/>
+      <w:numFmt w:val="bullet"/>
+      <w:lvlText w:val=""/>
+      <w:lvlJc w:val="left"/>
+      <w:pPr>
+        <w:ind w:left="4320" w:hanging="360"/>
+      </w:pPr>
+      <w:rPr>
+        <w:rFonts w:ascii="Wingdings" w:hAnsi="Wingdings" w:hint="default"/>
+      </w:rPr>
+    </w:lvl>
+    <w:lvl w:ilvl="6" w:tplc="0C0A0001" w:tentative="1">
+      <w:start w:val="1"/>
+      <w:numFmt w:val="bullet"/>
+      <w:lvlText w:val=""/>
+      <w:lvlJc w:val="left"/>
+      <w:pPr>
+        <w:ind w:left="5040" w:hanging="360"/>
+      </w:pPr>
+      <w:rPr>
+        <w:rFonts w:ascii="Symbol" w:hAnsi="Symbol" w:hint="default"/>
+      </w:rPr>
+    </w:lvl>
+    <w:lvl w:ilvl="7" w:tplc="0C0A0003" w:tentative="1">
+      <w:start w:val="1"/>
+      <w:numFmt w:val="bullet"/>
+      <w:lvlText w:val="o"/>
+      <w:lvlJc w:val="left"/>
+      <w:pPr>
+        <w:ind w:left="5760" w:hanging="360"/>
+      </w:pPr>
+      <w:rPr>
+        <w:rFonts w:ascii="Courier New" w:hAnsi="Courier New" w:cs="Courier New" w:hint="default"/>
+      </w:rPr>
+    </w:lvl>
+    <w:lvl w:ilvl="8" w:tplc="0C0A0005" w:tentative="1">
+      <w:start w:val="1"/>
+      <w:numFmt w:val="bullet"/>
+      <w:lvlText w:val=""/>
+      <w:lvlJc w:val="left"/>
+      <w:pPr>
+        <w:ind w:left="6480" w:hanging="360"/>
+      </w:pPr>
+      <w:rPr>
+        <w:rFonts w:ascii="Wingdings" w:hAnsi="Wingdings" w:hint="default"/>
+      </w:rPr>
+    </w:lvl>
+  </w:abstractNum>
+  <w:abstractNum w:abstractNumId="4" w15:restartNumberingAfterBreak="0">
+    <w:nsid w:val="3E075259"/>
+    <w:multiLevelType w:val="hybridMultilevel"/>
+    <w:tmpl w:val="AF028F3E"/>
+    <w:lvl w:ilvl="0" w:tplc="0C0A0017">
+      <w:start w:val="1"/>
+      <w:numFmt w:val="lowerLetter"/>
+      <w:lvlText w:val="%1)"/>
+      <w:lvlJc w:val="left"/>
+      <w:pPr>
+        <w:ind w:left="720" w:hanging="360"/>
+      </w:pPr>
+    </w:lvl>
+    <w:lvl w:ilvl="1" w:tplc="0C0A0019" w:tentative="1">
+      <w:start w:val="1"/>
+      <w:numFmt w:val="lowerLetter"/>
+      <w:lvlText w:val="%2."/>
+      <w:lvlJc w:val="left"/>
+      <w:pPr>
+        <w:ind w:left="1440" w:hanging="360"/>
+      </w:pPr>
+    </w:lvl>
+    <w:lvl w:ilvl="2" w:tplc="0C0A001B" w:tentative="1">
+      <w:start w:val="1"/>
+      <w:numFmt w:val="lowerRoman"/>
+      <w:lvlText w:val="%3."/>
+      <w:lvlJc w:val="right"/>
+      <w:pPr>
+        <w:ind w:left="2160" w:hanging="180"/>
+      </w:pPr>
+    </w:lvl>
+    <w:lvl w:ilvl="3" w:tplc="0C0A000F" w:tentative="1">
+      <w:start w:val="1"/>
+      <w:numFmt w:val="decimal"/>
+      <w:lvlText w:val="%4."/>
+      <w:lvlJc w:val="left"/>
+      <w:pPr>
+        <w:ind w:left="2880" w:hanging="360"/>
+      </w:pPr>
+    </w:lvl>
+    <w:lvl w:ilvl="4" w:tplc="0C0A0019" w:tentative="1">
+      <w:start w:val="1"/>
+      <w:numFmt w:val="lowerLetter"/>
+      <w:lvlText w:val="%5."/>
+      <w:lvlJc w:val="left"/>
+      <w:pPr>
+        <w:ind w:left="3600" w:hanging="360"/>
+      </w:pPr>
+    </w:lvl>
+    <w:lvl w:ilvl="5" w:tplc="0C0A001B" w:tentative="1">
+      <w:start w:val="1"/>
+      <w:numFmt w:val="lowerRoman"/>
+      <w:lvlText w:val="%6."/>
+      <w:lvlJc w:val="right"/>
+      <w:pPr>
+        <w:ind w:left="4320" w:hanging="180"/>
+      </w:pPr>
+    </w:lvl>
+    <w:lvl w:ilvl="6" w:tplc="0C0A000F" w:tentative="1">
+      <w:start w:val="1"/>
+      <w:numFmt w:val="decimal"/>
+      <w:lvlText w:val="%7."/>
+      <w:lvlJc w:val="left"/>
+      <w:pPr>
+        <w:ind w:left="5040" w:hanging="360"/>
+      </w:pPr>
+    </w:lvl>
+    <w:lvl w:ilvl="7" w:tplc="0C0A0019" w:tentative="1">
+      <w:start w:val="1"/>
+      <w:numFmt w:val="lowerLetter"/>
+      <w:lvlText w:val="%8."/>
+      <w:lvlJc w:val="left"/>
+      <w:pPr>
+        <w:ind w:left="5760" w:hanging="360"/>
+      </w:pPr>
+    </w:lvl>
+    <w:lvl w:ilvl="8" w:tplc="0C0A001B" w:tentative="1">
+      <w:start w:val="1"/>
+      <w:numFmt w:val="lowerRoman"/>
+      <w:lvlText w:val="%9."/>
+      <w:lvlJc w:val="right"/>
+      <w:pPr>
+        <w:ind w:left="6480" w:hanging="180"/>
+      </w:pPr>
+    </w:lvl>
+  </w:abstractNum>
+  <w:abstractNum w:abstractNumId="5" w15:restartNumberingAfterBreak="0">
+    <w:nsid w:val="5B94122C"/>
+    <w:multiLevelType w:val="hybridMultilevel"/>
+    <w:tmpl w:val="8F7853AC"/>
+    <w:lvl w:ilvl="0" w:tplc="0C0A0017">
+      <w:start w:val="1"/>
+      <w:numFmt w:val="lowerLetter"/>
+      <w:lvlText w:val="%1)"/>
+      <w:lvlJc w:val="left"/>
+      <w:pPr>
+        <w:ind w:left="720" w:hanging="360"/>
+      </w:pPr>
+    </w:lvl>
+    <w:lvl w:ilvl="1" w:tplc="0C0A0019" w:tentative="1">
+      <w:start w:val="1"/>
+      <w:numFmt w:val="lowerLetter"/>
+      <w:lvlText w:val="%2."/>
+      <w:lvlJc w:val="left"/>
+      <w:pPr>
+        <w:ind w:left="1440" w:hanging="360"/>
+      </w:pPr>
+    </w:lvl>
+    <w:lvl w:ilvl="2" w:tplc="0C0A001B" w:tentative="1">
+      <w:start w:val="1"/>
+      <w:numFmt w:val="lowerRoman"/>
+      <w:lvlText w:val="%3."/>
+      <w:lvlJc w:val="right"/>
+      <w:pPr>
+        <w:ind w:left="2160" w:hanging="180"/>
+      </w:pPr>
+    </w:lvl>
+    <w:lvl w:ilvl="3" w:tplc="0C0A000F" w:tentative="1">
+      <w:start w:val="1"/>
+      <w:numFmt w:val="decimal"/>
+      <w:lvlText w:val="%4."/>
+      <w:lvlJc w:val="left"/>
+      <w:pPr>
+        <w:ind w:left="2880" w:hanging="360"/>
+      </w:pPr>
+    </w:lvl>
+    <w:lvl w:ilvl="4" w:tplc="0C0A0019" w:tentative="1">
+      <w:start w:val="1"/>
+      <w:numFmt w:val="lowerLetter"/>
+      <w:lvlText w:val="%5."/>
+      <w:lvlJc w:val="left"/>
+      <w:pPr>
+        <w:ind w:left="3600" w:hanging="360"/>
+      </w:pPr>
+    </w:lvl>
+    <w:lvl w:ilvl="5" w:tplc="0C0A001B" w:tentative="1">
+      <w:start w:val="1"/>
+      <w:numFmt w:val="lowerRoman"/>
+      <w:lvlText w:val="%6."/>
+      <w:lvlJc w:val="right"/>
+      <w:pPr>
+        <w:ind w:left="4320" w:hanging="180"/>
+      </w:pPr>
+    </w:lvl>
+    <w:lvl w:ilvl="6" w:tplc="0C0A000F" w:tentative="1">
+      <w:start w:val="1"/>
+      <w:numFmt w:val="decimal"/>
+      <w:lvlText w:val="%7."/>
+      <w:lvlJc w:val="left"/>
+      <w:pPr>
+        <w:ind w:left="5040" w:hanging="360"/>
+      </w:pPr>
+    </w:lvl>
+    <w:lvl w:ilvl="7" w:tplc="0C0A0019" w:tentative="1">
+      <w:start w:val="1"/>
+      <w:numFmt w:val="lowerLetter"/>
+      <w:lvlText w:val="%8."/>
+      <w:lvlJc w:val="left"/>
+      <w:pPr>
+        <w:ind w:left="5760" w:hanging="360"/>
+      </w:pPr>
+    </w:lvl>
+    <w:lvl w:ilvl="8" w:tplc="0C0A001B" w:tentative="1">
+      <w:start w:val="1"/>
+      <w:numFmt w:val="lowerRoman"/>
+      <w:lvlText w:val="%9."/>
+      <w:lvlJc w:val="right"/>
+      <w:pPr>
+        <w:ind w:left="6480" w:hanging="180"/>
+      </w:pPr>
+    </w:lvl>
+  </w:abstractNum>
+  <w:abstractNum w:abstractNumId="6" w15:restartNumberingAfterBreak="0">
+    <w:nsid w:val="5D817739"/>
+    <w:multiLevelType w:val="multilevel"/>
+    <w:tmpl w:val="0C0A001F"/>
+    <w:lvl w:ilvl="0">
+      <w:start w:val="1"/>
+      <w:numFmt w:val="decimal"/>
+      <w:lvlText w:val="%1."/>
+      <w:lvlJc w:val="left"/>
+      <w:pPr>
+        <w:ind w:left="720" w:hanging="360"/>
+      </w:pPr>
+    </w:lvl>
+    <w:lvl w:ilvl="1">
+      <w:start w:val="1"/>
+      <w:numFmt w:val="decimal"/>
+      <w:lvlText w:val="%1.%2."/>
+      <w:lvlJc w:val="left"/>
+      <w:pPr>
+        <w:ind w:left="1152" w:hanging="432"/>
+      </w:pPr>
+    </w:lvl>
+    <w:lvl w:ilvl="2">
+      <w:start w:val="1"/>
+      <w:numFmt w:val="decimal"/>
+      <w:lvlText w:val="%1.%2.%3."/>
+      <w:lvlJc w:val="left"/>
+      <w:pPr>
+        <w:ind w:left="1584" w:hanging="504"/>
+      </w:pPr>
+    </w:lvl>
+    <w:lvl w:ilvl="3">
+      <w:start w:val="1"/>
+      <w:numFmt w:val="decimal"/>
+      <w:lvlText w:val="%1.%2.%3.%4."/>
+      <w:lvlJc w:val="left"/>
+      <w:pPr>
+        <w:ind w:left="2088" w:hanging="648"/>
+      </w:pPr>
+    </w:lvl>
+    <w:lvl w:ilvl="4">
+      <w:start w:val="1"/>
+      <w:numFmt w:val="decimal"/>
+      <w:lvlText w:val="%1.%2.%3.%4.%5."/>
+      <w:lvlJc w:val="left"/>
+      <w:pPr>
+        <w:ind w:left="2592" w:hanging="792"/>
+      </w:pPr>
+    </w:lvl>
+    <w:lvl w:ilvl="5">
+      <w:start w:val="1"/>
+      <w:numFmt w:val="decimal"/>
+      <w:lvlText w:val="%1.%2.%3.%4.%5.%6."/>
+      <w:lvlJc w:val="left"/>
+      <w:pPr>
+        <w:ind w:left="3096" w:hanging="936"/>
+      </w:pPr>
+    </w:lvl>
+    <w:lvl w:ilvl="6">
+      <w:start w:val="1"/>
+      <w:numFmt w:val="decimal"/>
+      <w:lvlText w:val="%1.%2.%3.%4.%5.%6.%7."/>
+      <w:lvlJc w:val="left"/>
+      <w:pPr>
+        <w:ind w:left="3600" w:hanging="1080"/>
+      </w:pPr>
+    </w:lvl>
+    <w:lvl w:ilvl="7">
+      <w:start w:val="1"/>
+      <w:numFmt w:val="decimal"/>
+      <w:lvlText w:val="%1.%2.%3.%4.%5.%6.%7.%8."/>
+      <w:lvlJc w:val="left"/>
+      <w:pPr>
+        <w:ind w:left="4104" w:hanging="1224"/>
+      </w:pPr>
+    </w:lvl>
+    <w:lvl w:ilvl="8">
+      <w:start w:val="1"/>
+      <w:numFmt w:val="decimal"/>
+      <w:lvlText w:val="%1.%2.%3.%4.%5.%6.%7.%8.%9."/>
+      <w:lvlJc w:val="left"/>
+      <w:pPr>
+        <w:ind w:left="4680" w:hanging="1440"/>
+      </w:pPr>
+    </w:lvl>
+  </w:abstractNum>
+  <w:abstractNum w:abstractNumId="7" w15:restartNumberingAfterBreak="0">
+    <w:nsid w:val="7D3A75FD"/>
+    <w:multiLevelType w:val="hybridMultilevel"/>
+    <w:tmpl w:val="E148304E"/>
+    <w:lvl w:ilvl="0" w:tplc="1C8C7BB8">
+      <w:start w:val="2"/>
+      <w:numFmt w:val="bullet"/>
+      <w:lvlText w:val="-"/>
+      <w:lvlJc w:val="left"/>
+      <w:pPr>
+        <w:ind w:left="720" w:hanging="360"/>
+      </w:pPr>
+      <w:rPr>
+        <w:rFonts w:ascii="Arial" w:eastAsiaTheme="minorHAnsi" w:hAnsi="Arial" w:cs="Arial" w:hint="default"/>
+      </w:rPr>
+    </w:lvl>
+    <w:lvl w:ilvl="1" w:tplc="0C0A0003" w:tentative="1">
+      <w:start w:val="1"/>
+      <w:numFmt w:val="bullet"/>
+      <w:lvlText w:val="o"/>
+      <w:lvlJc w:val="left"/>
+      <w:pPr>
+        <w:ind w:left="1440" w:hanging="360"/>
+      </w:pPr>
+      <w:rPr>
+        <w:rFonts w:ascii="Courier New" w:hAnsi="Courier New" w:cs="Courier New" w:hint="default"/>
+      </w:rPr>
+    </w:lvl>
+    <w:lvl w:ilvl="2" w:tplc="0C0A0005" w:tentative="1">
+      <w:start w:val="1"/>
+      <w:numFmt w:val="bullet"/>
+      <w:lvlText w:val=""/>
+      <w:lvlJc w:val="left"/>
+      <w:pPr>
+        <w:ind w:left="2160" w:hanging="360"/>
+      </w:pPr>
+      <w:rPr>
+        <w:rFonts w:ascii="Wingdings" w:hAnsi="Wingdings" w:hint="default"/>
+      </w:rPr>
+    </w:lvl>
+    <w:lvl w:ilvl="3" w:tplc="0C0A0001" w:tentative="1">
+      <w:start w:val="1"/>
+      <w:numFmt w:val="bullet"/>
+      <w:lvlText w:val=""/>
+      <w:lvlJc w:val="left"/>
+      <w:pPr>
+        <w:ind w:left="2880" w:hanging="360"/>
+      </w:pPr>
+      <w:rPr>
+        <w:rFonts w:ascii="Symbol" w:hAnsi="Symbol" w:hint="default"/>
+      </w:rPr>
+    </w:lvl>
+    <w:lvl w:ilvl="4" w:tplc="0C0A0003" w:tentative="1">
+      <w:start w:val="1"/>
+      <w:numFmt w:val="bullet"/>
+      <w:lvlText w:val="o"/>
+      <w:lvlJc w:val="left"/>
+      <w:pPr>
+        <w:ind w:left="3600" w:hanging="360"/>
+      </w:pPr>
+      <w:rPr>
+        <w:rFonts w:ascii="Courier New" w:hAnsi="Courier New" w:cs="Courier New" w:hint="default"/>
+      </w:rPr>
+    </w:lvl>
+    <w:lvl w:ilvl="5" w:tplc="0C0A0005" w:tentative="1">
+      <w:start w:val="1"/>
+      <w:numFmt w:val="bullet"/>
+      <w:lvlText w:val=""/>
+      <w:lvlJc w:val="left"/>
+      <w:pPr>
+        <w:ind w:left="4320" w:hanging="360"/>
+      </w:pPr>
+      <w:rPr>
+        <w:rFonts w:ascii="Wingdings" w:hAnsi="Wingdings" w:hint="default"/>
+      </w:rPr>
+    </w:lvl>
+    <w:lvl w:ilvl="6" w:tplc="0C0A0001" w:tentative="1">
+      <w:start w:val="1"/>
+      <w:numFmt w:val="bullet"/>
+      <w:lvlText w:val=""/>
+      <w:lvlJc w:val="left"/>
+      <w:pPr>
+        <w:ind w:left="5040" w:hanging="360"/>
+      </w:pPr>
+      <w:rPr>
+        <w:rFonts w:ascii="Symbol" w:hAnsi="Symbol" w:hint="default"/>
+      </w:rPr>
+    </w:lvl>
+    <w:lvl w:ilvl="7" w:tplc="0C0A0003" w:tentative="1">
+      <w:start w:val="1"/>
+      <w:numFmt w:val="bullet"/>
+      <w:lvlText w:val="o"/>
+      <w:lvlJc w:val="left"/>
+      <w:pPr>
+        <w:ind w:left="5760" w:hanging="360"/>
+      </w:pPr>
+      <w:rPr>
+        <w:rFonts w:ascii="Courier New" w:hAnsi="Courier New" w:cs="Courier New" w:hint="default"/>
+      </w:rPr>
+    </w:lvl>
+    <w:lvl w:ilvl="8" w:tplc="0C0A0005" w:tentative="1">
+      <w:start w:val="1"/>
+      <w:numFmt w:val="bullet"/>
+      <w:lvlText w:val=""/>
+      <w:lvlJc w:val="left"/>
+      <w:pPr>
+        <w:ind w:left="6480" w:hanging="360"/>
+      </w:pPr>
+      <w:rPr>
+        <w:rFonts w:ascii="Wingdings" w:hAnsi="Wingdings" w:hint="default"/>
+      </w:rPr>
+    </w:lvl>
+  </w:abstractNum>
+  <w:num w:numId="1" w16cid:durableId="1826169557">
     <w:abstractNumId w:val="0"/>
   </w:num>
-  <w:num w:numId="2">
+  <w:num w:numId="2" w16cid:durableId="2110618832">
+    <w:abstractNumId w:val="7"/>
+  </w:num>
+  <w:num w:numId="3" w16cid:durableId="997460065">
+    <w:abstractNumId w:val="1"/>
+  </w:num>
+  <w:num w:numId="4" w16cid:durableId="2037928513">
+    <w:abstractNumId w:val="6"/>
+  </w:num>
+  <w:num w:numId="5" w16cid:durableId="989864176">
+    <w:abstractNumId w:val="5"/>
+  </w:num>
+  <w:num w:numId="6" w16cid:durableId="1927420370">
+    <w:abstractNumId w:val="4"/>
+  </w:num>
+  <w:num w:numId="7" w16cid:durableId="936715753">
     <w:abstractNumId w:val="2"/>
   </w:num>
-  <w:num w:numId="3">
-    <w:abstractNumId w:val="1"/>
+  <w:num w:numId="8" w16cid:durableId="468785831">
+    <w:abstractNumId w:val="3"/>
   </w:num>
 </w:numbering>
 </file>
 
 <file path=word/styles.xml><?xml version="1.0" encoding="utf-8"?>
-<w:styles xmlns:mc="http://schemas.openxmlformats.org/markup-compatibility/2006" xmlns:r="http://schemas.openxmlformats.org/officeDocument/2006/relationships" xmlns:w="http://schemas.openxmlformats.org/wordprocessingml/2006/main" xmlns:w14="http://schemas.microsoft.com/office/word/2010/wordml" xmlns:w15="http://schemas.microsoft.com/office/word/2012/wordml" mc:Ignorable="w14 w15">
+<w:styles xmlns:mc="http://schemas.openxmlformats.org/markup-compatibility/2006" xmlns:r="http://schemas.openxmlformats.org/officeDocument/2006/relationships" xmlns:w="http://schemas.openxmlformats.org/wordprocessingml/2006/main" xmlns:w14="http://schemas.microsoft.com/office/word/2010/wordml" xmlns:w15="http://schemas.microsoft.com/office/word/2012/wordml" xmlns:w16cex="http://schemas.microsoft.com/office/word/2018/wordml/cex" xmlns:w16cid="http://schemas.microsoft.com/office/word/2016/wordml/cid" xmlns:w16="http://schemas.microsoft.com/office/word/2018/wordml" xmlns:w16du="http://schemas.microsoft.com/office/word/2023/wordml/word16du" xmlns:w16sdtdh="http://schemas.microsoft.com/office/word/2020/wordml/sdtdatahash" xmlns:w16sdtfl="http://schemas.microsoft.com/office/word/2024/wordml/sdtformatlock" xmlns:w16se="http://schemas.microsoft.com/office/word/2015/wordml/symex" mc:Ignorable="w14 w15 w16se w16cid w16 w16cex w16sdtdh w16sdtfl w16du">
   <w:docDefaults>
     <w:rPrDefault>
       <w:rPr>
@@ -6481,7 +10094,7 @@
       </w:pPr>
     </w:pPrDefault>
   </w:docDefaults>
-  <w:latentStyles w:defLockedState="0" w:defUIPriority="99" w:defSemiHidden="0" w:defUnhideWhenUsed="0" w:defQFormat="0" w:count="371">
+  <w:latentStyles w:defLockedState="0" w:defUIPriority="99" w:defSemiHidden="0" w:defUnhideWhenUsed="0" w:defQFormat="0" w:count="376">
     <w:lsdException w:name="Normal" w:uiPriority="0" w:qFormat="1"/>
     <w:lsdException w:name="heading 1" w:uiPriority="9" w:qFormat="1"/>
     <w:lsdException w:name="heading 2" w:semiHidden="1" w:uiPriority="9" w:unhideWhenUsed="1" w:qFormat="1"/>
@@ -6853,6 +10466,11 @@
     <w:lsdException w:name="List Table 5 Dark Accent 6" w:uiPriority="50"/>
     <w:lsdException w:name="List Table 6 Colorful Accent 6" w:uiPriority="51"/>
     <w:lsdException w:name="List Table 7 Colorful Accent 6" w:uiPriority="52"/>
+    <w:lsdException w:name="Mention" w:semiHidden="1" w:unhideWhenUsed="1"/>
+    <w:lsdException w:name="Smart Hyperlink" w:semiHidden="1" w:unhideWhenUsed="1"/>
+    <w:lsdException w:name="Hashtag" w:semiHidden="1" w:unhideWhenUsed="1"/>
+    <w:lsdException w:name="Unresolved Mention" w:semiHidden="1" w:unhideWhenUsed="1"/>
+    <w:lsdException w:name="Smart Link" w:semiHidden="1" w:unhideWhenUsed="1"/>
   </w:latentStyles>
   <w:style w:type="paragraph" w:default="1" w:styleId="Normal">
     <w:name w:val="Normal"/>
@@ -6927,7 +10545,6 @@
   <w:style w:type="character" w:default="1" w:styleId="Fuentedeprrafopredeter">
     <w:name w:val="Default Paragraph Font"/>
     <w:uiPriority w:val="1"/>
-    <w:semiHidden/>
     <w:unhideWhenUsed/>
   </w:style>
   <w:style w:type="table" w:default="1" w:styleId="Tablanormal">
@@ -7062,6 +10679,29 @@
       <w:color w:val="1F4D78" w:themeColor="accent1" w:themeShade="7F"/>
       <w:sz w:val="24"/>
       <w:szCs w:val="24"/>
+    </w:rPr>
+  </w:style>
+  <w:style w:type="character" w:styleId="Hipervnculo">
+    <w:name w:val="Hyperlink"/>
+    <w:basedOn w:val="Fuentedeprrafopredeter"/>
+    <w:uiPriority w:val="99"/>
+    <w:unhideWhenUsed/>
+    <w:rsid w:val="0019565F"/>
+    <w:rPr>
+      <w:color w:val="0563C1" w:themeColor="hyperlink"/>
+      <w:u w:val="single"/>
+    </w:rPr>
+  </w:style>
+  <w:style w:type="character" w:styleId="Mencinsinresolver">
+    <w:name w:val="Unresolved Mention"/>
+    <w:basedOn w:val="Fuentedeprrafopredeter"/>
+    <w:uiPriority w:val="99"/>
+    <w:semiHidden/>
+    <w:unhideWhenUsed/>
+    <w:rsid w:val="0019565F"/>
+    <w:rPr>
+      <w:color w:val="605E5C"/>
+      <w:shd w:val="clear" w:color="auto" w:fill="E1DFDD"/>
     </w:rPr>
   </w:style>
 </w:styles>

</xml_diff>

<commit_message>
Memoria actualizada con todo lo hecho hasta ahora
</commit_message>
<xml_diff>
--- a/SistemaAnalisisMercadoAutomocion.docx
+++ b/SistemaAnalisisMercadoAutomocion.docx
@@ -7348,7 +7348,6 @@
           <w:szCs w:val="24"/>
           <w:u w:val="single"/>
         </w:rPr>
-        <w:lastRenderedPageBreak/>
         <w:t>Relación entre kilometraje y precio de venta</w:t>
       </w:r>
       <w:r>
@@ -10564,7 +10563,9 @@
       <w:r>
         <w:rPr>
           <w:rFonts w:ascii="Arial" w:hAnsi="Arial" w:cs="Arial"/>
-          <w:sz w:val="24"/>
+          <w:noProof/>
+          <w:sz w:val="24"/>
+          <w:lang w:eastAsia="es-ES"/>
         </w:rPr>
         <w:drawing>
           <wp:inline distT="0" distB="0" distL="0" distR="0" wp14:anchorId="5B1A7AA4" wp14:editId="6F800C15">
@@ -10723,6 +10724,10 @@
         <w:jc w:val="center"/>
       </w:pPr>
       <w:r>
+        <w:rPr>
+          <w:noProof/>
+          <w:lang w:eastAsia="es-ES"/>
+        </w:rPr>
         <w:lastRenderedPageBreak/>
         <w:drawing>
           <wp:inline distT="0" distB="0" distL="0" distR="0" wp14:anchorId="5C803B02" wp14:editId="0EED5B9E">
@@ -10923,7 +10928,9 @@
       <w:r>
         <w:rPr>
           <w:rFonts w:ascii="Arial" w:hAnsi="Arial" w:cs="Arial"/>
-          <w:sz w:val="24"/>
+          <w:noProof/>
+          <w:sz w:val="24"/>
+          <w:lang w:eastAsia="es-ES"/>
         </w:rPr>
         <w:drawing>
           <wp:inline distT="0" distB="0" distL="0" distR="0" wp14:anchorId="783D198D" wp14:editId="04D590B6">
@@ -11187,7 +11194,9 @@
       <w:r>
         <w:rPr>
           <w:rFonts w:ascii="Arial" w:hAnsi="Arial" w:cs="Arial"/>
-          <w:sz w:val="24"/>
+          <w:noProof/>
+          <w:sz w:val="24"/>
+          <w:lang w:eastAsia="es-ES"/>
         </w:rPr>
         <w:drawing>
           <wp:inline distT="0" distB="0" distL="0" distR="0" wp14:anchorId="5ECABFB3" wp14:editId="6F667068">
@@ -11400,7 +11409,9 @@
       <w:r>
         <w:rPr>
           <w:rFonts w:ascii="Arial" w:hAnsi="Arial" w:cs="Arial"/>
-          <w:sz w:val="24"/>
+          <w:noProof/>
+          <w:sz w:val="24"/>
+          <w:lang w:eastAsia="es-ES"/>
         </w:rPr>
         <w:drawing>
           <wp:inline distT="0" distB="0" distL="0" distR="0" wp14:anchorId="3434863B" wp14:editId="6BF62B9E">
@@ -11561,7 +11572,9 @@
       <w:r>
         <w:rPr>
           <w:rFonts w:ascii="Arial" w:hAnsi="Arial" w:cs="Arial"/>
-          <w:sz w:val="24"/>
+          <w:noProof/>
+          <w:sz w:val="24"/>
+          <w:lang w:eastAsia="es-ES"/>
         </w:rPr>
         <w:drawing>
           <wp:inline distT="0" distB="0" distL="0" distR="0" wp14:anchorId="3AB77A29" wp14:editId="6B86562A">
@@ -11800,6 +11813,10 @@
         <w:jc w:val="center"/>
       </w:pPr>
       <w:r>
+        <w:rPr>
+          <w:noProof/>
+          <w:lang w:eastAsia="es-ES"/>
+        </w:rPr>
         <w:drawing>
           <wp:inline distT="0" distB="0" distL="0" distR="0" wp14:anchorId="05651906" wp14:editId="535B0F0F">
             <wp:extent cx="5400040" cy="1605915"/>
@@ -11991,7 +12008,9 @@
       <w:r>
         <w:rPr>
           <w:rFonts w:ascii="Arial" w:hAnsi="Arial" w:cs="Arial"/>
-          <w:sz w:val="24"/>
+          <w:noProof/>
+          <w:sz w:val="24"/>
+          <w:lang w:eastAsia="es-ES"/>
         </w:rPr>
         <w:drawing>
           <wp:inline distT="0" distB="0" distL="0" distR="0" wp14:anchorId="5F87A910" wp14:editId="0491F546">
@@ -12307,7 +12326,9 @@
       <w:r>
         <w:rPr>
           <w:rFonts w:ascii="Arial" w:hAnsi="Arial" w:cs="Arial"/>
-          <w:sz w:val="24"/>
+          <w:noProof/>
+          <w:sz w:val="24"/>
+          <w:lang w:eastAsia="es-ES"/>
         </w:rPr>
         <w:drawing>
           <wp:inline distT="0" distB="0" distL="0" distR="0" wp14:anchorId="25702963" wp14:editId="74770EA5">
@@ -12865,7 +12886,9 @@
       <w:r>
         <w:rPr>
           <w:rFonts w:ascii="Arial" w:hAnsi="Arial" w:cs="Arial"/>
-          <w:sz w:val="24"/>
+          <w:noProof/>
+          <w:sz w:val="24"/>
+          <w:lang w:eastAsia="es-ES"/>
         </w:rPr>
         <w:drawing>
           <wp:inline distT="0" distB="0" distL="0" distR="0" wp14:anchorId="3FDB6F06" wp14:editId="7E4D54FC">
@@ -13012,7 +13035,9 @@
       <w:r>
         <w:rPr>
           <w:rFonts w:ascii="Arial" w:hAnsi="Arial" w:cs="Arial"/>
-          <w:sz w:val="24"/>
+          <w:noProof/>
+          <w:sz w:val="24"/>
+          <w:lang w:eastAsia="es-ES"/>
         </w:rPr>
         <w:lastRenderedPageBreak/>
         <w:drawing>
@@ -13194,16 +13219,7 @@
           <w:rFonts w:ascii="Arial" w:hAnsi="Arial" w:cs="Arial"/>
           <w:sz w:val="24"/>
         </w:rPr>
-        <w:t xml:space="preserve">l análisis agregado por marca muestra que fabricantes como BMW y Ford lideran el ranking de satisfacción (&gt;68% de opiniones positivas), </w:t>
-      </w:r>
-      <w:bookmarkStart w:id="0" w:name="_GoBack"/>
-      <w:bookmarkEnd w:id="0"/>
-      <w:r>
-        <w:rPr>
-          <w:rFonts w:ascii="Arial" w:hAnsi="Arial" w:cs="Arial"/>
-          <w:sz w:val="24"/>
-        </w:rPr>
-        <w:t>mientras que otras marcas generalistas sufren más penalizaciones en las reseñas, a menudo relacionadas con la durabilidad percibida.</w:t>
+        <w:t>l análisis agregado por marca muestra que fabricantes como BMW y Ford lideran el ranking de satisfacción (&gt;68% de opiniones positivas), mientras que otras marcas generalistas sufren más penalizaciones en las reseñas, a menudo relacionadas con la durabilidad percibida.</w:t>
       </w:r>
     </w:p>
     <w:p>
@@ -13218,7 +13234,9 @@
       <w:r>
         <w:rPr>
           <w:rFonts w:ascii="Arial" w:hAnsi="Arial" w:cs="Arial"/>
-          <w:sz w:val="24"/>
+          <w:noProof/>
+          <w:sz w:val="24"/>
+          <w:lang w:eastAsia="es-ES"/>
         </w:rPr>
         <w:drawing>
           <wp:inline distT="0" distB="0" distL="0" distR="0" wp14:anchorId="3C87E3A7" wp14:editId="10D19122">
@@ -13286,6 +13304,518 @@
     </w:p>
     <w:p>
       <w:pPr>
+        <w:spacing w:line="276" w:lineRule="auto"/>
+        <w:jc w:val="both"/>
+        <w:rPr>
+          <w:rFonts w:ascii="Arial" w:hAnsi="Arial" w:cs="Arial"/>
+          <w:sz w:val="24"/>
+        </w:rPr>
+      </w:pPr>
+      <w:r>
+        <w:rPr>
+          <w:rFonts w:ascii="Arial" w:hAnsi="Arial" w:cs="Arial"/>
+          <w:sz w:val="24"/>
+        </w:rPr>
+        <w:t>En este apartado vamos a crear dos modelos para la detección de anomalías en los precios de venta de los vehículos, un modelo KNN y otro SVM.</w:t>
+      </w:r>
+    </w:p>
+    <w:p>
+      <w:pPr>
+        <w:pStyle w:val="Prrafodelista"/>
+        <w:numPr>
+          <w:ilvl w:val="0"/>
+          <w:numId w:val="13"/>
+        </w:numPr>
+        <w:spacing w:line="276" w:lineRule="auto"/>
+        <w:jc w:val="both"/>
+        <w:rPr>
+          <w:rFonts w:ascii="Arial" w:hAnsi="Arial" w:cs="Arial"/>
+          <w:sz w:val="24"/>
+        </w:rPr>
+      </w:pPr>
+      <w:r>
+        <w:rPr>
+          <w:rFonts w:ascii="Arial" w:hAnsi="Arial" w:cs="Arial"/>
+          <w:b/>
+          <w:sz w:val="24"/>
+        </w:rPr>
+        <w:t>KNN (K-</w:t>
+      </w:r>
+      <w:proofErr w:type="spellStart"/>
+      <w:r>
+        <w:rPr>
+          <w:rFonts w:ascii="Arial" w:hAnsi="Arial" w:cs="Arial"/>
+          <w:b/>
+          <w:sz w:val="24"/>
+        </w:rPr>
+        <w:t>Nearest</w:t>
+      </w:r>
+      <w:proofErr w:type="spellEnd"/>
+      <w:r>
+        <w:rPr>
+          <w:rFonts w:ascii="Arial" w:hAnsi="Arial" w:cs="Arial"/>
+          <w:b/>
+          <w:sz w:val="24"/>
+        </w:rPr>
+        <w:t xml:space="preserve"> </w:t>
+      </w:r>
+      <w:proofErr w:type="spellStart"/>
+      <w:r>
+        <w:rPr>
+          <w:rFonts w:ascii="Arial" w:hAnsi="Arial" w:cs="Arial"/>
+          <w:b/>
+          <w:sz w:val="24"/>
+        </w:rPr>
+        <w:t>Neighbors</w:t>
+      </w:r>
+      <w:proofErr w:type="spellEnd"/>
+      <w:r>
+        <w:rPr>
+          <w:rFonts w:ascii="Arial" w:hAnsi="Arial" w:cs="Arial"/>
+          <w:b/>
+          <w:sz w:val="24"/>
+        </w:rPr>
+        <w:t>):</w:t>
+      </w:r>
+      <w:r>
+        <w:rPr>
+          <w:rFonts w:ascii="Arial" w:hAnsi="Arial" w:cs="Arial"/>
+          <w:sz w:val="24"/>
+        </w:rPr>
+        <w:t xml:space="preserve"> Este método asumirá que el precio de un coche debe ser similar al de sus vecinos más cercanos en características técnicas (potencia, antigüedad, kilometraje) y además teniendo en cuenta también aspectos de incidencias y servicios que han tenido los vehículos ya que tenemos que tener en cuenta que un coche puede estar devaluado por sus averías. Con este conjunto pensamos que las anomalías detectadas serán más precisas. En este algoritmo se buscan los </w:t>
+      </w:r>
+      <w:r>
+        <w:rPr>
+          <w:rFonts w:ascii="Arial" w:hAnsi="Arial" w:cs="Arial"/>
+          <w:i/>
+          <w:sz w:val="24"/>
+        </w:rPr>
+        <w:t>k</w:t>
+      </w:r>
+      <w:r>
+        <w:rPr>
+          <w:rFonts w:ascii="Arial" w:hAnsi="Arial" w:cs="Arial"/>
+          <w:sz w:val="24"/>
+        </w:rPr>
+        <w:t xml:space="preserve"> coches más parecidos, se calcula el precio promedio y si la diferencias entre el precio real y si el precio estimado supera un umbral (hemos establecido el top 5% de mayores errores) se marca como anomalía.</w:t>
+      </w:r>
+    </w:p>
+    <w:p>
+      <w:pPr>
+        <w:spacing w:line="276" w:lineRule="auto"/>
+        <w:ind w:left="360"/>
+        <w:jc w:val="both"/>
+        <w:rPr>
+          <w:rFonts w:ascii="Arial" w:hAnsi="Arial" w:cs="Arial"/>
+          <w:sz w:val="24"/>
+        </w:rPr>
+      </w:pPr>
+      <w:r>
+        <w:rPr>
+          <w:rFonts w:ascii="Arial" w:hAnsi="Arial" w:cs="Arial"/>
+          <w:sz w:val="24"/>
+        </w:rPr>
+        <w:drawing>
+          <wp:inline distT="0" distB="0" distL="0" distR="0" wp14:anchorId="10A5D267" wp14:editId="1F2096C4">
+            <wp:extent cx="5400040" cy="1731010"/>
+            <wp:effectExtent l="0" t="0" r="0" b="2540"/>
+            <wp:docPr id="11" name="Imagen 11"/>
+            <wp:cNvGraphicFramePr>
+              <a:graphicFrameLocks xmlns:a="http://schemas.openxmlformats.org/drawingml/2006/main" noChangeAspect="1"/>
+            </wp:cNvGraphicFramePr>
+            <a:graphic xmlns:a="http://schemas.openxmlformats.org/drawingml/2006/main">
+              <a:graphicData uri="http://schemas.openxmlformats.org/drawingml/2006/picture">
+                <pic:pic xmlns:pic="http://schemas.openxmlformats.org/drawingml/2006/picture">
+                  <pic:nvPicPr>
+                    <pic:cNvPr id="1" name=""/>
+                    <pic:cNvPicPr/>
+                  </pic:nvPicPr>
+                  <pic:blipFill>
+                    <a:blip r:embed="rId31"/>
+                    <a:stretch>
+                      <a:fillRect/>
+                    </a:stretch>
+                  </pic:blipFill>
+                  <pic:spPr>
+                    <a:xfrm>
+                      <a:off x="0" y="0"/>
+                      <a:ext cx="5400040" cy="1731010"/>
+                    </a:xfrm>
+                    <a:prstGeom prst="rect">
+                      <a:avLst/>
+                    </a:prstGeom>
+                  </pic:spPr>
+                </pic:pic>
+              </a:graphicData>
+            </a:graphic>
+          </wp:inline>
+        </w:drawing>
+      </w:r>
+    </w:p>
+    <w:p>
+      <w:pPr>
+        <w:spacing w:line="276" w:lineRule="auto"/>
+        <w:ind w:left="705"/>
+        <w:jc w:val="both"/>
+        <w:rPr>
+          <w:rFonts w:ascii="Arial" w:hAnsi="Arial" w:cs="Arial"/>
+          <w:sz w:val="24"/>
+        </w:rPr>
+      </w:pPr>
+      <w:r>
+        <w:rPr>
+          <w:rFonts w:ascii="Arial" w:hAnsi="Arial" w:cs="Arial"/>
+          <w:sz w:val="24"/>
+        </w:rPr>
+        <w:t>Como se puede ver en los gráficos anteriores nos permite ver las anomalías detectadas en tres tipos de riesgo para el negocio de ventas:</w:t>
+      </w:r>
+    </w:p>
+    <w:p>
+      <w:pPr>
+        <w:pStyle w:val="Prrafodelista"/>
+        <w:numPr>
+          <w:ilvl w:val="2"/>
+          <w:numId w:val="2"/>
+        </w:numPr>
+        <w:spacing w:line="276" w:lineRule="auto"/>
+        <w:jc w:val="both"/>
+        <w:rPr>
+          <w:rFonts w:ascii="Arial" w:hAnsi="Arial" w:cs="Arial"/>
+          <w:sz w:val="24"/>
+        </w:rPr>
+      </w:pPr>
+      <w:r>
+        <w:rPr>
+          <w:rFonts w:ascii="Arial" w:hAnsi="Arial" w:cs="Arial"/>
+          <w:sz w:val="24"/>
+          <w:u w:val="single"/>
+        </w:rPr>
+        <w:t>Anomalías mecánicas:</w:t>
+      </w:r>
+      <w:r>
+        <w:rPr>
+          <w:rFonts w:ascii="Arial" w:hAnsi="Arial" w:cs="Arial"/>
+          <w:sz w:val="24"/>
+        </w:rPr>
+        <w:t xml:space="preserve"> Precio frente al número de averías. Observamos puntos rojos en los que el algoritmo ha detectado que por su estado mecánico el coche deberías ser más barato.</w:t>
+      </w:r>
+    </w:p>
+    <w:p>
+      <w:pPr>
+        <w:pStyle w:val="Prrafodelista"/>
+        <w:numPr>
+          <w:ilvl w:val="2"/>
+          <w:numId w:val="2"/>
+        </w:numPr>
+        <w:spacing w:line="276" w:lineRule="auto"/>
+        <w:jc w:val="both"/>
+        <w:rPr>
+          <w:rFonts w:ascii="Arial" w:hAnsi="Arial" w:cs="Arial"/>
+          <w:sz w:val="24"/>
+        </w:rPr>
+      </w:pPr>
+      <w:r>
+        <w:rPr>
+          <w:rFonts w:ascii="Arial" w:hAnsi="Arial" w:cs="Arial"/>
+          <w:sz w:val="24"/>
+          <w:u w:val="single"/>
+        </w:rPr>
+        <w:t>Anomalías temporales:</w:t>
+      </w:r>
+      <w:r>
+        <w:rPr>
+          <w:rFonts w:ascii="Arial" w:hAnsi="Arial" w:cs="Arial"/>
+          <w:sz w:val="24"/>
+        </w:rPr>
+        <w:t xml:space="preserve"> Precio frente a la antigüedad. Los puntos rojos indican vehículos que no han seguido la depreciación natural.</w:t>
+      </w:r>
+    </w:p>
+    <w:p>
+      <w:pPr>
+        <w:pStyle w:val="Prrafodelista"/>
+        <w:numPr>
+          <w:ilvl w:val="2"/>
+          <w:numId w:val="2"/>
+        </w:numPr>
+        <w:spacing w:line="276" w:lineRule="auto"/>
+        <w:jc w:val="both"/>
+        <w:rPr>
+          <w:rFonts w:ascii="Arial" w:hAnsi="Arial" w:cs="Arial"/>
+          <w:sz w:val="24"/>
+        </w:rPr>
+      </w:pPr>
+      <w:r>
+        <w:rPr>
+          <w:rFonts w:ascii="Arial" w:hAnsi="Arial" w:cs="Arial"/>
+          <w:sz w:val="24"/>
+          <w:u w:val="single"/>
+        </w:rPr>
+        <w:t>Anomalías de uso:</w:t>
+      </w:r>
+      <w:r>
+        <w:rPr>
+          <w:rFonts w:ascii="Arial" w:hAnsi="Arial" w:cs="Arial"/>
+          <w:sz w:val="24"/>
+        </w:rPr>
+        <w:t xml:space="preserve"> Precio frente a kilometraje. Los vehículos son marcados como anomalías porque sus vecinos (similar kilometraje) se venden a diferente precio.</w:t>
+      </w:r>
+    </w:p>
+    <w:p>
+      <w:pPr>
+        <w:pStyle w:val="Prrafodelista"/>
+        <w:numPr>
+          <w:ilvl w:val="1"/>
+          <w:numId w:val="2"/>
+        </w:numPr>
+        <w:spacing w:line="276" w:lineRule="auto"/>
+        <w:jc w:val="both"/>
+        <w:rPr>
+          <w:rFonts w:ascii="Arial" w:hAnsi="Arial" w:cs="Arial"/>
+          <w:sz w:val="24"/>
+        </w:rPr>
+      </w:pPr>
+      <w:r>
+        <w:rPr>
+          <w:rFonts w:ascii="Arial" w:hAnsi="Arial" w:cs="Arial"/>
+          <w:b/>
+          <w:sz w:val="24"/>
+        </w:rPr>
+        <w:t>SVM (Support Vector Machine):</w:t>
+      </w:r>
+      <w:r>
+        <w:rPr>
+          <w:rFonts w:ascii="Arial" w:hAnsi="Arial" w:cs="Arial"/>
+          <w:sz w:val="24"/>
+        </w:rPr>
+        <w:t xml:space="preserve"> En este caso vamos a usar un SVR (Support Vector Regressor), que a diferencia del KNN trata de encontrar una función matemática global que explique el comportamiento general del precio. Al igual que en KNN hemos generado gráficas para ver</w:t>
+      </w:r>
+      <w:r>
+        <w:rPr>
+          <w:rFonts w:ascii="Arial" w:hAnsi="Arial" w:cs="Arial"/>
+          <w:sz w:val="24"/>
+        </w:rPr>
+        <w:t xml:space="preserve"> que vehículos detecta como anomalías, dándonos lo siguiente:</w:t>
+      </w:r>
+    </w:p>
+    <w:p>
+      <w:pPr>
+        <w:spacing w:line="276" w:lineRule="auto"/>
+        <w:ind w:left="425"/>
+        <w:jc w:val="both"/>
+        <w:rPr>
+          <w:rFonts w:ascii="Arial" w:hAnsi="Arial" w:cs="Arial"/>
+          <w:sz w:val="24"/>
+        </w:rPr>
+      </w:pPr>
+      <w:r>
+        <w:lastRenderedPageBreak/>
+        <w:drawing>
+          <wp:inline distT="0" distB="0" distL="0" distR="0" wp14:anchorId="2DB5F3AB" wp14:editId="2D79D666">
+            <wp:extent cx="5400040" cy="1558290"/>
+            <wp:effectExtent l="0" t="0" r="0" b="3810"/>
+            <wp:docPr id="18" name="Imagen 18"/>
+            <wp:cNvGraphicFramePr>
+              <a:graphicFrameLocks xmlns:a="http://schemas.openxmlformats.org/drawingml/2006/main" noChangeAspect="1"/>
+            </wp:cNvGraphicFramePr>
+            <a:graphic xmlns:a="http://schemas.openxmlformats.org/drawingml/2006/main">
+              <a:graphicData uri="http://schemas.openxmlformats.org/drawingml/2006/picture">
+                <pic:pic xmlns:pic="http://schemas.openxmlformats.org/drawingml/2006/picture">
+                  <pic:nvPicPr>
+                    <pic:cNvPr id="1" name=""/>
+                    <pic:cNvPicPr/>
+                  </pic:nvPicPr>
+                  <pic:blipFill>
+                    <a:blip r:embed="rId32"/>
+                    <a:stretch>
+                      <a:fillRect/>
+                    </a:stretch>
+                  </pic:blipFill>
+                  <pic:spPr>
+                    <a:xfrm>
+                      <a:off x="0" y="0"/>
+                      <a:ext cx="5400040" cy="1558290"/>
+                    </a:xfrm>
+                    <a:prstGeom prst="rect">
+                      <a:avLst/>
+                    </a:prstGeom>
+                  </pic:spPr>
+                </pic:pic>
+              </a:graphicData>
+            </a:graphic>
+          </wp:inline>
+        </w:drawing>
+      </w:r>
+    </w:p>
+    <w:p>
+      <w:pPr>
+        <w:spacing w:line="276" w:lineRule="auto"/>
+        <w:jc w:val="both"/>
+        <w:rPr>
+          <w:rFonts w:ascii="Arial" w:hAnsi="Arial" w:cs="Arial"/>
+          <w:sz w:val="24"/>
+        </w:rPr>
+      </w:pPr>
+      <w:r>
+        <w:rPr>
+          <w:rFonts w:ascii="Arial" w:hAnsi="Arial" w:cs="Arial"/>
+          <w:sz w:val="24"/>
+        </w:rPr>
+        <w:t>Para una correcta interpretación de los resultados, es fundamental cruzar sus resultados. No todas las anomalías son iguales:</w:t>
+      </w:r>
+    </w:p>
+    <w:p>
+      <w:pPr>
+        <w:pStyle w:val="Prrafodelista"/>
+        <w:numPr>
+          <w:ilvl w:val="0"/>
+          <w:numId w:val="14"/>
+        </w:numPr>
+        <w:spacing w:line="276" w:lineRule="auto"/>
+        <w:jc w:val="both"/>
+        <w:rPr>
+          <w:rFonts w:ascii="Arial" w:hAnsi="Arial" w:cs="Arial"/>
+          <w:sz w:val="24"/>
+        </w:rPr>
+      </w:pPr>
+      <w:r>
+        <w:rPr>
+          <w:rFonts w:ascii="Arial" w:hAnsi="Arial" w:cs="Arial"/>
+          <w:sz w:val="24"/>
+        </w:rPr>
+        <w:t>Si solo K-NN lo detecta: Es una anomalía local (raro comparado con sus vecinos, pero quizás normal en el mercado global).</w:t>
+      </w:r>
+    </w:p>
+    <w:p>
+      <w:pPr>
+        <w:pStyle w:val="Prrafodelista"/>
+        <w:numPr>
+          <w:ilvl w:val="0"/>
+          <w:numId w:val="14"/>
+        </w:numPr>
+        <w:spacing w:line="276" w:lineRule="auto"/>
+        <w:jc w:val="both"/>
+        <w:rPr>
+          <w:rFonts w:ascii="Arial" w:hAnsi="Arial" w:cs="Arial"/>
+          <w:sz w:val="24"/>
+        </w:rPr>
+      </w:pPr>
+      <w:r>
+        <w:rPr>
+          <w:rFonts w:ascii="Arial" w:hAnsi="Arial" w:cs="Arial"/>
+          <w:sz w:val="24"/>
+        </w:rPr>
+        <w:t>Si solo SVM lo detecta: Es una anomalía de tendencia (se sale de la curva matemática, pero quizás tiene vecinos parecidos).</w:t>
+      </w:r>
+    </w:p>
+    <w:p>
+      <w:pPr>
+        <w:pStyle w:val="Prrafodelista"/>
+        <w:numPr>
+          <w:ilvl w:val="0"/>
+          <w:numId w:val="14"/>
+        </w:numPr>
+        <w:spacing w:line="276" w:lineRule="auto"/>
+        <w:jc w:val="both"/>
+        <w:rPr>
+          <w:rFonts w:ascii="Arial" w:hAnsi="Arial" w:cs="Arial"/>
+          <w:sz w:val="24"/>
+        </w:rPr>
+      </w:pPr>
+      <w:r>
+        <w:rPr>
+          <w:rFonts w:ascii="Arial" w:hAnsi="Arial" w:cs="Arial"/>
+          <w:sz w:val="24"/>
+        </w:rPr>
+        <w:t>Si AMBOS lo detectan: Es una Anomalía Crítica. Aquí es donde hay una probabilidad altísima de error de precio o fraude.</w:t>
+      </w:r>
+    </w:p>
+    <w:p>
+      <w:pPr>
+        <w:spacing w:line="276" w:lineRule="auto"/>
+        <w:jc w:val="both"/>
+        <w:rPr>
+          <w:rFonts w:ascii="Arial" w:hAnsi="Arial" w:cs="Arial"/>
+          <w:sz w:val="24"/>
+        </w:rPr>
+      </w:pPr>
+      <w:r>
+        <w:rPr>
+          <w:rFonts w:ascii="Arial" w:hAnsi="Arial" w:cs="Arial"/>
+          <w:sz w:val="24"/>
+        </w:rPr>
+        <w:t>De modo que hemos obtenido la siguiente gráfica en la que se puede ver mejor estas situaciones descritas con anterioridad.</w:t>
+      </w:r>
+    </w:p>
+    <w:p>
+      <w:pPr>
+        <w:spacing w:line="276" w:lineRule="auto"/>
+        <w:jc w:val="both"/>
+        <w:rPr>
+          <w:rFonts w:ascii="Arial" w:hAnsi="Arial" w:cs="Arial"/>
+          <w:sz w:val="24"/>
+        </w:rPr>
+      </w:pPr>
+      <w:r>
+        <w:rPr>
+          <w:rFonts w:ascii="Arial" w:hAnsi="Arial" w:cs="Arial"/>
+          <w:sz w:val="24"/>
+        </w:rPr>
+        <w:drawing>
+          <wp:inline distT="0" distB="0" distL="0" distR="0" wp14:anchorId="7EB2C01F" wp14:editId="1E0A8EE5">
+            <wp:extent cx="5400040" cy="3726180"/>
+            <wp:effectExtent l="0" t="0" r="0" b="7620"/>
+            <wp:docPr id="19" name="Imagen 19"/>
+            <wp:cNvGraphicFramePr>
+              <a:graphicFrameLocks xmlns:a="http://schemas.openxmlformats.org/drawingml/2006/main" noChangeAspect="1"/>
+            </wp:cNvGraphicFramePr>
+            <a:graphic xmlns:a="http://schemas.openxmlformats.org/drawingml/2006/main">
+              <a:graphicData uri="http://schemas.openxmlformats.org/drawingml/2006/picture">
+                <pic:pic xmlns:pic="http://schemas.openxmlformats.org/drawingml/2006/picture">
+                  <pic:nvPicPr>
+                    <pic:cNvPr id="1" name=""/>
+                    <pic:cNvPicPr/>
+                  </pic:nvPicPr>
+                  <pic:blipFill>
+                    <a:blip r:embed="rId33"/>
+                    <a:stretch>
+                      <a:fillRect/>
+                    </a:stretch>
+                  </pic:blipFill>
+                  <pic:spPr>
+                    <a:xfrm>
+                      <a:off x="0" y="0"/>
+                      <a:ext cx="5400040" cy="3726180"/>
+                    </a:xfrm>
+                    <a:prstGeom prst="rect">
+                      <a:avLst/>
+                    </a:prstGeom>
+                  </pic:spPr>
+                </pic:pic>
+              </a:graphicData>
+            </a:graphic>
+          </wp:inline>
+        </w:drawing>
+      </w:r>
+    </w:p>
+    <w:p>
+      <w:pPr>
+        <w:spacing w:line="276" w:lineRule="auto"/>
+        <w:jc w:val="both"/>
+        <w:rPr>
+          <w:rFonts w:ascii="Arial" w:hAnsi="Arial" w:cs="Arial"/>
+          <w:sz w:val="24"/>
+        </w:rPr>
+      </w:pPr>
+      <w:r>
+        <w:rPr>
+          <w:rFonts w:ascii="Arial" w:hAnsi="Arial" w:cs="Arial"/>
+          <w:sz w:val="24"/>
+        </w:rPr>
+        <w:t>En la que se ha detectado que hay 24 anomalías que solo detecta KNN, 24 anomalías que solo detecta SVM y 6 anomalías que detectan ambos. De modo que si en una empresa se tuviera un sistema de alertas se remondaría priorizar estas anomalías críticas (puntos rojos de la gráfica).</w:t>
+      </w:r>
+    </w:p>
+    <w:p>
+      <w:pPr>
         <w:pStyle w:val="Ttulo2"/>
         <w:numPr>
           <w:ilvl w:val="1"/>
@@ -13307,7 +13837,417 @@
           <w:color w:val="auto"/>
           <w:sz w:val="28"/>
         </w:rPr>
+        <w:lastRenderedPageBreak/>
         <w:t>Reseñas contradictorias</w:t>
+      </w:r>
+    </w:p>
+    <w:p>
+      <w:pPr>
+        <w:spacing w:line="276" w:lineRule="auto"/>
+        <w:jc w:val="both"/>
+        <w:rPr>
+          <w:rFonts w:ascii="Arial" w:hAnsi="Arial" w:cs="Arial"/>
+          <w:sz w:val="24"/>
+        </w:rPr>
+      </w:pPr>
+      <w:r>
+        <w:rPr>
+          <w:rFonts w:ascii="Arial" w:hAnsi="Arial" w:cs="Arial"/>
+          <w:sz w:val="24"/>
+        </w:rPr>
+        <w:t>En este apartado vamos a implementar un filtro de coherencia semántica con el objetivo de detectar cuando una valoración textual (</w:t>
+      </w:r>
+      <w:proofErr w:type="spellStart"/>
+      <w:r>
+        <w:rPr>
+          <w:rFonts w:ascii="Arial" w:hAnsi="Arial" w:cs="Arial"/>
+          <w:sz w:val="24"/>
+        </w:rPr>
+        <w:t>review</w:t>
+      </w:r>
+      <w:proofErr w:type="spellEnd"/>
+      <w:r>
+        <w:rPr>
+          <w:rFonts w:ascii="Arial" w:hAnsi="Arial" w:cs="Arial"/>
+          <w:sz w:val="24"/>
+        </w:rPr>
+        <w:t xml:space="preserve">) contradice a la valoración del cliente (recomendación). </w:t>
+      </w:r>
+    </w:p>
+    <w:p>
+      <w:pPr>
+        <w:spacing w:line="276" w:lineRule="auto"/>
+        <w:jc w:val="both"/>
+        <w:rPr>
+          <w:rFonts w:ascii="Arial" w:hAnsi="Arial" w:cs="Arial"/>
+          <w:sz w:val="24"/>
+        </w:rPr>
+      </w:pPr>
+      <w:r>
+        <w:rPr>
+          <w:rFonts w:ascii="Arial" w:hAnsi="Arial" w:cs="Arial"/>
+          <w:sz w:val="24"/>
+        </w:rPr>
+        <w:t>Para llevar a cabo esta tarea hemos utilizado dos diccionarios genéricos para el dominio de palabras con las que trabajamos. Generando así dos diccionarios:</w:t>
+      </w:r>
+    </w:p>
+    <w:p>
+      <w:pPr>
+        <w:pStyle w:val="Prrafodelista"/>
+        <w:numPr>
+          <w:ilvl w:val="0"/>
+          <w:numId w:val="2"/>
+        </w:numPr>
+        <w:spacing w:line="276" w:lineRule="auto"/>
+        <w:jc w:val="both"/>
+        <w:rPr>
+          <w:rFonts w:ascii="Arial" w:hAnsi="Arial" w:cs="Arial"/>
+          <w:sz w:val="24"/>
+        </w:rPr>
+      </w:pPr>
+      <w:r>
+        <w:rPr>
+          <w:rFonts w:ascii="Arial" w:hAnsi="Arial" w:cs="Arial"/>
+          <w:sz w:val="24"/>
+          <w:u w:val="single"/>
+        </w:rPr>
+        <w:t>Diccionario positivo:</w:t>
+      </w:r>
+      <w:r>
+        <w:rPr>
+          <w:rFonts w:ascii="Arial" w:hAnsi="Arial" w:cs="Arial"/>
+          <w:sz w:val="24"/>
+        </w:rPr>
+        <w:t xml:space="preserve"> Cuenta con términos asociados a la</w:t>
+      </w:r>
+      <w:r>
+        <w:rPr>
+          <w:rFonts w:ascii="Arial" w:hAnsi="Arial" w:cs="Arial"/>
+          <w:sz w:val="24"/>
+        </w:rPr>
+        <w:t xml:space="preserve"> satisfacción (eficiente, genial, excelente, recomendable, perfecto, bueno…).</w:t>
+      </w:r>
+    </w:p>
+    <w:p>
+      <w:pPr>
+        <w:pStyle w:val="Prrafodelista"/>
+        <w:numPr>
+          <w:ilvl w:val="0"/>
+          <w:numId w:val="2"/>
+        </w:numPr>
+        <w:spacing w:line="276" w:lineRule="auto"/>
+        <w:jc w:val="both"/>
+        <w:rPr>
+          <w:rFonts w:ascii="Arial" w:hAnsi="Arial" w:cs="Arial"/>
+          <w:sz w:val="24"/>
+        </w:rPr>
+      </w:pPr>
+      <w:r>
+        <w:rPr>
+          <w:rFonts w:ascii="Arial" w:hAnsi="Arial" w:cs="Arial"/>
+          <w:sz w:val="24"/>
+          <w:u w:val="single"/>
+        </w:rPr>
+        <w:t>Diccionario negativo:</w:t>
+      </w:r>
+      <w:r>
+        <w:rPr>
+          <w:rFonts w:ascii="Arial" w:hAnsi="Arial" w:cs="Arial"/>
+          <w:sz w:val="24"/>
+        </w:rPr>
+        <w:t xml:space="preserve"> Contiene términos asociados a la insatisfacción (problemático, lento, caro, regular, alto, elevado…).</w:t>
+      </w:r>
+    </w:p>
+    <w:p>
+      <w:pPr>
+        <w:spacing w:line="276" w:lineRule="auto"/>
+        <w:jc w:val="both"/>
+        <w:rPr>
+          <w:rFonts w:ascii="Arial" w:hAnsi="Arial" w:cs="Arial"/>
+          <w:sz w:val="24"/>
+        </w:rPr>
+      </w:pPr>
+      <w:r>
+        <w:rPr>
+          <w:rFonts w:ascii="Arial" w:hAnsi="Arial" w:cs="Arial"/>
+          <w:sz w:val="24"/>
+        </w:rPr>
+        <w:t>Una vez tenemos los diccionarios a cada reseña se le asigna un valor calculado a partir de:</w:t>
+      </w:r>
+    </w:p>
+    <w:p>
+      <w:pPr>
+        <w:spacing w:line="276" w:lineRule="auto"/>
+        <w:jc w:val="both"/>
+        <w:rPr>
+          <w:rFonts w:ascii="Arial" w:eastAsiaTheme="minorEastAsia" w:hAnsi="Arial" w:cs="Arial"/>
+          <w:sz w:val="24"/>
+        </w:rPr>
+      </w:pPr>
+      <m:oMathPara>
+        <m:oMath>
+          <m:r>
+            <w:rPr>
+              <w:rFonts w:ascii="Cambria Math" w:hAnsi="Cambria Math" w:cs="Arial"/>
+              <w:sz w:val="24"/>
+            </w:rPr>
+            <m:t>Puntuacion=</m:t>
+          </m:r>
+          <m:d>
+            <m:dPr>
+              <m:ctrlPr>
+                <w:rPr>
+                  <w:rFonts w:ascii="Cambria Math" w:hAnsi="Cambria Math" w:cs="Arial"/>
+                  <w:i/>
+                  <w:sz w:val="24"/>
+                </w:rPr>
+              </m:ctrlPr>
+            </m:dPr>
+            <m:e>
+              <m:nary>
+                <m:naryPr>
+                  <m:chr m:val="∑"/>
+                  <m:limLoc m:val="undOvr"/>
+                  <m:subHide m:val="1"/>
+                  <m:supHide m:val="1"/>
+                  <m:ctrlPr>
+                    <w:rPr>
+                      <w:rFonts w:ascii="Cambria Math" w:hAnsi="Cambria Math" w:cs="Arial"/>
+                      <w:sz w:val="24"/>
+                    </w:rPr>
+                  </m:ctrlPr>
+                </m:naryPr>
+                <m:sub/>
+                <m:sup/>
+                <m:e>
+                  <m:r>
+                    <m:rPr>
+                      <m:sty m:val="p"/>
+                    </m:rPr>
+                    <w:rPr>
+                      <w:rFonts w:ascii="Cambria Math" w:hAnsi="Cambria Math" w:cs="Arial"/>
+                      <w:sz w:val="24"/>
+                    </w:rPr>
+                    <m:t>Palabras Positivas</m:t>
+                  </m:r>
+                </m:e>
+              </m:nary>
+              <m:r>
+                <m:rPr>
+                  <m:sty m:val="p"/>
+                </m:rPr>
+                <w:rPr>
+                  <w:rFonts w:ascii="Cambria Math" w:hAnsi="Cambria Math" w:cs="Arial"/>
+                  <w:sz w:val="24"/>
+                </w:rPr>
+                <m:t xml:space="preserve"> </m:t>
+              </m:r>
+              <m:ctrlPr>
+                <w:rPr>
+                  <w:rFonts w:ascii="Cambria Math" w:hAnsi="Cambria Math" w:cs="Arial"/>
+                  <w:sz w:val="24"/>
+                </w:rPr>
+              </m:ctrlPr>
+            </m:e>
+          </m:d>
+          <m:r>
+            <m:rPr>
+              <m:sty m:val="p"/>
+            </m:rPr>
+            <w:rPr>
+              <w:rFonts w:ascii="Cambria Math" w:hAnsi="Cambria Math" w:cs="Arial"/>
+              <w:sz w:val="24"/>
+            </w:rPr>
+            <m:t>-</m:t>
+          </m:r>
+          <m:d>
+            <m:dPr>
+              <m:ctrlPr>
+                <w:rPr>
+                  <w:rFonts w:ascii="Cambria Math" w:hAnsi="Cambria Math" w:cs="Arial"/>
+                  <w:sz w:val="24"/>
+                </w:rPr>
+              </m:ctrlPr>
+            </m:dPr>
+            <m:e>
+              <m:nary>
+                <m:naryPr>
+                  <m:chr m:val="∑"/>
+                  <m:limLoc m:val="undOvr"/>
+                  <m:subHide m:val="1"/>
+                  <m:supHide m:val="1"/>
+                  <m:ctrlPr>
+                    <w:rPr>
+                      <w:rFonts w:ascii="Cambria Math" w:hAnsi="Cambria Math" w:cs="Arial"/>
+                      <w:sz w:val="24"/>
+                    </w:rPr>
+                  </m:ctrlPr>
+                </m:naryPr>
+                <m:sub/>
+                <m:sup/>
+                <m:e>
+                  <m:r>
+                    <m:rPr>
+                      <m:sty m:val="p"/>
+                    </m:rPr>
+                    <w:rPr>
+                      <w:rFonts w:ascii="Cambria Math" w:hAnsi="Cambria Math" w:cs="Arial"/>
+                      <w:sz w:val="24"/>
+                    </w:rPr>
+                    <m:t>Palabras Negativas</m:t>
+                  </m:r>
+                </m:e>
+              </m:nary>
+            </m:e>
+          </m:d>
+        </m:oMath>
+      </m:oMathPara>
+    </w:p>
+    <w:p>
+      <w:pPr>
+        <w:spacing w:line="276" w:lineRule="auto"/>
+        <w:jc w:val="both"/>
+        <w:rPr>
+          <w:rFonts w:ascii="Arial" w:eastAsiaTheme="minorEastAsia" w:hAnsi="Arial" w:cs="Arial"/>
+          <w:sz w:val="24"/>
+        </w:rPr>
+      </w:pPr>
+      <w:r>
+        <w:rPr>
+          <w:rFonts w:ascii="Arial" w:eastAsiaTheme="minorEastAsia" w:hAnsi="Arial" w:cs="Arial"/>
+          <w:sz w:val="24"/>
+        </w:rPr>
+        <w:t>Para determinar si una reseña es contradictorias hemos determinados dos reglas de contradicción:</w:t>
+      </w:r>
+    </w:p>
+    <w:p>
+      <w:pPr>
+        <w:pStyle w:val="Prrafodelista"/>
+        <w:numPr>
+          <w:ilvl w:val="0"/>
+          <w:numId w:val="2"/>
+        </w:numPr>
+        <w:spacing w:line="276" w:lineRule="auto"/>
+        <w:jc w:val="both"/>
+        <w:rPr>
+          <w:rFonts w:ascii="Arial" w:eastAsiaTheme="minorEastAsia" w:hAnsi="Arial" w:cs="Arial"/>
+          <w:sz w:val="24"/>
+        </w:rPr>
+      </w:pPr>
+      <w:r>
+        <w:rPr>
+          <w:rFonts w:ascii="Arial" w:eastAsiaTheme="minorEastAsia" w:hAnsi="Arial" w:cs="Arial"/>
+          <w:sz w:val="24"/>
+          <w:u w:val="single"/>
+        </w:rPr>
+        <w:t>Falso negativo:</w:t>
+      </w:r>
+      <w:r>
+        <w:rPr>
+          <w:rFonts w:ascii="Arial" w:eastAsiaTheme="minorEastAsia" w:hAnsi="Arial" w:cs="Arial"/>
+          <w:sz w:val="24"/>
+        </w:rPr>
+        <w:t xml:space="preserve"> El usuario usa un lenguaje positivo pero lo marca como no recomendado.</w:t>
+      </w:r>
+    </w:p>
+    <w:p>
+      <w:pPr>
+        <w:pStyle w:val="Prrafodelista"/>
+        <w:numPr>
+          <w:ilvl w:val="0"/>
+          <w:numId w:val="2"/>
+        </w:numPr>
+        <w:spacing w:line="276" w:lineRule="auto"/>
+        <w:jc w:val="both"/>
+        <w:rPr>
+          <w:rFonts w:ascii="Arial" w:eastAsiaTheme="minorEastAsia" w:hAnsi="Arial" w:cs="Arial"/>
+          <w:sz w:val="24"/>
+        </w:rPr>
+      </w:pPr>
+      <w:r>
+        <w:rPr>
+          <w:rFonts w:ascii="Arial" w:eastAsiaTheme="minorEastAsia" w:hAnsi="Arial" w:cs="Arial"/>
+          <w:sz w:val="24"/>
+          <w:u w:val="single"/>
+        </w:rPr>
+        <w:t>Falso positivo:</w:t>
+      </w:r>
+      <w:r>
+        <w:rPr>
+          <w:rFonts w:ascii="Arial" w:eastAsiaTheme="minorEastAsia" w:hAnsi="Arial" w:cs="Arial"/>
+          <w:sz w:val="24"/>
+        </w:rPr>
+        <w:t xml:space="preserve"> El usuario usa un lenguaje negativo pero lo marca como recomendado.</w:t>
+      </w:r>
+    </w:p>
+    <w:p>
+      <w:pPr>
+        <w:spacing w:line="276" w:lineRule="auto"/>
+        <w:jc w:val="center"/>
+        <w:rPr>
+          <w:rFonts w:ascii="Arial" w:eastAsiaTheme="minorEastAsia" w:hAnsi="Arial" w:cs="Arial"/>
+          <w:sz w:val="24"/>
+        </w:rPr>
+      </w:pPr>
+      <w:bookmarkStart w:id="0" w:name="_GoBack"/>
+      <w:r>
+        <w:rPr>
+          <w:rFonts w:ascii="Arial" w:eastAsiaTheme="minorEastAsia" w:hAnsi="Arial" w:cs="Arial"/>
+          <w:sz w:val="24"/>
+        </w:rPr>
+        <w:drawing>
+          <wp:inline distT="0" distB="0" distL="0" distR="0" wp14:anchorId="27D0738C" wp14:editId="445665B0">
+            <wp:extent cx="5400040" cy="3140710"/>
+            <wp:effectExtent l="0" t="0" r="0" b="2540"/>
+            <wp:docPr id="20" name="Imagen 20"/>
+            <wp:cNvGraphicFramePr>
+              <a:graphicFrameLocks xmlns:a="http://schemas.openxmlformats.org/drawingml/2006/main" noChangeAspect="1"/>
+            </wp:cNvGraphicFramePr>
+            <a:graphic xmlns:a="http://schemas.openxmlformats.org/drawingml/2006/main">
+              <a:graphicData uri="http://schemas.openxmlformats.org/drawingml/2006/picture">
+                <pic:pic xmlns:pic="http://schemas.openxmlformats.org/drawingml/2006/picture">
+                  <pic:nvPicPr>
+                    <pic:cNvPr id="1" name=""/>
+                    <pic:cNvPicPr/>
+                  </pic:nvPicPr>
+                  <pic:blipFill>
+                    <a:blip r:embed="rId34"/>
+                    <a:stretch>
+                      <a:fillRect/>
+                    </a:stretch>
+                  </pic:blipFill>
+                  <pic:spPr>
+                    <a:xfrm>
+                      <a:off x="0" y="0"/>
+                      <a:ext cx="5400040" cy="3140710"/>
+                    </a:xfrm>
+                    <a:prstGeom prst="rect">
+                      <a:avLst/>
+                    </a:prstGeom>
+                  </pic:spPr>
+                </pic:pic>
+              </a:graphicData>
+            </a:graphic>
+          </wp:inline>
+        </w:drawing>
+      </w:r>
+      <w:bookmarkEnd w:id="0"/>
+    </w:p>
+    <w:p>
+      <w:pPr>
+        <w:spacing w:line="276" w:lineRule="auto"/>
+        <w:jc w:val="both"/>
+        <w:rPr>
+          <w:rFonts w:ascii="Arial" w:eastAsiaTheme="minorEastAsia" w:hAnsi="Arial" w:cs="Arial"/>
+          <w:sz w:val="24"/>
+        </w:rPr>
+      </w:pPr>
+      <w:r>
+        <w:rPr>
+          <w:rFonts w:ascii="Arial" w:eastAsiaTheme="minorEastAsia" w:hAnsi="Arial" w:cs="Arial"/>
+          <w:sz w:val="24"/>
+        </w:rPr>
+        <w:t>Finalmente, podemos observar que tan solo hay contradicciones en la parte de que habla mal en la reseña pero si lo recomienda.</w:t>
       </w:r>
     </w:p>
     <w:p>
@@ -13333,6 +14273,7 @@
           <w:color w:val="auto"/>
           <w:sz w:val="28"/>
         </w:rPr>
+        <w:lastRenderedPageBreak/>
         <w:t>Predicción de precio de venta</w:t>
       </w:r>
     </w:p>
@@ -13362,7 +14303,7 @@
     </w:p>
     <w:p/>
     <w:sectPr>
-      <w:footerReference w:type="default" r:id="rId31"/>
+      <w:footerReference w:type="default" r:id="rId35"/>
       <w:pgSz w:w="11906" w:h="16838"/>
       <w:pgMar w:top="1417" w:right="1701" w:bottom="1417" w:left="1701" w:header="708" w:footer="708" w:gutter="0"/>
       <w:cols w:space="708"/>
@@ -13427,7 +14368,7 @@
           <w:rPr>
             <w:noProof/>
           </w:rPr>
-          <w:t>25</w:t>
+          <w:t>28</w:t>
         </w:r>
         <w:r>
           <w:fldChar w:fldCharType="end"/>
@@ -14232,6 +15173,119 @@
     </w:lvl>
   </w:abstractNum>
   <w:abstractNum w:abstractNumId="7" w15:restartNumberingAfterBreak="0">
+    <w:nsid w:val="3FBF346E"/>
+    <w:multiLevelType w:val="hybridMultilevel"/>
+    <w:tmpl w:val="4C86138C"/>
+    <w:lvl w:ilvl="0" w:tplc="0C0A0001">
+      <w:start w:val="1"/>
+      <w:numFmt w:val="bullet"/>
+      <w:lvlText w:val=""/>
+      <w:lvlJc w:val="left"/>
+      <w:pPr>
+        <w:ind w:left="720" w:hanging="360"/>
+      </w:pPr>
+      <w:rPr>
+        <w:rFonts w:ascii="Symbol" w:hAnsi="Symbol" w:hint="default"/>
+      </w:rPr>
+    </w:lvl>
+    <w:lvl w:ilvl="1" w:tplc="0C0A0003" w:tentative="1">
+      <w:start w:val="1"/>
+      <w:numFmt w:val="bullet"/>
+      <w:lvlText w:val="o"/>
+      <w:lvlJc w:val="left"/>
+      <w:pPr>
+        <w:ind w:left="1440" w:hanging="360"/>
+      </w:pPr>
+      <w:rPr>
+        <w:rFonts w:ascii="Courier New" w:hAnsi="Courier New" w:cs="Courier New" w:hint="default"/>
+      </w:rPr>
+    </w:lvl>
+    <w:lvl w:ilvl="2" w:tplc="0C0A0005" w:tentative="1">
+      <w:start w:val="1"/>
+      <w:numFmt w:val="bullet"/>
+      <w:lvlText w:val=""/>
+      <w:lvlJc w:val="left"/>
+      <w:pPr>
+        <w:ind w:left="2160" w:hanging="360"/>
+      </w:pPr>
+      <w:rPr>
+        <w:rFonts w:ascii="Wingdings" w:hAnsi="Wingdings" w:hint="default"/>
+      </w:rPr>
+    </w:lvl>
+    <w:lvl w:ilvl="3" w:tplc="0C0A0001" w:tentative="1">
+      <w:start w:val="1"/>
+      <w:numFmt w:val="bullet"/>
+      <w:lvlText w:val=""/>
+      <w:lvlJc w:val="left"/>
+      <w:pPr>
+        <w:ind w:left="2880" w:hanging="360"/>
+      </w:pPr>
+      <w:rPr>
+        <w:rFonts w:ascii="Symbol" w:hAnsi="Symbol" w:hint="default"/>
+      </w:rPr>
+    </w:lvl>
+    <w:lvl w:ilvl="4" w:tplc="0C0A0003" w:tentative="1">
+      <w:start w:val="1"/>
+      <w:numFmt w:val="bullet"/>
+      <w:lvlText w:val="o"/>
+      <w:lvlJc w:val="left"/>
+      <w:pPr>
+        <w:ind w:left="3600" w:hanging="360"/>
+      </w:pPr>
+      <w:rPr>
+        <w:rFonts w:ascii="Courier New" w:hAnsi="Courier New" w:cs="Courier New" w:hint="default"/>
+      </w:rPr>
+    </w:lvl>
+    <w:lvl w:ilvl="5" w:tplc="0C0A0005" w:tentative="1">
+      <w:start w:val="1"/>
+      <w:numFmt w:val="bullet"/>
+      <w:lvlText w:val=""/>
+      <w:lvlJc w:val="left"/>
+      <w:pPr>
+        <w:ind w:left="4320" w:hanging="360"/>
+      </w:pPr>
+      <w:rPr>
+        <w:rFonts w:ascii="Wingdings" w:hAnsi="Wingdings" w:hint="default"/>
+      </w:rPr>
+    </w:lvl>
+    <w:lvl w:ilvl="6" w:tplc="0C0A0001" w:tentative="1">
+      <w:start w:val="1"/>
+      <w:numFmt w:val="bullet"/>
+      <w:lvlText w:val=""/>
+      <w:lvlJc w:val="left"/>
+      <w:pPr>
+        <w:ind w:left="5040" w:hanging="360"/>
+      </w:pPr>
+      <w:rPr>
+        <w:rFonts w:ascii="Symbol" w:hAnsi="Symbol" w:hint="default"/>
+      </w:rPr>
+    </w:lvl>
+    <w:lvl w:ilvl="7" w:tplc="0C0A0003" w:tentative="1">
+      <w:start w:val="1"/>
+      <w:numFmt w:val="bullet"/>
+      <w:lvlText w:val="o"/>
+      <w:lvlJc w:val="left"/>
+      <w:pPr>
+        <w:ind w:left="5760" w:hanging="360"/>
+      </w:pPr>
+      <w:rPr>
+        <w:rFonts w:ascii="Courier New" w:hAnsi="Courier New" w:cs="Courier New" w:hint="default"/>
+      </w:rPr>
+    </w:lvl>
+    <w:lvl w:ilvl="8" w:tplc="0C0A0005" w:tentative="1">
+      <w:start w:val="1"/>
+      <w:numFmt w:val="bullet"/>
+      <w:lvlText w:val=""/>
+      <w:lvlJc w:val="left"/>
+      <w:pPr>
+        <w:ind w:left="6480" w:hanging="360"/>
+      </w:pPr>
+      <w:rPr>
+        <w:rFonts w:ascii="Wingdings" w:hAnsi="Wingdings" w:hint="default"/>
+      </w:rPr>
+    </w:lvl>
+  </w:abstractNum>
+  <w:abstractNum w:abstractNumId="8" w15:restartNumberingAfterBreak="0">
     <w:nsid w:val="55BB263E"/>
     <w:multiLevelType w:val="multilevel"/>
     <w:tmpl w:val="D8D851C6"/>
@@ -14353,7 +15407,7 @@
       </w:rPr>
     </w:lvl>
   </w:abstractNum>
-  <w:abstractNum w:abstractNumId="8" w15:restartNumberingAfterBreak="0">
+  <w:abstractNum w:abstractNumId="9" w15:restartNumberingAfterBreak="0">
     <w:nsid w:val="5B94122C"/>
     <w:multiLevelType w:val="hybridMultilevel"/>
     <w:tmpl w:val="8F7853AC"/>
@@ -14439,7 +15493,7 @@
       </w:pPr>
     </w:lvl>
   </w:abstractNum>
-  <w:abstractNum w:abstractNumId="9" w15:restartNumberingAfterBreak="0">
+  <w:abstractNum w:abstractNumId="10" w15:restartNumberingAfterBreak="0">
     <w:nsid w:val="5D817739"/>
     <w:multiLevelType w:val="multilevel"/>
     <w:tmpl w:val="0C0A001F"/>
@@ -14525,7 +15579,7 @@
       </w:pPr>
     </w:lvl>
   </w:abstractNum>
-  <w:abstractNum w:abstractNumId="10" w15:restartNumberingAfterBreak="0">
+  <w:abstractNum w:abstractNumId="11" w15:restartNumberingAfterBreak="0">
     <w:nsid w:val="646F4A7C"/>
     <w:multiLevelType w:val="multilevel"/>
     <w:tmpl w:val="8182EB50"/>
@@ -14674,30 +15728,29 @@
       </w:rPr>
     </w:lvl>
   </w:abstractNum>
-  <w:abstractNum w:abstractNumId="11" w15:restartNumberingAfterBreak="0">
-    <w:nsid w:val="7D3A75FD"/>
+  <w:abstractNum w:abstractNumId="12" w15:restartNumberingAfterBreak="0">
+    <w:nsid w:val="781936D6"/>
     <w:multiLevelType w:val="hybridMultilevel"/>
-    <w:tmpl w:val="2DD0EF20"/>
-    <w:lvl w:ilvl="0" w:tplc="59CEC4E2">
-      <w:start w:val="2"/>
+    <w:tmpl w:val="FAC2A340"/>
+    <w:lvl w:ilvl="0" w:tplc="0C0A0001">
+      <w:start w:val="1"/>
       <w:numFmt w:val="bullet"/>
-      <w:lvlText w:val="-"/>
+      <w:lvlText w:val=""/>
       <w:lvlJc w:val="left"/>
       <w:pPr>
-        <w:ind w:left="360" w:hanging="360"/>
+        <w:ind w:left="927" w:hanging="360"/>
       </w:pPr>
       <w:rPr>
-        <w:rFonts w:ascii="Arial" w:eastAsiaTheme="minorHAnsi" w:hAnsi="Arial" w:cs="Arial" w:hint="default"/>
-        <w:sz w:val="24"/>
+        <w:rFonts w:ascii="Symbol" w:hAnsi="Symbol" w:hint="default"/>
       </w:rPr>
     </w:lvl>
-    <w:lvl w:ilvl="1" w:tplc="0C0A0003">
+    <w:lvl w:ilvl="1" w:tplc="0C0A0003" w:tentative="1">
       <w:start w:val="1"/>
       <w:numFmt w:val="bullet"/>
       <w:lvlText w:val="o"/>
       <w:lvlJc w:val="left"/>
       <w:pPr>
-        <w:ind w:left="785" w:hanging="360"/>
+        <w:ind w:left="1647" w:hanging="360"/>
       </w:pPr>
       <w:rPr>
         <w:rFonts w:ascii="Courier New" w:hAnsi="Courier New" w:cs="Courier New" w:hint="default"/>
@@ -14709,7 +15762,7 @@
       <w:lvlText w:val=""/>
       <w:lvlJc w:val="left"/>
       <w:pPr>
-        <w:ind w:left="2160" w:hanging="360"/>
+        <w:ind w:left="2367" w:hanging="360"/>
       </w:pPr>
       <w:rPr>
         <w:rFonts w:ascii="Wingdings" w:hAnsi="Wingdings" w:hint="default"/>
@@ -14721,7 +15774,7 @@
       <w:lvlText w:val=""/>
       <w:lvlJc w:val="left"/>
       <w:pPr>
-        <w:ind w:left="2880" w:hanging="360"/>
+        <w:ind w:left="3087" w:hanging="360"/>
       </w:pPr>
       <w:rPr>
         <w:rFonts w:ascii="Symbol" w:hAnsi="Symbol" w:hint="default"/>
@@ -14733,7 +15786,7 @@
       <w:lvlText w:val="o"/>
       <w:lvlJc w:val="left"/>
       <w:pPr>
-        <w:ind w:left="3600" w:hanging="360"/>
+        <w:ind w:left="3807" w:hanging="360"/>
       </w:pPr>
       <w:rPr>
         <w:rFonts w:ascii="Courier New" w:hAnsi="Courier New" w:cs="Courier New" w:hint="default"/>
@@ -14745,7 +15798,7 @@
       <w:lvlText w:val=""/>
       <w:lvlJc w:val="left"/>
       <w:pPr>
-        <w:ind w:left="4320" w:hanging="360"/>
+        <w:ind w:left="4527" w:hanging="360"/>
       </w:pPr>
       <w:rPr>
         <w:rFonts w:ascii="Wingdings" w:hAnsi="Wingdings" w:hint="default"/>
@@ -14757,7 +15810,7 @@
       <w:lvlText w:val=""/>
       <w:lvlJc w:val="left"/>
       <w:pPr>
-        <w:ind w:left="5040" w:hanging="360"/>
+        <w:ind w:left="5247" w:hanging="360"/>
       </w:pPr>
       <w:rPr>
         <w:rFonts w:ascii="Symbol" w:hAnsi="Symbol" w:hint="default"/>
@@ -14769,7 +15822,7 @@
       <w:lvlText w:val="o"/>
       <w:lvlJc w:val="left"/>
       <w:pPr>
-        <w:ind w:left="5760" w:hanging="360"/>
+        <w:ind w:left="5967" w:hanging="360"/>
       </w:pPr>
       <w:rPr>
         <w:rFonts w:ascii="Courier New" w:hAnsi="Courier New" w:cs="Courier New" w:hint="default"/>
@@ -14781,6 +15834,120 @@
       <w:lvlText w:val=""/>
       <w:lvlJc w:val="left"/>
       <w:pPr>
+        <w:ind w:left="6687" w:hanging="360"/>
+      </w:pPr>
+      <w:rPr>
+        <w:rFonts w:ascii="Wingdings" w:hAnsi="Wingdings" w:hint="default"/>
+      </w:rPr>
+    </w:lvl>
+  </w:abstractNum>
+  <w:abstractNum w:abstractNumId="13" w15:restartNumberingAfterBreak="0">
+    <w:nsid w:val="7D3A75FD"/>
+    <w:multiLevelType w:val="hybridMultilevel"/>
+    <w:tmpl w:val="1380730C"/>
+    <w:lvl w:ilvl="0" w:tplc="59CEC4E2">
+      <w:start w:val="2"/>
+      <w:numFmt w:val="bullet"/>
+      <w:lvlText w:val="-"/>
+      <w:lvlJc w:val="left"/>
+      <w:pPr>
+        <w:ind w:left="360" w:hanging="360"/>
+      </w:pPr>
+      <w:rPr>
+        <w:rFonts w:ascii="Arial" w:eastAsiaTheme="minorHAnsi" w:hAnsi="Arial" w:cs="Arial" w:hint="default"/>
+        <w:sz w:val="24"/>
+      </w:rPr>
+    </w:lvl>
+    <w:lvl w:ilvl="1" w:tplc="0C0A0001">
+      <w:start w:val="1"/>
+      <w:numFmt w:val="bullet"/>
+      <w:lvlText w:val=""/>
+      <w:lvlJc w:val="left"/>
+      <w:pPr>
+        <w:ind w:left="785" w:hanging="360"/>
+      </w:pPr>
+      <w:rPr>
+        <w:rFonts w:ascii="Symbol" w:hAnsi="Symbol" w:hint="default"/>
+      </w:rPr>
+    </w:lvl>
+    <w:lvl w:ilvl="2" w:tplc="0C0A0005">
+      <w:start w:val="1"/>
+      <w:numFmt w:val="bullet"/>
+      <w:lvlText w:val=""/>
+      <w:lvlJc w:val="left"/>
+      <w:pPr>
+        <w:ind w:left="1069" w:hanging="360"/>
+      </w:pPr>
+      <w:rPr>
+        <w:rFonts w:ascii="Wingdings" w:hAnsi="Wingdings" w:hint="default"/>
+      </w:rPr>
+    </w:lvl>
+    <w:lvl w:ilvl="3" w:tplc="0C0A0001" w:tentative="1">
+      <w:start w:val="1"/>
+      <w:numFmt w:val="bullet"/>
+      <w:lvlText w:val=""/>
+      <w:lvlJc w:val="left"/>
+      <w:pPr>
+        <w:ind w:left="2880" w:hanging="360"/>
+      </w:pPr>
+      <w:rPr>
+        <w:rFonts w:ascii="Symbol" w:hAnsi="Symbol" w:hint="default"/>
+      </w:rPr>
+    </w:lvl>
+    <w:lvl w:ilvl="4" w:tplc="0C0A0003" w:tentative="1">
+      <w:start w:val="1"/>
+      <w:numFmt w:val="bullet"/>
+      <w:lvlText w:val="o"/>
+      <w:lvlJc w:val="left"/>
+      <w:pPr>
+        <w:ind w:left="3600" w:hanging="360"/>
+      </w:pPr>
+      <w:rPr>
+        <w:rFonts w:ascii="Courier New" w:hAnsi="Courier New" w:cs="Courier New" w:hint="default"/>
+      </w:rPr>
+    </w:lvl>
+    <w:lvl w:ilvl="5" w:tplc="0C0A0005" w:tentative="1">
+      <w:start w:val="1"/>
+      <w:numFmt w:val="bullet"/>
+      <w:lvlText w:val=""/>
+      <w:lvlJc w:val="left"/>
+      <w:pPr>
+        <w:ind w:left="4320" w:hanging="360"/>
+      </w:pPr>
+      <w:rPr>
+        <w:rFonts w:ascii="Wingdings" w:hAnsi="Wingdings" w:hint="default"/>
+      </w:rPr>
+    </w:lvl>
+    <w:lvl w:ilvl="6" w:tplc="0C0A0001" w:tentative="1">
+      <w:start w:val="1"/>
+      <w:numFmt w:val="bullet"/>
+      <w:lvlText w:val=""/>
+      <w:lvlJc w:val="left"/>
+      <w:pPr>
+        <w:ind w:left="5040" w:hanging="360"/>
+      </w:pPr>
+      <w:rPr>
+        <w:rFonts w:ascii="Symbol" w:hAnsi="Symbol" w:hint="default"/>
+      </w:rPr>
+    </w:lvl>
+    <w:lvl w:ilvl="7" w:tplc="0C0A0003" w:tentative="1">
+      <w:start w:val="1"/>
+      <w:numFmt w:val="bullet"/>
+      <w:lvlText w:val="o"/>
+      <w:lvlJc w:val="left"/>
+      <w:pPr>
+        <w:ind w:left="5760" w:hanging="360"/>
+      </w:pPr>
+      <w:rPr>
+        <w:rFonts w:ascii="Courier New" w:hAnsi="Courier New" w:cs="Courier New" w:hint="default"/>
+      </w:rPr>
+    </w:lvl>
+    <w:lvl w:ilvl="8" w:tplc="0C0A0005" w:tentative="1">
+      <w:start w:val="1"/>
+      <w:numFmt w:val="bullet"/>
+      <w:lvlText w:val=""/>
+      <w:lvlJc w:val="left"/>
+      <w:pPr>
         <w:ind w:left="6480" w:hanging="360"/>
       </w:pPr>
       <w:rPr>
@@ -14792,16 +15959,16 @@
     <w:abstractNumId w:val="0"/>
   </w:num>
   <w:num w:numId="2">
-    <w:abstractNumId w:val="11"/>
+    <w:abstractNumId w:val="13"/>
   </w:num>
   <w:num w:numId="3">
     <w:abstractNumId w:val="1"/>
   </w:num>
   <w:num w:numId="4">
-    <w:abstractNumId w:val="9"/>
+    <w:abstractNumId w:val="10"/>
   </w:num>
   <w:num w:numId="5">
-    <w:abstractNumId w:val="8"/>
+    <w:abstractNumId w:val="9"/>
   </w:num>
   <w:num w:numId="6">
     <w:abstractNumId w:val="6"/>
@@ -14816,13 +15983,19 @@
     <w:abstractNumId w:val="4"/>
   </w:num>
   <w:num w:numId="10">
-    <w:abstractNumId w:val="7"/>
+    <w:abstractNumId w:val="8"/>
   </w:num>
   <w:num w:numId="11">
-    <w:abstractNumId w:val="10"/>
+    <w:abstractNumId w:val="11"/>
   </w:num>
   <w:num w:numId="12">
     <w:abstractNumId w:val="2"/>
+  </w:num>
+  <w:num w:numId="13">
+    <w:abstractNumId w:val="7"/>
+  </w:num>
+  <w:num w:numId="14">
+    <w:abstractNumId w:val="12"/>
   </w:num>
 </w:numbering>
 </file>
@@ -15498,7 +16671,562 @@
       <w:szCs w:val="20"/>
     </w:rPr>
   </w:style>
+  <w:style w:type="character" w:styleId="Textodelmarcadordeposicin">
+    <w:name w:val="Placeholder Text"/>
+    <w:basedOn w:val="Fuentedeprrafopredeter"/>
+    <w:uiPriority w:val="99"/>
+    <w:semiHidden/>
+    <w:rsid w:val="009A1F3B"/>
+    <w:rPr>
+      <w:color w:val="808080"/>
+    </w:rPr>
+  </w:style>
 </w:styles>
+</file>
+
+<file path=word/glossary/document.xml><?xml version="1.0" encoding="utf-8"?>
+<w:glossaryDocument xmlns:wpc="http://schemas.microsoft.com/office/word/2010/wordprocessingCanvas" xmlns:mc="http://schemas.openxmlformats.org/markup-compatibility/2006" xmlns:o="urn:schemas-microsoft-com:office:office" xmlns:r="http://schemas.openxmlformats.org/officeDocument/2006/relationships" xmlns:m="http://schemas.openxmlformats.org/officeDocument/2006/math" xmlns:v="urn:schemas-microsoft-com:vml" xmlns:wp14="http://schemas.microsoft.com/office/word/2010/wordprocessingDrawing" xmlns:wp="http://schemas.openxmlformats.org/drawingml/2006/wordprocessingDrawing" xmlns:w10="urn:schemas-microsoft-com:office:word" xmlns:w="http://schemas.openxmlformats.org/wordprocessingml/2006/main" xmlns:w14="http://schemas.microsoft.com/office/word/2010/wordml" xmlns:w15="http://schemas.microsoft.com/office/word/2012/wordml" xmlns:wpg="http://schemas.microsoft.com/office/word/2010/wordprocessingGroup" xmlns:wpi="http://schemas.microsoft.com/office/word/2010/wordprocessingInk" xmlns:wne="http://schemas.microsoft.com/office/word/2006/wordml" xmlns:wps="http://schemas.microsoft.com/office/word/2010/wordprocessingShape" mc:Ignorable="w14 w15 wp14"/>
+</file>
+
+<file path=word/glossary/fontTable.xml><?xml version="1.0" encoding="utf-8"?>
+<w:fonts xmlns:mc="http://schemas.openxmlformats.org/markup-compatibility/2006" xmlns:r="http://schemas.openxmlformats.org/officeDocument/2006/relationships" xmlns:w="http://schemas.openxmlformats.org/wordprocessingml/2006/main" xmlns:w14="http://schemas.microsoft.com/office/word/2010/wordml" xmlns:w15="http://schemas.microsoft.com/office/word/2012/wordml" mc:Ignorable="w14 w15">
+  <w:font w:name="Times New Roman">
+    <w:panose1 w:val="02020603050405020304"/>
+    <w:charset w:val="00"/>
+    <w:family w:val="roman"/>
+    <w:pitch w:val="variable"/>
+    <w:sig w:usb0="E0002EFF" w:usb1="C000785B" w:usb2="00000009" w:usb3="00000000" w:csb0="000001FF" w:csb1="00000000"/>
+  </w:font>
+  <w:font w:name="Symbol">
+    <w:panose1 w:val="05050102010706020507"/>
+    <w:charset w:val="02"/>
+    <w:family w:val="roman"/>
+    <w:pitch w:val="variable"/>
+    <w:sig w:usb0="00000000" w:usb1="10000000" w:usb2="00000000" w:usb3="00000000" w:csb0="80000000" w:csb1="00000000"/>
+  </w:font>
+  <w:font w:name="Courier New">
+    <w:panose1 w:val="02070309020205020404"/>
+    <w:charset w:val="00"/>
+    <w:family w:val="modern"/>
+    <w:pitch w:val="fixed"/>
+    <w:sig w:usb0="E0002EFF" w:usb1="C0007843" w:usb2="00000009" w:usb3="00000000" w:csb0="000001FF" w:csb1="00000000"/>
+  </w:font>
+  <w:font w:name="Wingdings">
+    <w:panose1 w:val="05000000000000000000"/>
+    <w:charset w:val="02"/>
+    <w:family w:val="auto"/>
+    <w:pitch w:val="variable"/>
+    <w:sig w:usb0="00000000" w:usb1="10000000" w:usb2="00000000" w:usb3="00000000" w:csb0="80000000" w:csb1="00000000"/>
+  </w:font>
+  <w:font w:name="Arial">
+    <w:panose1 w:val="020B0604020202020204"/>
+    <w:charset w:val="00"/>
+    <w:family w:val="swiss"/>
+    <w:pitch w:val="variable"/>
+    <w:sig w:usb0="E0002EFF" w:usb1="C000785B" w:usb2="00000009" w:usb3="00000000" w:csb0="000001FF" w:csb1="00000000"/>
+  </w:font>
+  <w:font w:name="Calibri">
+    <w:panose1 w:val="020F0502020204030204"/>
+    <w:charset w:val="00"/>
+    <w:family w:val="swiss"/>
+    <w:pitch w:val="variable"/>
+    <w:sig w:usb0="E4002EFF" w:usb1="C200247B" w:usb2="00000009" w:usb3="00000000" w:csb0="000001FF" w:csb1="00000000"/>
+  </w:font>
+  <w:font w:name="Calibri Light">
+    <w:panose1 w:val="020F0302020204030204"/>
+    <w:charset w:val="00"/>
+    <w:family w:val="swiss"/>
+    <w:pitch w:val="variable"/>
+    <w:sig w:usb0="E4002EFF" w:usb1="C200247B" w:usb2="00000009" w:usb3="00000000" w:csb0="000001FF" w:csb1="00000000"/>
+  </w:font>
+  <w:font w:name="Cambria Math">
+    <w:panose1 w:val="02040503050406030204"/>
+    <w:charset w:val="00"/>
+    <w:family w:val="roman"/>
+    <w:pitch w:val="variable"/>
+    <w:sig w:usb0="E00006FF" w:usb1="420024FF" w:usb2="02000000" w:usb3="00000000" w:csb0="0000019F" w:csb1="00000000"/>
+  </w:font>
+</w:fonts>
+</file>
+
+<file path=word/glossary/settings.xml><?xml version="1.0" encoding="utf-8"?>
+<w:settings xmlns:mc="http://schemas.openxmlformats.org/markup-compatibility/2006" xmlns:o="urn:schemas-microsoft-com:office:office" xmlns:r="http://schemas.openxmlformats.org/officeDocument/2006/relationships" xmlns:m="http://schemas.openxmlformats.org/officeDocument/2006/math" xmlns:v="urn:schemas-microsoft-com:vml" xmlns:w10="urn:schemas-microsoft-com:office:word" xmlns:w="http://schemas.openxmlformats.org/wordprocessingml/2006/main" xmlns:w14="http://schemas.microsoft.com/office/word/2010/wordml" xmlns:w15="http://schemas.microsoft.com/office/word/2012/wordml" xmlns:sl="http://schemas.openxmlformats.org/schemaLibrary/2006/main" mc:Ignorable="w14 w15">
+  <w:view w:val="normal"/>
+  <w:defaultTabStop w:val="708"/>
+  <w:hyphenationZone w:val="425"/>
+  <w:characterSpacingControl w:val="doNotCompress"/>
+  <w:compat>
+    <w:useFELayout/>
+    <w:compatSetting w:name="compatibilityMode" w:uri="http://schemas.microsoft.com/office/word" w:val="15"/>
+    <w:compatSetting w:name="overrideTableStyleFontSizeAndJustification" w:uri="http://schemas.microsoft.com/office/word" w:val="1"/>
+    <w:compatSetting w:name="enableOpenTypeFeatures" w:uri="http://schemas.microsoft.com/office/word" w:val="1"/>
+    <w:compatSetting w:name="doNotFlipMirrorIndents" w:uri="http://schemas.microsoft.com/office/word" w:val="1"/>
+    <w:compatSetting w:name="differentiateMultirowTableHeaders" w:uri="http://schemas.microsoft.com/office/word" w:val="1"/>
+  </w:compat>
+  <w:rsids>
+    <w:rsidRoot w:val="00CA3920"/>
+    <w:rsid w:val="00CA3920"/>
+  </w:rsids>
+  <m:mathPr>
+    <m:mathFont m:val="Cambria Math"/>
+    <m:brkBin m:val="before"/>
+    <m:brkBinSub m:val="--"/>
+    <m:smallFrac m:val="0"/>
+    <m:dispDef/>
+    <m:lMargin m:val="0"/>
+    <m:rMargin m:val="0"/>
+    <m:defJc m:val="centerGroup"/>
+    <m:wrapIndent m:val="1440"/>
+    <m:intLim m:val="subSup"/>
+    <m:naryLim m:val="undOvr"/>
+  </m:mathPr>
+  <w:themeFontLang w:val="es-ES"/>
+  <w:clrSchemeMapping w:bg1="light1" w:t1="dark1" w:bg2="light2" w:t2="dark2" w:accent1="accent1" w:accent2="accent2" w:accent3="accent3" w:accent4="accent4" w:accent5="accent5" w:accent6="accent6" w:hyperlink="hyperlink" w:followedHyperlink="followedHyperlink"/>
+  <w:decimalSymbol w:val=","/>
+  <w:listSeparator w:val=";"/>
+  <w15:chartTrackingRefBased/>
+</w:settings>
+</file>
+
+<file path=word/glossary/styles.xml><?xml version="1.0" encoding="utf-8"?>
+<w:styles xmlns:mc="http://schemas.openxmlformats.org/markup-compatibility/2006" xmlns:r="http://schemas.openxmlformats.org/officeDocument/2006/relationships" xmlns:w="http://schemas.openxmlformats.org/wordprocessingml/2006/main" xmlns:w14="http://schemas.microsoft.com/office/word/2010/wordml" xmlns:w15="http://schemas.microsoft.com/office/word/2012/wordml" mc:Ignorable="w14 w15">
+  <w:docDefaults>
+    <w:rPrDefault>
+      <w:rPr>
+        <w:rFonts w:asciiTheme="minorHAnsi" w:eastAsiaTheme="minorEastAsia" w:hAnsiTheme="minorHAnsi" w:cstheme="minorBidi"/>
+        <w:sz w:val="22"/>
+        <w:szCs w:val="22"/>
+        <w:lang w:val="es-ES" w:eastAsia="es-ES" w:bidi="ar-SA"/>
+      </w:rPr>
+    </w:rPrDefault>
+    <w:pPrDefault>
+      <w:pPr>
+        <w:spacing w:after="160" w:line="259" w:lineRule="auto"/>
+      </w:pPr>
+    </w:pPrDefault>
+  </w:docDefaults>
+  <w:latentStyles w:defLockedState="0" w:defUIPriority="99" w:defSemiHidden="0" w:defUnhideWhenUsed="0" w:defQFormat="0" w:count="371">
+    <w:lsdException w:name="Normal" w:uiPriority="0" w:qFormat="1"/>
+    <w:lsdException w:name="heading 1" w:uiPriority="9" w:qFormat="1"/>
+    <w:lsdException w:name="heading 2" w:semiHidden="1" w:uiPriority="9" w:unhideWhenUsed="1" w:qFormat="1"/>
+    <w:lsdException w:name="heading 3" w:semiHidden="1" w:uiPriority="9" w:unhideWhenUsed="1" w:qFormat="1"/>
+    <w:lsdException w:name="heading 4" w:semiHidden="1" w:uiPriority="9" w:unhideWhenUsed="1" w:qFormat="1"/>
+    <w:lsdException w:name="heading 5" w:semiHidden="1" w:uiPriority="9" w:unhideWhenUsed="1" w:qFormat="1"/>
+    <w:lsdException w:name="heading 6" w:semiHidden="1" w:uiPriority="9" w:unhideWhenUsed="1" w:qFormat="1"/>
+    <w:lsdException w:name="heading 7" w:semiHidden="1" w:uiPriority="9" w:unhideWhenUsed="1" w:qFormat="1"/>
+    <w:lsdException w:name="heading 8" w:semiHidden="1" w:uiPriority="9" w:unhideWhenUsed="1" w:qFormat="1"/>
+    <w:lsdException w:name="heading 9" w:semiHidden="1" w:uiPriority="9" w:unhideWhenUsed="1" w:qFormat="1"/>
+    <w:lsdException w:name="index 1" w:semiHidden="1" w:unhideWhenUsed="1"/>
+    <w:lsdException w:name="index 2" w:semiHidden="1" w:unhideWhenUsed="1"/>
+    <w:lsdException w:name="index 3" w:semiHidden="1" w:unhideWhenUsed="1"/>
+    <w:lsdException w:name="index 4" w:semiHidden="1" w:unhideWhenUsed="1"/>
+    <w:lsdException w:name="index 5" w:semiHidden="1" w:unhideWhenUsed="1"/>
+    <w:lsdException w:name="index 6" w:semiHidden="1" w:unhideWhenUsed="1"/>
+    <w:lsdException w:name="index 7" w:semiHidden="1" w:unhideWhenUsed="1"/>
+    <w:lsdException w:name="index 8" w:semiHidden="1" w:unhideWhenUsed="1"/>
+    <w:lsdException w:name="index 9" w:semiHidden="1" w:unhideWhenUsed="1"/>
+    <w:lsdException w:name="toc 1" w:semiHidden="1" w:uiPriority="39" w:unhideWhenUsed="1"/>
+    <w:lsdException w:name="toc 2" w:semiHidden="1" w:uiPriority="39" w:unhideWhenUsed="1"/>
+    <w:lsdException w:name="toc 3" w:semiHidden="1" w:uiPriority="39" w:unhideWhenUsed="1"/>
+    <w:lsdException w:name="toc 4" w:semiHidden="1" w:uiPriority="39" w:unhideWhenUsed="1"/>
+    <w:lsdException w:name="toc 5" w:semiHidden="1" w:uiPriority="39" w:unhideWhenUsed="1"/>
+    <w:lsdException w:name="toc 6" w:semiHidden="1" w:uiPriority="39" w:unhideWhenUsed="1"/>
+    <w:lsdException w:name="toc 7" w:semiHidden="1" w:uiPriority="39" w:unhideWhenUsed="1"/>
+    <w:lsdException w:name="toc 8" w:semiHidden="1" w:uiPriority="39" w:unhideWhenUsed="1"/>
+    <w:lsdException w:name="toc 9" w:semiHidden="1" w:uiPriority="39" w:unhideWhenUsed="1"/>
+    <w:lsdException w:name="Normal Indent" w:semiHidden="1" w:unhideWhenUsed="1"/>
+    <w:lsdException w:name="footnote text" w:semiHidden="1" w:unhideWhenUsed="1"/>
+    <w:lsdException w:name="annotation text" w:semiHidden="1" w:unhideWhenUsed="1"/>
+    <w:lsdException w:name="header" w:semiHidden="1" w:unhideWhenUsed="1"/>
+    <w:lsdException w:name="footer" w:semiHidden="1" w:unhideWhenUsed="1"/>
+    <w:lsdException w:name="index heading" w:semiHidden="1" w:unhideWhenUsed="1"/>
+    <w:lsdException w:name="caption" w:semiHidden="1" w:uiPriority="35" w:unhideWhenUsed="1" w:qFormat="1"/>
+    <w:lsdException w:name="table of figures" w:semiHidden="1" w:unhideWhenUsed="1"/>
+    <w:lsdException w:name="envelope address" w:semiHidden="1" w:unhideWhenUsed="1"/>
+    <w:lsdException w:name="envelope return" w:semiHidden="1" w:unhideWhenUsed="1"/>
+    <w:lsdException w:name="footnote reference" w:semiHidden="1" w:unhideWhenUsed="1"/>
+    <w:lsdException w:name="annotation reference" w:semiHidden="1" w:unhideWhenUsed="1"/>
+    <w:lsdException w:name="line number" w:semiHidden="1" w:unhideWhenUsed="1"/>
+    <w:lsdException w:name="page number" w:semiHidden="1" w:unhideWhenUsed="1"/>
+    <w:lsdException w:name="endnote reference" w:semiHidden="1" w:unhideWhenUsed="1"/>
+    <w:lsdException w:name="endnote text" w:semiHidden="1" w:unhideWhenUsed="1"/>
+    <w:lsdException w:name="table of authorities" w:semiHidden="1" w:unhideWhenUsed="1"/>
+    <w:lsdException w:name="macro" w:semiHidden="1" w:unhideWhenUsed="1"/>
+    <w:lsdException w:name="toa heading" w:semiHidden="1" w:unhideWhenUsed="1"/>
+    <w:lsdException w:name="List" w:semiHidden="1" w:unhideWhenUsed="1"/>
+    <w:lsdException w:name="List Bullet" w:semiHidden="1" w:unhideWhenUsed="1"/>
+    <w:lsdException w:name="List Number" w:semiHidden="1" w:unhideWhenUsed="1"/>
+    <w:lsdException w:name="List 2" w:semiHidden="1" w:unhideWhenUsed="1"/>
+    <w:lsdException w:name="List 3" w:semiHidden="1" w:unhideWhenUsed="1"/>
+    <w:lsdException w:name="List 4" w:semiHidden="1" w:unhideWhenUsed="1"/>
+    <w:lsdException w:name="List 5" w:semiHidden="1" w:unhideWhenUsed="1"/>
+    <w:lsdException w:name="List Bullet 2" w:semiHidden="1" w:unhideWhenUsed="1"/>
+    <w:lsdException w:name="List Bullet 3" w:semiHidden="1" w:unhideWhenUsed="1"/>
+    <w:lsdException w:name="List Bullet 4" w:semiHidden="1" w:unhideWhenUsed="1"/>
+    <w:lsdException w:name="List Bullet 5" w:semiHidden="1" w:unhideWhenUsed="1"/>
+    <w:lsdException w:name="List Number 2" w:semiHidden="1" w:unhideWhenUsed="1"/>
+    <w:lsdException w:name="List Number 3" w:semiHidden="1" w:unhideWhenUsed="1"/>
+    <w:lsdException w:name="List Number 4" w:semiHidden="1" w:unhideWhenUsed="1"/>
+    <w:lsdException w:name="List Number 5" w:semiHidden="1" w:unhideWhenUsed="1"/>
+    <w:lsdException w:name="Title" w:uiPriority="10" w:qFormat="1"/>
+    <w:lsdException w:name="Closing" w:semiHidden="1" w:unhideWhenUsed="1"/>
+    <w:lsdException w:name="Signature" w:semiHidden="1" w:unhideWhenUsed="1"/>
+    <w:lsdException w:name="Default Paragraph Font" w:semiHidden="1" w:uiPriority="1" w:unhideWhenUsed="1"/>
+    <w:lsdException w:name="Body Text" w:semiHidden="1" w:unhideWhenUsed="1"/>
+    <w:lsdException w:name="Body Text Indent" w:semiHidden="1" w:unhideWhenUsed="1"/>
+    <w:lsdException w:name="List Continue" w:semiHidden="1" w:unhideWhenUsed="1"/>
+    <w:lsdException w:name="List Continue 2" w:semiHidden="1" w:unhideWhenUsed="1"/>
+    <w:lsdException w:name="List Continue 3" w:semiHidden="1" w:unhideWhenUsed="1"/>
+    <w:lsdException w:name="List Continue 4" w:semiHidden="1" w:unhideWhenUsed="1"/>
+    <w:lsdException w:name="List Continue 5" w:semiHidden="1" w:unhideWhenUsed="1"/>
+    <w:lsdException w:name="Message Header" w:semiHidden="1" w:unhideWhenUsed="1"/>
+    <w:lsdException w:name="Subtitle" w:uiPriority="11" w:qFormat="1"/>
+    <w:lsdException w:name="Salutation" w:semiHidden="1" w:unhideWhenUsed="1"/>
+    <w:lsdException w:name="Date" w:semiHidden="1" w:unhideWhenUsed="1"/>
+    <w:lsdException w:name="Body Text First Indent" w:semiHidden="1" w:unhideWhenUsed="1"/>
+    <w:lsdException w:name="Body Text First Indent 2" w:semiHidden="1" w:unhideWhenUsed="1"/>
+    <w:lsdException w:name="Note Heading" w:semiHidden="1" w:unhideWhenUsed="1"/>
+    <w:lsdException w:name="Body Text 2" w:semiHidden="1" w:unhideWhenUsed="1"/>
+    <w:lsdException w:name="Body Text 3" w:semiHidden="1" w:unhideWhenUsed="1"/>
+    <w:lsdException w:name="Body Text Indent 2" w:semiHidden="1" w:unhideWhenUsed="1"/>
+    <w:lsdException w:name="Body Text Indent 3" w:semiHidden="1" w:unhideWhenUsed="1"/>
+    <w:lsdException w:name="Block Text" w:semiHidden="1" w:unhideWhenUsed="1"/>
+    <w:lsdException w:name="Hyperlink" w:semiHidden="1" w:unhideWhenUsed="1"/>
+    <w:lsdException w:name="FollowedHyperlink" w:semiHidden="1" w:unhideWhenUsed="1"/>
+    <w:lsdException w:name="Strong" w:uiPriority="22" w:qFormat="1"/>
+    <w:lsdException w:name="Emphasis" w:uiPriority="20" w:qFormat="1"/>
+    <w:lsdException w:name="Document Map" w:semiHidden="1" w:unhideWhenUsed="1"/>
+    <w:lsdException w:name="Plain Text" w:semiHidden="1" w:unhideWhenUsed="1"/>
+    <w:lsdException w:name="E-mail Signature" w:semiHidden="1" w:unhideWhenUsed="1"/>
+    <w:lsdException w:name="HTML Top of Form" w:semiHidden="1" w:unhideWhenUsed="1"/>
+    <w:lsdException w:name="HTML Bottom of Form" w:semiHidden="1" w:unhideWhenUsed="1"/>
+    <w:lsdException w:name="Normal (Web)" w:semiHidden="1" w:unhideWhenUsed="1"/>
+    <w:lsdException w:name="HTML Acronym" w:semiHidden="1" w:unhideWhenUsed="1"/>
+    <w:lsdException w:name="HTML Address" w:semiHidden="1" w:unhideWhenUsed="1"/>
+    <w:lsdException w:name="HTML Cite" w:semiHidden="1" w:unhideWhenUsed="1"/>
+    <w:lsdException w:name="HTML Code" w:semiHidden="1" w:unhideWhenUsed="1"/>
+    <w:lsdException w:name="HTML Definition" w:semiHidden="1" w:unhideWhenUsed="1"/>
+    <w:lsdException w:name="HTML Keyboard" w:semiHidden="1" w:unhideWhenUsed="1"/>
+    <w:lsdException w:name="HTML Preformatted" w:semiHidden="1" w:unhideWhenUsed="1"/>
+    <w:lsdException w:name="HTML Sample" w:semiHidden="1" w:unhideWhenUsed="1"/>
+    <w:lsdException w:name="HTML Typewriter" w:semiHidden="1" w:unhideWhenUsed="1"/>
+    <w:lsdException w:name="HTML Variable" w:semiHidden="1" w:unhideWhenUsed="1"/>
+    <w:lsdException w:name="Normal Table" w:semiHidden="1" w:unhideWhenUsed="1"/>
+    <w:lsdException w:name="annotation subject" w:semiHidden="1" w:unhideWhenUsed="1"/>
+    <w:lsdException w:name="No List" w:semiHidden="1" w:unhideWhenUsed="1"/>
+    <w:lsdException w:name="Outline List 1" w:semiHidden="1" w:unhideWhenUsed="1"/>
+    <w:lsdException w:name="Outline List 2" w:semiHidden="1" w:unhideWhenUsed="1"/>
+    <w:lsdException w:name="Outline List 3" w:semiHidden="1" w:unhideWhenUsed="1"/>
+    <w:lsdException w:name="Table Simple 1" w:semiHidden="1" w:unhideWhenUsed="1"/>
+    <w:lsdException w:name="Table Simple 2" w:semiHidden="1" w:unhideWhenUsed="1"/>
+    <w:lsdException w:name="Table Simple 3" w:semiHidden="1" w:unhideWhenUsed="1"/>
+    <w:lsdException w:name="Table Classic 1" w:semiHidden="1" w:unhideWhenUsed="1"/>
+    <w:lsdException w:name="Table Classic 2" w:semiHidden="1" w:unhideWhenUsed="1"/>
+    <w:lsdException w:name="Table Classic 3" w:semiHidden="1" w:unhideWhenUsed="1"/>
+    <w:lsdException w:name="Table Classic 4" w:semiHidden="1" w:unhideWhenUsed="1"/>
+    <w:lsdException w:name="Table Colorful 1" w:semiHidden="1" w:unhideWhenUsed="1"/>
+    <w:lsdException w:name="Table Colorful 2" w:semiHidden="1" w:unhideWhenUsed="1"/>
+    <w:lsdException w:name="Table Colorful 3" w:semiHidden="1" w:unhideWhenUsed="1"/>
+    <w:lsdException w:name="Table Columns 1" w:semiHidden="1" w:unhideWhenUsed="1"/>
+    <w:lsdException w:name="Table Columns 2" w:semiHidden="1" w:unhideWhenUsed="1"/>
+    <w:lsdException w:name="Table Columns 3" w:semiHidden="1" w:unhideWhenUsed="1"/>
+    <w:lsdException w:name="Table Columns 4" w:semiHidden="1" w:unhideWhenUsed="1"/>
+    <w:lsdException w:name="Table Columns 5" w:semiHidden="1" w:unhideWhenUsed="1"/>
+    <w:lsdException w:name="Table Grid 1" w:semiHidden="1" w:unhideWhenUsed="1"/>
+    <w:lsdException w:name="Table Grid 2" w:semiHidden="1" w:unhideWhenUsed="1"/>
+    <w:lsdException w:name="Table Grid 3" w:semiHidden="1" w:unhideWhenUsed="1"/>
+    <w:lsdException w:name="Table Grid 4" w:semiHidden="1" w:unhideWhenUsed="1"/>
+    <w:lsdException w:name="Table Grid 5" w:semiHidden="1" w:unhideWhenUsed="1"/>
+    <w:lsdException w:name="Table Grid 6" w:semiHidden="1" w:unhideWhenUsed="1"/>
+    <w:lsdException w:name="Table Grid 7" w:semiHidden="1" w:unhideWhenUsed="1"/>
+    <w:lsdException w:name="Table Grid 8" w:semiHidden="1" w:unhideWhenUsed="1"/>
+    <w:lsdException w:name="Table List 1" w:semiHidden="1" w:unhideWhenUsed="1"/>
+    <w:lsdException w:name="Table List 2" w:semiHidden="1" w:unhideWhenUsed="1"/>
+    <w:lsdException w:name="Table List 3" w:semiHidden="1" w:unhideWhenUsed="1"/>
+    <w:lsdException w:name="Table List 4" w:semiHidden="1" w:unhideWhenUsed="1"/>
+    <w:lsdException w:name="Table List 5" w:semiHidden="1" w:unhideWhenUsed="1"/>
+    <w:lsdException w:name="Table List 6" w:semiHidden="1" w:unhideWhenUsed="1"/>
+    <w:lsdException w:name="Table List 7" w:semiHidden="1" w:unhideWhenUsed="1"/>
+    <w:lsdException w:name="Table List 8" w:semiHidden="1" w:unhideWhenUsed="1"/>
+    <w:lsdException w:name="Table 3D effects 1" w:semiHidden="1" w:unhideWhenUsed="1"/>
+    <w:lsdException w:name="Table 3D effects 2" w:semiHidden="1" w:unhideWhenUsed="1"/>
+    <w:lsdException w:name="Table 3D effects 3" w:semiHidden="1" w:unhideWhenUsed="1"/>
+    <w:lsdException w:name="Table Contemporary" w:semiHidden="1" w:unhideWhenUsed="1"/>
+    <w:lsdException w:name="Table Elegant" w:semiHidden="1" w:unhideWhenUsed="1"/>
+    <w:lsdException w:name="Table Professional" w:semiHidden="1" w:unhideWhenUsed="1"/>
+    <w:lsdException w:name="Table Subtle 1" w:semiHidden="1" w:unhideWhenUsed="1"/>
+    <w:lsdException w:name="Table Subtle 2" w:semiHidden="1" w:unhideWhenUsed="1"/>
+    <w:lsdException w:name="Table Web 1" w:semiHidden="1" w:unhideWhenUsed="1"/>
+    <w:lsdException w:name="Table Web 2" w:semiHidden="1" w:unhideWhenUsed="1"/>
+    <w:lsdException w:name="Table Web 3" w:semiHidden="1" w:unhideWhenUsed="1"/>
+    <w:lsdException w:name="Balloon Text" w:semiHidden="1" w:unhideWhenUsed="1"/>
+    <w:lsdException w:name="Table Grid" w:uiPriority="39"/>
+    <w:lsdException w:name="Table Theme" w:semiHidden="1" w:unhideWhenUsed="1"/>
+    <w:lsdException w:name="Placeholder Text" w:semiHidden="1"/>
+    <w:lsdException w:name="No Spacing" w:uiPriority="1" w:qFormat="1"/>
+    <w:lsdException w:name="Light Shading" w:uiPriority="60"/>
+    <w:lsdException w:name="Light List" w:uiPriority="61"/>
+    <w:lsdException w:name="Light Grid" w:uiPriority="62"/>
+    <w:lsdException w:name="Medium Shading 1" w:uiPriority="63"/>
+    <w:lsdException w:name="Medium Shading 2" w:uiPriority="64"/>
+    <w:lsdException w:name="Medium List 1" w:uiPriority="65"/>
+    <w:lsdException w:name="Medium List 2" w:uiPriority="66"/>
+    <w:lsdException w:name="Medium Grid 1" w:uiPriority="67"/>
+    <w:lsdException w:name="Medium Grid 2" w:uiPriority="68"/>
+    <w:lsdException w:name="Medium Grid 3" w:uiPriority="69"/>
+    <w:lsdException w:name="Dark List" w:uiPriority="70"/>
+    <w:lsdException w:name="Colorful Shading" w:uiPriority="71"/>
+    <w:lsdException w:name="Colorful List" w:uiPriority="72"/>
+    <w:lsdException w:name="Colorful Grid" w:uiPriority="73"/>
+    <w:lsdException w:name="Light Shading Accent 1" w:uiPriority="60"/>
+    <w:lsdException w:name="Light List Accent 1" w:uiPriority="61"/>
+    <w:lsdException w:name="Light Grid Accent 1" w:uiPriority="62"/>
+    <w:lsdException w:name="Medium Shading 1 Accent 1" w:uiPriority="63"/>
+    <w:lsdException w:name="Medium Shading 2 Accent 1" w:uiPriority="64"/>
+    <w:lsdException w:name="Medium List 1 Accent 1" w:uiPriority="65"/>
+    <w:lsdException w:name="Revision" w:semiHidden="1"/>
+    <w:lsdException w:name="List Paragraph" w:uiPriority="34" w:qFormat="1"/>
+    <w:lsdException w:name="Quote" w:uiPriority="29" w:qFormat="1"/>
+    <w:lsdException w:name="Intense Quote" w:uiPriority="30" w:qFormat="1"/>
+    <w:lsdException w:name="Medium List 2 Accent 1" w:uiPriority="66"/>
+    <w:lsdException w:name="Medium Grid 1 Accent 1" w:uiPriority="67"/>
+    <w:lsdException w:name="Medium Grid 2 Accent 1" w:uiPriority="68"/>
+    <w:lsdException w:name="Medium Grid 3 Accent 1" w:uiPriority="69"/>
+    <w:lsdException w:name="Dark List Accent 1" w:uiPriority="70"/>
+    <w:lsdException w:name="Colorful Shading Accent 1" w:uiPriority="71"/>
+    <w:lsdException w:name="Colorful List Accent 1" w:uiPriority="72"/>
+    <w:lsdException w:name="Colorful Grid Accent 1" w:uiPriority="73"/>
+    <w:lsdException w:name="Light Shading Accent 2" w:uiPriority="60"/>
+    <w:lsdException w:name="Light List Accent 2" w:uiPriority="61"/>
+    <w:lsdException w:name="Light Grid Accent 2" w:uiPriority="62"/>
+    <w:lsdException w:name="Medium Shading 1 Accent 2" w:uiPriority="63"/>
+    <w:lsdException w:name="Medium Shading 2 Accent 2" w:uiPriority="64"/>
+    <w:lsdException w:name="Medium List 1 Accent 2" w:uiPriority="65"/>
+    <w:lsdException w:name="Medium List 2 Accent 2" w:uiPriority="66"/>
+    <w:lsdException w:name="Medium Grid 1 Accent 2" w:uiPriority="67"/>
+    <w:lsdException w:name="Medium Grid 2 Accent 2" w:uiPriority="68"/>
+    <w:lsdException w:name="Medium Grid 3 Accent 2" w:uiPriority="69"/>
+    <w:lsdException w:name="Dark List Accent 2" w:uiPriority="70"/>
+    <w:lsdException w:name="Colorful Shading Accent 2" w:uiPriority="71"/>
+    <w:lsdException w:name="Colorful List Accent 2" w:uiPriority="72"/>
+    <w:lsdException w:name="Colorful Grid Accent 2" w:uiPriority="73"/>
+    <w:lsdException w:name="Light Shading Accent 3" w:uiPriority="60"/>
+    <w:lsdException w:name="Light List Accent 3" w:uiPriority="61"/>
+    <w:lsdException w:name="Light Grid Accent 3" w:uiPriority="62"/>
+    <w:lsdException w:name="Medium Shading 1 Accent 3" w:uiPriority="63"/>
+    <w:lsdException w:name="Medium Shading 2 Accent 3" w:uiPriority="64"/>
+    <w:lsdException w:name="Medium List 1 Accent 3" w:uiPriority="65"/>
+    <w:lsdException w:name="Medium List 2 Accent 3" w:uiPriority="66"/>
+    <w:lsdException w:name="Medium Grid 1 Accent 3" w:uiPriority="67"/>
+    <w:lsdException w:name="Medium Grid 2 Accent 3" w:uiPriority="68"/>
+    <w:lsdException w:name="Medium Grid 3 Accent 3" w:uiPriority="69"/>
+    <w:lsdException w:name="Dark List Accent 3" w:uiPriority="70"/>
+    <w:lsdException w:name="Colorful Shading Accent 3" w:uiPriority="71"/>
+    <w:lsdException w:name="Colorful List Accent 3" w:uiPriority="72"/>
+    <w:lsdException w:name="Colorful Grid Accent 3" w:uiPriority="73"/>
+    <w:lsdException w:name="Light Shading Accent 4" w:uiPriority="60"/>
+    <w:lsdException w:name="Light List Accent 4" w:uiPriority="61"/>
+    <w:lsdException w:name="Light Grid Accent 4" w:uiPriority="62"/>
+    <w:lsdException w:name="Medium Shading 1 Accent 4" w:uiPriority="63"/>
+    <w:lsdException w:name="Medium Shading 2 Accent 4" w:uiPriority="64"/>
+    <w:lsdException w:name="Medium List 1 Accent 4" w:uiPriority="65"/>
+    <w:lsdException w:name="Medium List 2 Accent 4" w:uiPriority="66"/>
+    <w:lsdException w:name="Medium Grid 1 Accent 4" w:uiPriority="67"/>
+    <w:lsdException w:name="Medium Grid 2 Accent 4" w:uiPriority="68"/>
+    <w:lsdException w:name="Medium Grid 3 Accent 4" w:uiPriority="69"/>
+    <w:lsdException w:name="Dark List Accent 4" w:uiPriority="70"/>
+    <w:lsdException w:name="Colorful Shading Accent 4" w:uiPriority="71"/>
+    <w:lsdException w:name="Colorful List Accent 4" w:uiPriority="72"/>
+    <w:lsdException w:name="Colorful Grid Accent 4" w:uiPriority="73"/>
+    <w:lsdException w:name="Light Shading Accent 5" w:uiPriority="60"/>
+    <w:lsdException w:name="Light List Accent 5" w:uiPriority="61"/>
+    <w:lsdException w:name="Light Grid Accent 5" w:uiPriority="62"/>
+    <w:lsdException w:name="Medium Shading 1 Accent 5" w:uiPriority="63"/>
+    <w:lsdException w:name="Medium Shading 2 Accent 5" w:uiPriority="64"/>
+    <w:lsdException w:name="Medium List 1 Accent 5" w:uiPriority="65"/>
+    <w:lsdException w:name="Medium List 2 Accent 5" w:uiPriority="66"/>
+    <w:lsdException w:name="Medium Grid 1 Accent 5" w:uiPriority="67"/>
+    <w:lsdException w:name="Medium Grid 2 Accent 5" w:uiPriority="68"/>
+    <w:lsdException w:name="Medium Grid 3 Accent 5" w:uiPriority="69"/>
+    <w:lsdException w:name="Dark List Accent 5" w:uiPriority="70"/>
+    <w:lsdException w:name="Colorful Shading Accent 5" w:uiPriority="71"/>
+    <w:lsdException w:name="Colorful List Accent 5" w:uiPriority="72"/>
+    <w:lsdException w:name="Colorful Grid Accent 5" w:uiPriority="73"/>
+    <w:lsdException w:name="Light Shading Accent 6" w:uiPriority="60"/>
+    <w:lsdException w:name="Light List Accent 6" w:uiPriority="61"/>
+    <w:lsdException w:name="Light Grid Accent 6" w:uiPriority="62"/>
+    <w:lsdException w:name="Medium Shading 1 Accent 6" w:uiPriority="63"/>
+    <w:lsdException w:name="Medium Shading 2 Accent 6" w:uiPriority="64"/>
+    <w:lsdException w:name="Medium List 1 Accent 6" w:uiPriority="65"/>
+    <w:lsdException w:name="Medium List 2 Accent 6" w:uiPriority="66"/>
+    <w:lsdException w:name="Medium Grid 1 Accent 6" w:uiPriority="67"/>
+    <w:lsdException w:name="Medium Grid 2 Accent 6" w:uiPriority="68"/>
+    <w:lsdException w:name="Medium Grid 3 Accent 6" w:uiPriority="69"/>
+    <w:lsdException w:name="Dark List Accent 6" w:uiPriority="70"/>
+    <w:lsdException w:name="Colorful Shading Accent 6" w:uiPriority="71"/>
+    <w:lsdException w:name="Colorful List Accent 6" w:uiPriority="72"/>
+    <w:lsdException w:name="Colorful Grid Accent 6" w:uiPriority="73"/>
+    <w:lsdException w:name="Subtle Emphasis" w:uiPriority="19" w:qFormat="1"/>
+    <w:lsdException w:name="Intense Emphasis" w:uiPriority="21" w:qFormat="1"/>
+    <w:lsdException w:name="Subtle Reference" w:uiPriority="31" w:qFormat="1"/>
+    <w:lsdException w:name="Intense Reference" w:uiPriority="32" w:qFormat="1"/>
+    <w:lsdException w:name="Book Title" w:uiPriority="33" w:qFormat="1"/>
+    <w:lsdException w:name="Bibliography" w:semiHidden="1" w:uiPriority="37" w:unhideWhenUsed="1"/>
+    <w:lsdException w:name="TOC Heading" w:semiHidden="1" w:uiPriority="39" w:unhideWhenUsed="1" w:qFormat="1"/>
+    <w:lsdException w:name="Plain Table 1" w:uiPriority="41"/>
+    <w:lsdException w:name="Plain Table 2" w:uiPriority="42"/>
+    <w:lsdException w:name="Plain Table 3" w:uiPriority="43"/>
+    <w:lsdException w:name="Plain Table 4" w:uiPriority="44"/>
+    <w:lsdException w:name="Plain Table 5" w:uiPriority="45"/>
+    <w:lsdException w:name="Grid Table Light" w:uiPriority="40"/>
+    <w:lsdException w:name="Grid Table 1 Light" w:uiPriority="46"/>
+    <w:lsdException w:name="Grid Table 2" w:uiPriority="47"/>
+    <w:lsdException w:name="Grid Table 3" w:uiPriority="48"/>
+    <w:lsdException w:name="Grid Table 4" w:uiPriority="49"/>
+    <w:lsdException w:name="Grid Table 5 Dark" w:uiPriority="50"/>
+    <w:lsdException w:name="Grid Table 6 Colorful" w:uiPriority="51"/>
+    <w:lsdException w:name="Grid Table 7 Colorful" w:uiPriority="52"/>
+    <w:lsdException w:name="Grid Table 1 Light Accent 1" w:uiPriority="46"/>
+    <w:lsdException w:name="Grid Table 2 Accent 1" w:uiPriority="47"/>
+    <w:lsdException w:name="Grid Table 3 Accent 1" w:uiPriority="48"/>
+    <w:lsdException w:name="Grid Table 4 Accent 1" w:uiPriority="49"/>
+    <w:lsdException w:name="Grid Table 5 Dark Accent 1" w:uiPriority="50"/>
+    <w:lsdException w:name="Grid Table 6 Colorful Accent 1" w:uiPriority="51"/>
+    <w:lsdException w:name="Grid Table 7 Colorful Accent 1" w:uiPriority="52"/>
+    <w:lsdException w:name="Grid Table 1 Light Accent 2" w:uiPriority="46"/>
+    <w:lsdException w:name="Grid Table 2 Accent 2" w:uiPriority="47"/>
+    <w:lsdException w:name="Grid Table 3 Accent 2" w:uiPriority="48"/>
+    <w:lsdException w:name="Grid Table 4 Accent 2" w:uiPriority="49"/>
+    <w:lsdException w:name="Grid Table 5 Dark Accent 2" w:uiPriority="50"/>
+    <w:lsdException w:name="Grid Table 6 Colorful Accent 2" w:uiPriority="51"/>
+    <w:lsdException w:name="Grid Table 7 Colorful Accent 2" w:uiPriority="52"/>
+    <w:lsdException w:name="Grid Table 1 Light Accent 3" w:uiPriority="46"/>
+    <w:lsdException w:name="Grid Table 2 Accent 3" w:uiPriority="47"/>
+    <w:lsdException w:name="Grid Table 3 Accent 3" w:uiPriority="48"/>
+    <w:lsdException w:name="Grid Table 4 Accent 3" w:uiPriority="49"/>
+    <w:lsdException w:name="Grid Table 5 Dark Accent 3" w:uiPriority="50"/>
+    <w:lsdException w:name="Grid Table 6 Colorful Accent 3" w:uiPriority="51"/>
+    <w:lsdException w:name="Grid Table 7 Colorful Accent 3" w:uiPriority="52"/>
+    <w:lsdException w:name="Grid Table 1 Light Accent 4" w:uiPriority="46"/>
+    <w:lsdException w:name="Grid Table 2 Accent 4" w:uiPriority="47"/>
+    <w:lsdException w:name="Grid Table 3 Accent 4" w:uiPriority="48"/>
+    <w:lsdException w:name="Grid Table 4 Accent 4" w:uiPriority="49"/>
+    <w:lsdException w:name="Grid Table 5 Dark Accent 4" w:uiPriority="50"/>
+    <w:lsdException w:name="Grid Table 6 Colorful Accent 4" w:uiPriority="51"/>
+    <w:lsdException w:name="Grid Table 7 Colorful Accent 4" w:uiPriority="52"/>
+    <w:lsdException w:name="Grid Table 1 Light Accent 5" w:uiPriority="46"/>
+    <w:lsdException w:name="Grid Table 2 Accent 5" w:uiPriority="47"/>
+    <w:lsdException w:name="Grid Table 3 Accent 5" w:uiPriority="48"/>
+    <w:lsdException w:name="Grid Table 4 Accent 5" w:uiPriority="49"/>
+    <w:lsdException w:name="Grid Table 5 Dark Accent 5" w:uiPriority="50"/>
+    <w:lsdException w:name="Grid Table 6 Colorful Accent 5" w:uiPriority="51"/>
+    <w:lsdException w:name="Grid Table 7 Colorful Accent 5" w:uiPriority="52"/>
+    <w:lsdException w:name="Grid Table 1 Light Accent 6" w:uiPriority="46"/>
+    <w:lsdException w:name="Grid Table 2 Accent 6" w:uiPriority="47"/>
+    <w:lsdException w:name="Grid Table 3 Accent 6" w:uiPriority="48"/>
+    <w:lsdException w:name="Grid Table 4 Accent 6" w:uiPriority="49"/>
+    <w:lsdException w:name="Grid Table 5 Dark Accent 6" w:uiPriority="50"/>
+    <w:lsdException w:name="Grid Table 6 Colorful Accent 6" w:uiPriority="51"/>
+    <w:lsdException w:name="Grid Table 7 Colorful Accent 6" w:uiPriority="52"/>
+    <w:lsdException w:name="List Table 1 Light" w:uiPriority="46"/>
+    <w:lsdException w:name="List Table 2" w:uiPriority="47"/>
+    <w:lsdException w:name="List Table 3" w:uiPriority="48"/>
+    <w:lsdException w:name="List Table 4" w:uiPriority="49"/>
+    <w:lsdException w:name="List Table 5 Dark" w:uiPriority="50"/>
+    <w:lsdException w:name="List Table 6 Colorful" w:uiPriority="51"/>
+    <w:lsdException w:name="List Table 7 Colorful" w:uiPriority="52"/>
+    <w:lsdException w:name="List Table 1 Light Accent 1" w:uiPriority="46"/>
+    <w:lsdException w:name="List Table 2 Accent 1" w:uiPriority="47"/>
+    <w:lsdException w:name="List Table 3 Accent 1" w:uiPriority="48"/>
+    <w:lsdException w:name="List Table 4 Accent 1" w:uiPriority="49"/>
+    <w:lsdException w:name="List Table 5 Dark Accent 1" w:uiPriority="50"/>
+    <w:lsdException w:name="List Table 6 Colorful Accent 1" w:uiPriority="51"/>
+    <w:lsdException w:name="List Table 7 Colorful Accent 1" w:uiPriority="52"/>
+    <w:lsdException w:name="List Table 1 Light Accent 2" w:uiPriority="46"/>
+    <w:lsdException w:name="List Table 2 Accent 2" w:uiPriority="47"/>
+    <w:lsdException w:name="List Table 3 Accent 2" w:uiPriority="48"/>
+    <w:lsdException w:name="List Table 4 Accent 2" w:uiPriority="49"/>
+    <w:lsdException w:name="List Table 5 Dark Accent 2" w:uiPriority="50"/>
+    <w:lsdException w:name="List Table 6 Colorful Accent 2" w:uiPriority="51"/>
+    <w:lsdException w:name="List Table 7 Colorful Accent 2" w:uiPriority="52"/>
+    <w:lsdException w:name="List Table 1 Light Accent 3" w:uiPriority="46"/>
+    <w:lsdException w:name="List Table 2 Accent 3" w:uiPriority="47"/>
+    <w:lsdException w:name="List Table 3 Accent 3" w:uiPriority="48"/>
+    <w:lsdException w:name="List Table 4 Accent 3" w:uiPriority="49"/>
+    <w:lsdException w:name="List Table 5 Dark Accent 3" w:uiPriority="50"/>
+    <w:lsdException w:name="List Table 6 Colorful Accent 3" w:uiPriority="51"/>
+    <w:lsdException w:name="List Table 7 Colorful Accent 3" w:uiPriority="52"/>
+    <w:lsdException w:name="List Table 1 Light Accent 4" w:uiPriority="46"/>
+    <w:lsdException w:name="List Table 2 Accent 4" w:uiPriority="47"/>
+    <w:lsdException w:name="List Table 3 Accent 4" w:uiPriority="48"/>
+    <w:lsdException w:name="List Table 4 Accent 4" w:uiPriority="49"/>
+    <w:lsdException w:name="List Table 5 Dark Accent 4" w:uiPriority="50"/>
+    <w:lsdException w:name="List Table 6 Colorful Accent 4" w:uiPriority="51"/>
+    <w:lsdException w:name="List Table 7 Colorful Accent 4" w:uiPriority="52"/>
+    <w:lsdException w:name="List Table 1 Light Accent 5" w:uiPriority="46"/>
+    <w:lsdException w:name="List Table 2 Accent 5" w:uiPriority="47"/>
+    <w:lsdException w:name="List Table 3 Accent 5" w:uiPriority="48"/>
+    <w:lsdException w:name="List Table 4 Accent 5" w:uiPriority="49"/>
+    <w:lsdException w:name="List Table 5 Dark Accent 5" w:uiPriority="50"/>
+    <w:lsdException w:name="List Table 6 Colorful Accent 5" w:uiPriority="51"/>
+    <w:lsdException w:name="List Table 7 Colorful Accent 5" w:uiPriority="52"/>
+    <w:lsdException w:name="List Table 1 Light Accent 6" w:uiPriority="46"/>
+    <w:lsdException w:name="List Table 2 Accent 6" w:uiPriority="47"/>
+    <w:lsdException w:name="List Table 3 Accent 6" w:uiPriority="48"/>
+    <w:lsdException w:name="List Table 4 Accent 6" w:uiPriority="49"/>
+    <w:lsdException w:name="List Table 5 Dark Accent 6" w:uiPriority="50"/>
+    <w:lsdException w:name="List Table 6 Colorful Accent 6" w:uiPriority="51"/>
+    <w:lsdException w:name="List Table 7 Colorful Accent 6" w:uiPriority="52"/>
+  </w:latentStyles>
+  <w:style w:type="paragraph" w:default="1" w:styleId="Normal">
+    <w:name w:val="Normal"/>
+    <w:qFormat/>
+  </w:style>
+  <w:style w:type="character" w:default="1" w:styleId="Fuentedeprrafopredeter">
+    <w:name w:val="Default Paragraph Font"/>
+    <w:uiPriority w:val="1"/>
+    <w:semiHidden/>
+    <w:unhideWhenUsed/>
+  </w:style>
+  <w:style w:type="table" w:default="1" w:styleId="Tablanormal">
+    <w:name w:val="Normal Table"/>
+    <w:uiPriority w:val="99"/>
+    <w:semiHidden/>
+    <w:unhideWhenUsed/>
+    <w:tblPr>
+      <w:tblInd w:w="0" w:type="dxa"/>
+      <w:tblCellMar>
+        <w:top w:w="0" w:type="dxa"/>
+        <w:left w:w="108" w:type="dxa"/>
+        <w:bottom w:w="0" w:type="dxa"/>
+        <w:right w:w="108" w:type="dxa"/>
+      </w:tblCellMar>
+    </w:tblPr>
+  </w:style>
+  <w:style w:type="numbering" w:default="1" w:styleId="Sinlista">
+    <w:name w:val="No List"/>
+    <w:uiPriority w:val="99"/>
+    <w:semiHidden/>
+    <w:unhideWhenUsed/>
+  </w:style>
+  <w:style w:type="character" w:styleId="Textodelmarcadordeposicin">
+    <w:name w:val="Placeholder Text"/>
+    <w:basedOn w:val="Fuentedeprrafopredeter"/>
+    <w:uiPriority w:val="99"/>
+    <w:semiHidden/>
+    <w:rsid w:val="00CA3920"/>
+    <w:rPr>
+      <w:color w:val="808080"/>
+    </w:rPr>
+  </w:style>
+</w:styles>
+</file>
+
+<file path=word/glossary/webSettings.xml><?xml version="1.0" encoding="utf-8"?>
+<w:webSettings xmlns:mc="http://schemas.openxmlformats.org/markup-compatibility/2006" xmlns:r="http://schemas.openxmlformats.org/officeDocument/2006/relationships" xmlns:w="http://schemas.openxmlformats.org/wordprocessingml/2006/main" xmlns:w14="http://schemas.microsoft.com/office/word/2010/wordml" xmlns:w15="http://schemas.microsoft.com/office/word/2012/wordml" mc:Ignorable="w14 w15">
+  <w:optimizeForBrowser/>
+  <w:allowPNG/>
+</w:webSettings>
 </file>
 
 <file path=word/theme/theme1.xml><?xml version="1.0" encoding="utf-8"?>
@@ -15767,7 +17495,7 @@
 </file>
 
 <file path=customXml/itemProps1.xml><?xml version="1.0" encoding="utf-8"?>
-<ds:datastoreItem xmlns:ds="http://schemas.openxmlformats.org/officeDocument/2006/customXml" ds:itemID="{A2E647EA-F58F-4CB3-9368-D9809C810ACF}">
+<ds:datastoreItem xmlns:ds="http://schemas.openxmlformats.org/officeDocument/2006/customXml" ds:itemID="{9A3D2CCD-5DF9-4A1F-8AEE-CE7B4842D136}">
   <ds:schemaRefs>
     <ds:schemaRef ds:uri="http://schemas.openxmlformats.org/officeDocument/2006/bibliography"/>
   </ds:schemaRefs>

</xml_diff>